<commit_message>
Updated ERD and Data Dictionaries
</commit_message>
<xml_diff>
--- a/Task1_DesignDocs_AllDesigns_717903_Ram_D.docx
+++ b/Task1_DesignDocs_AllDesigns_717903_Ram_D.docx
@@ -3887,13 +3887,8 @@
                               <w:jc w:val="center"/>
                             </w:pPr>
                             <w:r>
-                              <w:t xml:space="preserve">  </w:t>
+                              <w:t xml:space="preserve">  ef</w:t>
                             </w:r>
-                            <w:proofErr w:type="spellStart"/>
-                            <w:r>
-                              <w:t>ef</w:t>
-                            </w:r>
-                            <w:proofErr w:type="spellEnd"/>
                           </w:p>
                         </w:txbxContent>
                       </wps:txbx>
@@ -3922,13 +3917,8 @@
                         <w:jc w:val="center"/>
                       </w:pPr>
                       <w:r>
-                        <w:t xml:space="preserve">  </w:t>
+                        <w:t xml:space="preserve">  ef</w:t>
                       </w:r>
-                      <w:proofErr w:type="spellStart"/>
-                      <w:r>
-                        <w:t>ef</w:t>
-                      </w:r>
-                      <w:proofErr w:type="spellEnd"/>
                     </w:p>
                   </w:txbxContent>
                 </v:textbox>
@@ -4054,13 +4044,8 @@
                               <w:jc w:val="center"/>
                             </w:pPr>
                             <w:r>
-                              <w:t xml:space="preserve">  </w:t>
+                              <w:t xml:space="preserve">  ef</w:t>
                             </w:r>
-                            <w:proofErr w:type="spellStart"/>
-                            <w:r>
-                              <w:t>ef</w:t>
-                            </w:r>
-                            <w:proofErr w:type="spellEnd"/>
                           </w:p>
                         </w:txbxContent>
                       </wps:txbx>
@@ -4087,13 +4072,8 @@
                         <w:jc w:val="center"/>
                       </w:pPr>
                       <w:r>
-                        <w:t xml:space="preserve">  </w:t>
+                        <w:t xml:space="preserve">  ef</w:t>
                       </w:r>
-                      <w:proofErr w:type="spellStart"/>
-                      <w:r>
-                        <w:t>ef</w:t>
-                      </w:r>
-                      <w:proofErr w:type="spellEnd"/>
                     </w:p>
                   </w:txbxContent>
                 </v:textbox>
@@ -4195,13 +4175,8 @@
                               <w:jc w:val="center"/>
                             </w:pPr>
                             <w:r>
-                              <w:t xml:space="preserve">  </w:t>
+                              <w:t xml:space="preserve">  ef</w:t>
                             </w:r>
-                            <w:proofErr w:type="spellStart"/>
-                            <w:r>
-                              <w:t>ef</w:t>
-                            </w:r>
-                            <w:proofErr w:type="spellEnd"/>
                           </w:p>
                         </w:txbxContent>
                       </wps:txbx>
@@ -4228,13 +4203,8 @@
                         <w:jc w:val="center"/>
                       </w:pPr>
                       <w:r>
-                        <w:t xml:space="preserve">  </w:t>
+                        <w:t xml:space="preserve">  ef</w:t>
                       </w:r>
-                      <w:proofErr w:type="spellStart"/>
-                      <w:r>
-                        <w:t>ef</w:t>
-                      </w:r>
-                      <w:proofErr w:type="spellEnd"/>
                     </w:p>
                   </w:txbxContent>
                 </v:textbox>
@@ -4348,13 +4318,8 @@
                               <w:jc w:val="center"/>
                             </w:pPr>
                             <w:r>
-                              <w:t xml:space="preserve">   </w:t>
+                              <w:t xml:space="preserve">   ef</w:t>
                             </w:r>
-                            <w:proofErr w:type="spellStart"/>
-                            <w:r>
-                              <w:t>ef</w:t>
-                            </w:r>
-                            <w:proofErr w:type="spellEnd"/>
                           </w:p>
                         </w:txbxContent>
                       </wps:txbx>
@@ -4381,13 +4346,8 @@
                         <w:jc w:val="center"/>
                       </w:pPr>
                       <w:r>
-                        <w:t xml:space="preserve">   </w:t>
+                        <w:t xml:space="preserve">   ef</w:t>
                       </w:r>
-                      <w:proofErr w:type="spellStart"/>
-                      <w:r>
-                        <w:t>ef</w:t>
-                      </w:r>
-                      <w:proofErr w:type="spellEnd"/>
                     </w:p>
                   </w:txbxContent>
                 </v:textbox>
@@ -4498,13 +4458,8 @@
                               <w:jc w:val="center"/>
                             </w:pPr>
                             <w:r>
-                              <w:t xml:space="preserve">  </w:t>
+                              <w:t xml:space="preserve">  ef</w:t>
                             </w:r>
-                            <w:proofErr w:type="spellStart"/>
-                            <w:r>
-                              <w:t>ef</w:t>
-                            </w:r>
-                            <w:proofErr w:type="spellEnd"/>
                           </w:p>
                         </w:txbxContent>
                       </wps:txbx>
@@ -4531,13 +4486,8 @@
                         <w:jc w:val="center"/>
                       </w:pPr>
                       <w:r>
-                        <w:t xml:space="preserve">  </w:t>
+                        <w:t xml:space="preserve">  ef</w:t>
                       </w:r>
-                      <w:proofErr w:type="spellStart"/>
-                      <w:r>
-                        <w:t>ef</w:t>
-                      </w:r>
-                      <w:proofErr w:type="spellEnd"/>
                     </w:p>
                   </w:txbxContent>
                 </v:textbox>
@@ -4785,13 +4735,8 @@
                               <w:jc w:val="center"/>
                             </w:pPr>
                             <w:r>
-                              <w:t xml:space="preserve">  </w:t>
+                              <w:t xml:space="preserve">  ef</w:t>
                             </w:r>
-                            <w:proofErr w:type="spellStart"/>
-                            <w:r>
-                              <w:t>ef</w:t>
-                            </w:r>
-                            <w:proofErr w:type="spellEnd"/>
                           </w:p>
                         </w:txbxContent>
                       </wps:txbx>
@@ -4820,13 +4765,8 @@
                         <w:jc w:val="center"/>
                       </w:pPr>
                       <w:r>
-                        <w:t xml:space="preserve">  </w:t>
+                        <w:t xml:space="preserve">  ef</w:t>
                       </w:r>
-                      <w:proofErr w:type="spellStart"/>
-                      <w:r>
-                        <w:t>ef</w:t>
-                      </w:r>
-                      <w:proofErr w:type="spellEnd"/>
                     </w:p>
                   </w:txbxContent>
                 </v:textbox>
@@ -4966,13 +4906,8 @@
                               <w:jc w:val="center"/>
                             </w:pPr>
                             <w:r>
-                              <w:t xml:space="preserve">  </w:t>
+                              <w:t xml:space="preserve">  ef</w:t>
                             </w:r>
-                            <w:proofErr w:type="spellStart"/>
-                            <w:r>
-                              <w:t>ef</w:t>
-                            </w:r>
-                            <w:proofErr w:type="spellEnd"/>
                           </w:p>
                         </w:txbxContent>
                       </wps:txbx>
@@ -4999,13 +4934,8 @@
                         <w:jc w:val="center"/>
                       </w:pPr>
                       <w:r>
-                        <w:t xml:space="preserve">  </w:t>
+                        <w:t xml:space="preserve">  ef</w:t>
                       </w:r>
-                      <w:proofErr w:type="spellStart"/>
-                      <w:r>
-                        <w:t>ef</w:t>
-                      </w:r>
-                      <w:proofErr w:type="spellEnd"/>
                     </w:p>
                   </w:txbxContent>
                 </v:textbox>
@@ -5107,13 +5037,8 @@
                               <w:jc w:val="center"/>
                             </w:pPr>
                             <w:r>
-                              <w:t xml:space="preserve">  </w:t>
+                              <w:t xml:space="preserve">  ef</w:t>
                             </w:r>
-                            <w:proofErr w:type="spellStart"/>
-                            <w:r>
-                              <w:t>ef</w:t>
-                            </w:r>
-                            <w:proofErr w:type="spellEnd"/>
                           </w:p>
                         </w:txbxContent>
                       </wps:txbx>
@@ -5140,13 +5065,8 @@
                         <w:jc w:val="center"/>
                       </w:pPr>
                       <w:r>
-                        <w:t xml:space="preserve">  </w:t>
+                        <w:t xml:space="preserve">  ef</w:t>
                       </w:r>
-                      <w:proofErr w:type="spellStart"/>
-                      <w:r>
-                        <w:t>ef</w:t>
-                      </w:r>
-                      <w:proofErr w:type="spellEnd"/>
                     </w:p>
                   </w:txbxContent>
                 </v:textbox>
@@ -5267,13 +5187,8 @@
                               <w:jc w:val="center"/>
                             </w:pPr>
                             <w:r>
-                              <w:t xml:space="preserve">   </w:t>
+                              <w:t xml:space="preserve">   ef</w:t>
                             </w:r>
-                            <w:proofErr w:type="spellStart"/>
-                            <w:r>
-                              <w:t>ef</w:t>
-                            </w:r>
-                            <w:proofErr w:type="spellEnd"/>
                           </w:p>
                         </w:txbxContent>
                       </wps:txbx>
@@ -5300,13 +5215,8 @@
                         <w:jc w:val="center"/>
                       </w:pPr>
                       <w:r>
-                        <w:t xml:space="preserve">   </w:t>
+                        <w:t xml:space="preserve">   ef</w:t>
                       </w:r>
-                      <w:proofErr w:type="spellStart"/>
-                      <w:r>
-                        <w:t>ef</w:t>
-                      </w:r>
-                      <w:proofErr w:type="spellEnd"/>
                     </w:p>
                   </w:txbxContent>
                 </v:textbox>
@@ -5424,13 +5334,8 @@
                               <w:jc w:val="center"/>
                             </w:pPr>
                             <w:r>
-                              <w:t xml:space="preserve">  </w:t>
+                              <w:t xml:space="preserve">  ef</w:t>
                             </w:r>
-                            <w:proofErr w:type="spellStart"/>
-                            <w:r>
-                              <w:t>ef</w:t>
-                            </w:r>
-                            <w:proofErr w:type="spellEnd"/>
                           </w:p>
                         </w:txbxContent>
                       </wps:txbx>
@@ -5457,13 +5362,8 @@
                         <w:jc w:val="center"/>
                       </w:pPr>
                       <w:r>
-                        <w:t xml:space="preserve">  </w:t>
+                        <w:t xml:space="preserve">  ef</w:t>
                       </w:r>
-                      <w:proofErr w:type="spellStart"/>
-                      <w:r>
-                        <w:t>ef</w:t>
-                      </w:r>
-                      <w:proofErr w:type="spellEnd"/>
                     </w:p>
                   </w:txbxContent>
                 </v:textbox>
@@ -5721,13 +5621,8 @@
                               <w:jc w:val="center"/>
                             </w:pPr>
                             <w:r>
-                              <w:t xml:space="preserve">  </w:t>
+                              <w:t xml:space="preserve">  ef</w:t>
                             </w:r>
-                            <w:proofErr w:type="spellStart"/>
-                            <w:r>
-                              <w:t>ef</w:t>
-                            </w:r>
-                            <w:proofErr w:type="spellEnd"/>
                           </w:p>
                         </w:txbxContent>
                       </wps:txbx>
@@ -5754,13 +5649,8 @@
                         <w:jc w:val="center"/>
                       </w:pPr>
                       <w:r>
-                        <w:t xml:space="preserve">  </w:t>
+                        <w:t xml:space="preserve">  ef</w:t>
                       </w:r>
-                      <w:proofErr w:type="spellStart"/>
-                      <w:r>
-                        <w:t>ef</w:t>
-                      </w:r>
-                      <w:proofErr w:type="spellEnd"/>
                     </w:p>
                   </w:txbxContent>
                 </v:textbox>
@@ -5862,13 +5752,8 @@
                               <w:jc w:val="center"/>
                             </w:pPr>
                             <w:r>
-                              <w:t xml:space="preserve">  </w:t>
+                              <w:t xml:space="preserve">  ef</w:t>
                             </w:r>
-                            <w:proofErr w:type="spellStart"/>
-                            <w:r>
-                              <w:t>ef</w:t>
-                            </w:r>
-                            <w:proofErr w:type="spellEnd"/>
                           </w:p>
                         </w:txbxContent>
                       </wps:txbx>
@@ -5895,13 +5780,8 @@
                         <w:jc w:val="center"/>
                       </w:pPr>
                       <w:r>
-                        <w:t xml:space="preserve">  </w:t>
+                        <w:t xml:space="preserve">  ef</w:t>
                       </w:r>
-                      <w:proofErr w:type="spellStart"/>
-                      <w:r>
-                        <w:t>ef</w:t>
-                      </w:r>
-                      <w:proofErr w:type="spellEnd"/>
                     </w:p>
                   </w:txbxContent>
                 </v:textbox>
@@ -5996,13 +5876,8 @@
                               <w:jc w:val="center"/>
                             </w:pPr>
                             <w:r>
-                              <w:t xml:space="preserve">  </w:t>
+                              <w:t xml:space="preserve">  ef</w:t>
                             </w:r>
-                            <w:proofErr w:type="spellStart"/>
-                            <w:r>
-                              <w:t>ef</w:t>
-                            </w:r>
-                            <w:proofErr w:type="spellEnd"/>
                           </w:p>
                         </w:txbxContent>
                       </wps:txbx>
@@ -6029,13 +5904,8 @@
                         <w:jc w:val="center"/>
                       </w:pPr>
                       <w:r>
-                        <w:t xml:space="preserve">  </w:t>
+                        <w:t xml:space="preserve">  ef</w:t>
                       </w:r>
-                      <w:proofErr w:type="spellStart"/>
-                      <w:r>
-                        <w:t>ef</w:t>
-                      </w:r>
-                      <w:proofErr w:type="spellEnd"/>
                     </w:p>
                   </w:txbxContent>
                 </v:textbox>
@@ -6123,13 +5993,8 @@
                               <w:jc w:val="center"/>
                             </w:pPr>
                             <w:r>
-                              <w:t xml:space="preserve">  </w:t>
+                              <w:t xml:space="preserve">  ef</w:t>
                             </w:r>
-                            <w:proofErr w:type="spellStart"/>
-                            <w:r>
-                              <w:t>ef</w:t>
-                            </w:r>
-                            <w:proofErr w:type="spellEnd"/>
                           </w:p>
                         </w:txbxContent>
                       </wps:txbx>
@@ -6156,13 +6021,8 @@
                         <w:jc w:val="center"/>
                       </w:pPr>
                       <w:r>
-                        <w:t xml:space="preserve">  </w:t>
+                        <w:t xml:space="preserve">  ef</w:t>
                       </w:r>
-                      <w:proofErr w:type="spellStart"/>
-                      <w:r>
-                        <w:t>ef</w:t>
-                      </w:r>
-                      <w:proofErr w:type="spellEnd"/>
                     </w:p>
                   </w:txbxContent>
                 </v:textbox>
@@ -6349,10 +6209,10 @@
           <w:noProof/>
         </w:rPr>
         <w:drawing>
-          <wp:inline distT="0" distB="0" distL="0" distR="0" wp14:anchorId="6E71E13C" wp14:editId="6BD80F6A">
-            <wp:extent cx="5725160" cy="6728460"/>
+          <wp:inline distT="0" distB="0" distL="0" distR="0" wp14:anchorId="3A75544C" wp14:editId="074DCCA0">
+            <wp:extent cx="5725160" cy="7342505"/>
             <wp:effectExtent l="0" t="0" r="8890" b="0"/>
-            <wp:docPr id="607787627" name="Picture 18"/>
+            <wp:docPr id="1957210846" name="Picture 18"/>
             <wp:cNvGraphicFramePr>
               <a:graphicFrameLocks xmlns:a="http://schemas.openxmlformats.org/drawingml/2006/main" noChangeAspect="1"/>
             </wp:cNvGraphicFramePr>
@@ -6381,7 +6241,7 @@
                   <pic:spPr bwMode="auto">
                     <a:xfrm>
                       <a:off x="0" y="0"/>
-                      <a:ext cx="5725160" cy="6728460"/>
+                      <a:ext cx="5725160" cy="7342505"/>
                     </a:xfrm>
                     <a:prstGeom prst="rect">
                       <a:avLst/>
@@ -6404,6 +6264,7 @@
       </w:pPr>
       <w:bookmarkStart w:id="21" w:name="_Toc224235754"/>
       <w:r>
+        <w:lastRenderedPageBreak/>
         <w:t>Data Dictionar</w:t>
       </w:r>
       <w:r>
@@ -6564,7 +6425,6 @@
           </w:tcPr>
           <w:p>
             <w:r>
-              <w:lastRenderedPageBreak/>
               <w:t>Id</w:t>
             </w:r>
           </w:p>
@@ -7669,6 +7529,7 @@
       </w:pPr>
       <w:bookmarkStart w:id="24" w:name="_Toc224235757"/>
       <w:r>
+        <w:lastRenderedPageBreak/>
         <w:t>AspNetRoles</w:t>
       </w:r>
       <w:bookmarkEnd w:id="24"/>
@@ -7870,7 +7731,6 @@
           </w:tcPr>
           <w:p>
             <w:r>
-              <w:lastRenderedPageBreak/>
               <w:t>Name</w:t>
             </w:r>
           </w:p>
@@ -9318,6 +9178,7 @@
           <w:p>
             <w:proofErr w:type="spellStart"/>
             <w:r>
+              <w:lastRenderedPageBreak/>
               <w:t>UserId</w:t>
             </w:r>
             <w:proofErr w:type="spellEnd"/>
@@ -9540,7 +9401,6 @@
       </w:pPr>
       <w:bookmarkStart w:id="29" w:name="_Toc224235762"/>
       <w:r>
-        <w:lastRenderedPageBreak/>
         <w:t>Products</w:t>
       </w:r>
       <w:bookmarkEnd w:id="29"/>
@@ -10209,11 +10069,11 @@
         <w:tblLook w:val="04A0" w:firstRow="1" w:lastRow="0" w:firstColumn="1" w:lastColumn="0" w:noHBand="0" w:noVBand="1"/>
       </w:tblPr>
       <w:tblGrid>
-        <w:gridCol w:w="2287"/>
-        <w:gridCol w:w="1398"/>
+        <w:gridCol w:w="2230"/>
+        <w:gridCol w:w="1368"/>
         <w:gridCol w:w="1207"/>
-        <w:gridCol w:w="1340"/>
-        <w:gridCol w:w="1769"/>
+        <w:gridCol w:w="1467"/>
+        <w:gridCol w:w="1729"/>
         <w:gridCol w:w="1015"/>
       </w:tblGrid>
       <w:tr>
@@ -10712,6 +10572,7 @@
           <w:p>
             <w:proofErr w:type="spellStart"/>
             <w:r>
+              <w:lastRenderedPageBreak/>
               <w:t>DeliveryFee</w:t>
             </w:r>
             <w:proofErr w:type="spellEnd"/>
@@ -10780,7 +10641,6 @@
           <w:p>
             <w:proofErr w:type="spellStart"/>
             <w:r>
-              <w:lastRenderedPageBreak/>
               <w:t>OrderStatus</w:t>
             </w:r>
             <w:proofErr w:type="spellEnd"/>
@@ -10911,7 +10771,10 @@
           <w:p>
             <w:proofErr w:type="spellStart"/>
             <w:r>
-              <w:t>DiscountName</w:t>
+              <w:t>D</w:t>
+            </w:r>
+            <w:r>
+              <w:t>iscountsId</w:t>
             </w:r>
             <w:proofErr w:type="spellEnd"/>
           </w:p>
@@ -10922,7 +10785,7 @@
           </w:tcPr>
           <w:p>
             <w:r>
-              <w:t>String</w:t>
+              <w:t>Int</w:t>
             </w:r>
           </w:p>
         </w:tc>
@@ -10941,9 +10804,11 @@
             <w:tcW w:w="1340" w:type="dxa"/>
           </w:tcPr>
           <w:p>
-            <w:r>
-              <w:t>None</w:t>
-            </w:r>
+            <w:proofErr w:type="spellStart"/>
+            <w:r>
+              <w:t>DiscountsId</w:t>
+            </w:r>
+            <w:proofErr w:type="spellEnd"/>
           </w:p>
         </w:tc>
         <w:tc>
@@ -10958,7 +10823,7 @@
           </w:tcPr>
           <w:p>
             <w:r>
-              <w:t>None</w:t>
+              <w:t>Foreign</w:t>
             </w:r>
           </w:p>
         </w:tc>
@@ -11334,6 +11199,377 @@
               <w:t xml:space="preserve"> and cannot be more than in stock</w:t>
             </w:r>
           </w:p>
+        </w:tc>
+        <w:tc>
+          <w:tcPr>
+            <w:tcW w:w="1015" w:type="dxa"/>
+          </w:tcPr>
+          <w:p>
+            <w:r>
+              <w:t>None</w:t>
+            </w:r>
+          </w:p>
+        </w:tc>
+      </w:tr>
+    </w:tbl>
+    <w:p/>
+    <w:p>
+      <w:pPr>
+        <w:pStyle w:val="Heading3"/>
+      </w:pPr>
+      <w:r>
+        <w:t>Discounts</w:t>
+      </w:r>
+    </w:p>
+    <w:tbl>
+      <w:tblPr>
+        <w:tblStyle w:val="TableGrid"/>
+        <w:tblW w:w="0" w:type="auto"/>
+        <w:tblLook w:val="04A0" w:firstRow="1" w:lastRow="0" w:firstColumn="1" w:lastColumn="0" w:noHBand="0" w:noVBand="1"/>
+      </w:tblPr>
+      <w:tblGrid>
+        <w:gridCol w:w="2317"/>
+        <w:gridCol w:w="1396"/>
+        <w:gridCol w:w="1207"/>
+        <w:gridCol w:w="1764"/>
+        <w:gridCol w:w="1317"/>
+        <w:gridCol w:w="1015"/>
+      </w:tblGrid>
+      <w:tr>
+        <w:tc>
+          <w:tcPr>
+            <w:tcW w:w="2317" w:type="dxa"/>
+          </w:tcPr>
+          <w:p>
+            <w:pPr>
+              <w:rPr>
+                <w:b/>
+                <w:bCs/>
+              </w:rPr>
+            </w:pPr>
+            <w:r>
+              <w:rPr>
+                <w:b/>
+                <w:bCs/>
+              </w:rPr>
+              <w:t>Column</w:t>
+            </w:r>
+          </w:p>
+        </w:tc>
+        <w:tc>
+          <w:tcPr>
+            <w:tcW w:w="1396" w:type="dxa"/>
+          </w:tcPr>
+          <w:p>
+            <w:pPr>
+              <w:rPr>
+                <w:b/>
+                <w:bCs/>
+              </w:rPr>
+            </w:pPr>
+            <w:r>
+              <w:rPr>
+                <w:b/>
+                <w:bCs/>
+              </w:rPr>
+              <w:t>Data Type</w:t>
+            </w:r>
+          </w:p>
+        </w:tc>
+        <w:tc>
+          <w:tcPr>
+            <w:tcW w:w="1207" w:type="dxa"/>
+          </w:tcPr>
+          <w:p>
+            <w:pPr>
+              <w:rPr>
+                <w:b/>
+                <w:bCs/>
+              </w:rPr>
+            </w:pPr>
+            <w:r>
+              <w:rPr>
+                <w:b/>
+                <w:bCs/>
+              </w:rPr>
+              <w:t>Required</w:t>
+            </w:r>
+          </w:p>
+        </w:tc>
+        <w:tc>
+          <w:tcPr>
+            <w:tcW w:w="1764" w:type="dxa"/>
+          </w:tcPr>
+          <w:p>
+            <w:pPr>
+              <w:rPr>
+                <w:b/>
+                <w:bCs/>
+              </w:rPr>
+            </w:pPr>
+            <w:r>
+              <w:rPr>
+                <w:b/>
+                <w:bCs/>
+              </w:rPr>
+              <w:t>Default</w:t>
+            </w:r>
+          </w:p>
+        </w:tc>
+        <w:tc>
+          <w:tcPr>
+            <w:tcW w:w="1317" w:type="dxa"/>
+          </w:tcPr>
+          <w:p>
+            <w:pPr>
+              <w:rPr>
+                <w:b/>
+                <w:bCs/>
+              </w:rPr>
+            </w:pPr>
+            <w:r>
+              <w:rPr>
+                <w:b/>
+                <w:bCs/>
+              </w:rPr>
+              <w:t>Validation</w:t>
+            </w:r>
+          </w:p>
+        </w:tc>
+        <w:tc>
+          <w:tcPr>
+            <w:tcW w:w="1015" w:type="dxa"/>
+          </w:tcPr>
+          <w:p>
+            <w:pPr>
+              <w:rPr>
+                <w:b/>
+                <w:bCs/>
+              </w:rPr>
+            </w:pPr>
+            <w:r>
+              <w:rPr>
+                <w:b/>
+                <w:bCs/>
+              </w:rPr>
+              <w:t>Key Type</w:t>
+            </w:r>
+          </w:p>
+        </w:tc>
+      </w:tr>
+      <w:tr>
+        <w:tc>
+          <w:tcPr>
+            <w:tcW w:w="2317" w:type="dxa"/>
+          </w:tcPr>
+          <w:p>
+            <w:proofErr w:type="spellStart"/>
+            <w:r>
+              <w:t>Discount</w:t>
+            </w:r>
+            <w:r>
+              <w:t>sId</w:t>
+            </w:r>
+            <w:proofErr w:type="spellEnd"/>
+          </w:p>
+        </w:tc>
+        <w:tc>
+          <w:tcPr>
+            <w:tcW w:w="1396" w:type="dxa"/>
+          </w:tcPr>
+          <w:p>
+            <w:r>
+              <w:t>Int</w:t>
+            </w:r>
+          </w:p>
+        </w:tc>
+        <w:tc>
+          <w:tcPr>
+            <w:tcW w:w="1207" w:type="dxa"/>
+          </w:tcPr>
+          <w:p>
+            <w:r>
+              <w:t>Yes</w:t>
+            </w:r>
+          </w:p>
+        </w:tc>
+        <w:tc>
+          <w:tcPr>
+            <w:tcW w:w="1764" w:type="dxa"/>
+          </w:tcPr>
+          <w:p/>
+        </w:tc>
+        <w:tc>
+          <w:tcPr>
+            <w:tcW w:w="1317" w:type="dxa"/>
+          </w:tcPr>
+          <w:p/>
+        </w:tc>
+        <w:tc>
+          <w:tcPr>
+            <w:tcW w:w="1015" w:type="dxa"/>
+          </w:tcPr>
+          <w:p>
+            <w:r>
+              <w:t>Primary</w:t>
+            </w:r>
+          </w:p>
+        </w:tc>
+      </w:tr>
+      <w:tr>
+        <w:tc>
+          <w:tcPr>
+            <w:tcW w:w="2317" w:type="dxa"/>
+          </w:tcPr>
+          <w:p>
+            <w:r>
+              <w:t>Code</w:t>
+            </w:r>
+          </w:p>
+        </w:tc>
+        <w:tc>
+          <w:tcPr>
+            <w:tcW w:w="1396" w:type="dxa"/>
+          </w:tcPr>
+          <w:p>
+            <w:r>
+              <w:t>String</w:t>
+            </w:r>
+          </w:p>
+        </w:tc>
+        <w:tc>
+          <w:tcPr>
+            <w:tcW w:w="1207" w:type="dxa"/>
+          </w:tcPr>
+          <w:p>
+            <w:r>
+              <w:t>Yes</w:t>
+            </w:r>
+          </w:p>
+        </w:tc>
+        <w:tc>
+          <w:tcPr>
+            <w:tcW w:w="1764" w:type="dxa"/>
+          </w:tcPr>
+          <w:p/>
+        </w:tc>
+        <w:tc>
+          <w:tcPr>
+            <w:tcW w:w="1317" w:type="dxa"/>
+          </w:tcPr>
+          <w:p/>
+        </w:tc>
+        <w:tc>
+          <w:tcPr>
+            <w:tcW w:w="1015" w:type="dxa"/>
+          </w:tcPr>
+          <w:p>
+            <w:r>
+              <w:t>None</w:t>
+            </w:r>
+          </w:p>
+        </w:tc>
+      </w:tr>
+      <w:tr>
+        <w:tc>
+          <w:tcPr>
+            <w:tcW w:w="2317" w:type="dxa"/>
+          </w:tcPr>
+          <w:p>
+            <w:proofErr w:type="spellStart"/>
+            <w:r>
+              <w:t>DiscountPercentage</w:t>
+            </w:r>
+            <w:proofErr w:type="spellEnd"/>
+          </w:p>
+        </w:tc>
+        <w:tc>
+          <w:tcPr>
+            <w:tcW w:w="1396" w:type="dxa"/>
+          </w:tcPr>
+          <w:p>
+            <w:r>
+              <w:t>Float</w:t>
+            </w:r>
+          </w:p>
+        </w:tc>
+        <w:tc>
+          <w:tcPr>
+            <w:tcW w:w="1207" w:type="dxa"/>
+          </w:tcPr>
+          <w:p>
+            <w:r>
+              <w:t>Yes</w:t>
+            </w:r>
+          </w:p>
+        </w:tc>
+        <w:tc>
+          <w:tcPr>
+            <w:tcW w:w="1764" w:type="dxa"/>
+          </w:tcPr>
+          <w:p/>
+        </w:tc>
+        <w:tc>
+          <w:tcPr>
+            <w:tcW w:w="1317" w:type="dxa"/>
+          </w:tcPr>
+          <w:p/>
+        </w:tc>
+        <w:tc>
+          <w:tcPr>
+            <w:tcW w:w="1015" w:type="dxa"/>
+          </w:tcPr>
+          <w:p>
+            <w:r>
+              <w:t>None</w:t>
+            </w:r>
+          </w:p>
+        </w:tc>
+      </w:tr>
+      <w:tr>
+        <w:tc>
+          <w:tcPr>
+            <w:tcW w:w="2317" w:type="dxa"/>
+          </w:tcPr>
+          <w:p>
+            <w:proofErr w:type="spellStart"/>
+            <w:r>
+              <w:t>IsActive</w:t>
+            </w:r>
+            <w:proofErr w:type="spellEnd"/>
+          </w:p>
+        </w:tc>
+        <w:tc>
+          <w:tcPr>
+            <w:tcW w:w="1396" w:type="dxa"/>
+          </w:tcPr>
+          <w:p>
+            <w:r>
+              <w:t>Bool</w:t>
+            </w:r>
+          </w:p>
+        </w:tc>
+        <w:tc>
+          <w:tcPr>
+            <w:tcW w:w="1207" w:type="dxa"/>
+          </w:tcPr>
+          <w:p>
+            <w:r>
+              <w:t>Yes</w:t>
+            </w:r>
+          </w:p>
+        </w:tc>
+        <w:tc>
+          <w:tcPr>
+            <w:tcW w:w="1764" w:type="dxa"/>
+          </w:tcPr>
+          <w:p/>
+        </w:tc>
+        <w:tc>
+          <w:tcPr>
+            <w:tcW w:w="1317" w:type="dxa"/>
+          </w:tcPr>
+          <w:p/>
         </w:tc>
         <w:tc>
           <w:tcPr>
@@ -11827,6 +12063,7 @@
           <w:p>
             <w:proofErr w:type="spellStart"/>
             <w:r>
+              <w:lastRenderedPageBreak/>
               <w:t>BasketsId</w:t>
             </w:r>
             <w:proofErr w:type="spellEnd"/>
@@ -12331,7 +12568,6 @@
           <w:p>
             <w:proofErr w:type="spellStart"/>
             <w:r>
-              <w:lastRenderedPageBreak/>
               <w:t>ProducerLastName</w:t>
             </w:r>
             <w:proofErr w:type="spellEnd"/>
@@ -18201,6 +18437,7 @@
   <w:style w:type="character" w:default="1" w:styleId="DefaultParagraphFont">
     <w:name w:val="Default Paragraph Font"/>
     <w:uiPriority w:val="1"/>
+    <w:semiHidden/>
     <w:unhideWhenUsed/>
   </w:style>
   <w:style w:type="table" w:default="1" w:styleId="TableNormal">
@@ -25609,7 +25846,9 @@
     <w:rsid w:val="000E4252"/>
     <w:rsid w:val="001009A0"/>
     <w:rsid w:val="001875C3"/>
+    <w:rsid w:val="00295A26"/>
     <w:rsid w:val="00321CEA"/>
+    <w:rsid w:val="00340707"/>
     <w:rsid w:val="00341154"/>
     <w:rsid w:val="0034583A"/>
     <w:rsid w:val="003821A2"/>
@@ -25631,10 +25870,12 @@
     <w:rsid w:val="00854B99"/>
     <w:rsid w:val="00863085"/>
     <w:rsid w:val="008D10C5"/>
+    <w:rsid w:val="008E45FB"/>
     <w:rsid w:val="00972B3E"/>
     <w:rsid w:val="00B12AB4"/>
     <w:rsid w:val="00B15E40"/>
     <w:rsid w:val="00B7723A"/>
+    <w:rsid w:val="00B8389A"/>
     <w:rsid w:val="00BC228C"/>
     <w:rsid w:val="00C30DFF"/>
     <w:rsid w:val="00C75BAC"/>

</xml_diff>

<commit_message>
Added full delivery address info to models
</commit_message>
<xml_diff>
--- a/Task1_DesignDocs_AllDesigns_717903_Ram_D.docx
+++ b/Task1_DesignDocs_AllDesigns_717903_Ram_D.docx
@@ -6209,10 +6209,10 @@
           <w:noProof/>
         </w:rPr>
         <w:drawing>
-          <wp:inline distT="0" distB="0" distL="0" distR="0" wp14:anchorId="3A75544C" wp14:editId="074DCCA0">
+          <wp:inline distT="0" distB="0" distL="0" distR="0" wp14:anchorId="324DDF2C" wp14:editId="2E6C92D5">
             <wp:extent cx="5725160" cy="7342505"/>
             <wp:effectExtent l="0" t="0" r="8890" b="0"/>
-            <wp:docPr id="1957210846" name="Picture 18"/>
+            <wp:docPr id="1018027410" name="Picture 18"/>
             <wp:cNvGraphicFramePr>
               <a:graphicFrameLocks xmlns:a="http://schemas.openxmlformats.org/drawingml/2006/main" noChangeAspect="1"/>
             </wp:cNvGraphicFramePr>
@@ -10079,7 +10079,7 @@
       <w:tr>
         <w:tc>
           <w:tcPr>
-            <w:tcW w:w="2287" w:type="dxa"/>
+            <w:tcW w:w="2230" w:type="dxa"/>
           </w:tcPr>
           <w:p>
             <w:pPr>
@@ -10099,7 +10099,7 @@
         </w:tc>
         <w:tc>
           <w:tcPr>
-            <w:tcW w:w="1398" w:type="dxa"/>
+            <w:tcW w:w="1368" w:type="dxa"/>
           </w:tcPr>
           <w:p>
             <w:pPr>
@@ -10139,7 +10139,7 @@
         </w:tc>
         <w:tc>
           <w:tcPr>
-            <w:tcW w:w="1340" w:type="dxa"/>
+            <w:tcW w:w="1467" w:type="dxa"/>
           </w:tcPr>
           <w:p>
             <w:pPr>
@@ -10159,7 +10159,7 @@
         </w:tc>
         <w:tc>
           <w:tcPr>
-            <w:tcW w:w="1769" w:type="dxa"/>
+            <w:tcW w:w="1729" w:type="dxa"/>
           </w:tcPr>
           <w:p>
             <w:pPr>
@@ -10201,7 +10201,7 @@
       <w:tr>
         <w:tc>
           <w:tcPr>
-            <w:tcW w:w="2287" w:type="dxa"/>
+            <w:tcW w:w="2230" w:type="dxa"/>
           </w:tcPr>
           <w:p>
             <w:r>
@@ -10211,7 +10211,7 @@
         </w:tc>
         <w:tc>
           <w:tcPr>
-            <w:tcW w:w="1398" w:type="dxa"/>
+            <w:tcW w:w="1368" w:type="dxa"/>
           </w:tcPr>
           <w:p>
             <w:r>
@@ -10231,13 +10231,13 @@
         </w:tc>
         <w:tc>
           <w:tcPr>
-            <w:tcW w:w="1340" w:type="dxa"/>
+            <w:tcW w:w="1467" w:type="dxa"/>
           </w:tcPr>
           <w:p/>
         </w:tc>
         <w:tc>
           <w:tcPr>
-            <w:tcW w:w="1769" w:type="dxa"/>
+            <w:tcW w:w="1729" w:type="dxa"/>
           </w:tcPr>
           <w:p/>
         </w:tc>
@@ -10255,7 +10255,7 @@
       <w:tr>
         <w:tc>
           <w:tcPr>
-            <w:tcW w:w="2287" w:type="dxa"/>
+            <w:tcW w:w="2230" w:type="dxa"/>
           </w:tcPr>
           <w:p>
             <w:proofErr w:type="spellStart"/>
@@ -10267,7 +10267,7 @@
         </w:tc>
         <w:tc>
           <w:tcPr>
-            <w:tcW w:w="1398" w:type="dxa"/>
+            <w:tcW w:w="1368" w:type="dxa"/>
           </w:tcPr>
           <w:p>
             <w:r>
@@ -10287,7 +10287,7 @@
         </w:tc>
         <w:tc>
           <w:tcPr>
-            <w:tcW w:w="1340" w:type="dxa"/>
+            <w:tcW w:w="1467" w:type="dxa"/>
           </w:tcPr>
           <w:p>
             <w:r>
@@ -10297,7 +10297,7 @@
         </w:tc>
         <w:tc>
           <w:tcPr>
-            <w:tcW w:w="1769" w:type="dxa"/>
+            <w:tcW w:w="1729" w:type="dxa"/>
           </w:tcPr>
           <w:p/>
         </w:tc>
@@ -10315,7 +10315,7 @@
       <w:tr>
         <w:tc>
           <w:tcPr>
-            <w:tcW w:w="2287" w:type="dxa"/>
+            <w:tcW w:w="2230" w:type="dxa"/>
           </w:tcPr>
           <w:p>
             <w:proofErr w:type="spellStart"/>
@@ -10327,7 +10327,7 @@
         </w:tc>
         <w:tc>
           <w:tcPr>
-            <w:tcW w:w="1398" w:type="dxa"/>
+            <w:tcW w:w="1368" w:type="dxa"/>
           </w:tcPr>
           <w:p>
             <w:proofErr w:type="spellStart"/>
@@ -10349,7 +10349,7 @@
         </w:tc>
         <w:tc>
           <w:tcPr>
-            <w:tcW w:w="1340" w:type="dxa"/>
+            <w:tcW w:w="1467" w:type="dxa"/>
           </w:tcPr>
           <w:p>
             <w:r>
@@ -10359,7 +10359,7 @@
         </w:tc>
         <w:tc>
           <w:tcPr>
-            <w:tcW w:w="1769" w:type="dxa"/>
+            <w:tcW w:w="1729" w:type="dxa"/>
           </w:tcPr>
           <w:p/>
         </w:tc>
@@ -10377,7 +10377,7 @@
       <w:tr>
         <w:tc>
           <w:tcPr>
-            <w:tcW w:w="2287" w:type="dxa"/>
+            <w:tcW w:w="2230" w:type="dxa"/>
           </w:tcPr>
           <w:p>
             <w:proofErr w:type="spellStart"/>
@@ -10389,7 +10389,7 @@
         </w:tc>
         <w:tc>
           <w:tcPr>
-            <w:tcW w:w="1398" w:type="dxa"/>
+            <w:tcW w:w="1368" w:type="dxa"/>
           </w:tcPr>
           <w:p>
             <w:r>
@@ -10409,13 +10409,13 @@
         </w:tc>
         <w:tc>
           <w:tcPr>
-            <w:tcW w:w="1340" w:type="dxa"/>
+            <w:tcW w:w="1467" w:type="dxa"/>
           </w:tcPr>
           <w:p/>
         </w:tc>
         <w:tc>
           <w:tcPr>
-            <w:tcW w:w="1769" w:type="dxa"/>
+            <w:tcW w:w="1729" w:type="dxa"/>
           </w:tcPr>
           <w:p>
             <w:r>
@@ -10437,7 +10437,7 @@
       <w:tr>
         <w:tc>
           <w:tcPr>
-            <w:tcW w:w="2287" w:type="dxa"/>
+            <w:tcW w:w="2230" w:type="dxa"/>
           </w:tcPr>
           <w:p>
             <w:proofErr w:type="spellStart"/>
@@ -10449,7 +10449,7 @@
         </w:tc>
         <w:tc>
           <w:tcPr>
-            <w:tcW w:w="1398" w:type="dxa"/>
+            <w:tcW w:w="1368" w:type="dxa"/>
           </w:tcPr>
           <w:p>
             <w:proofErr w:type="spellStart"/>
@@ -10471,13 +10471,13 @@
         </w:tc>
         <w:tc>
           <w:tcPr>
-            <w:tcW w:w="1340" w:type="dxa"/>
+            <w:tcW w:w="1467" w:type="dxa"/>
           </w:tcPr>
           <w:p/>
         </w:tc>
         <w:tc>
           <w:tcPr>
-            <w:tcW w:w="1769" w:type="dxa"/>
+            <w:tcW w:w="1729" w:type="dxa"/>
           </w:tcPr>
           <w:p>
             <w:r>
@@ -10499,7 +10499,7 @@
       <w:tr>
         <w:tc>
           <w:tcPr>
-            <w:tcW w:w="2287" w:type="dxa"/>
+            <w:tcW w:w="2230" w:type="dxa"/>
           </w:tcPr>
           <w:p>
             <w:proofErr w:type="spellStart"/>
@@ -10511,7 +10511,7 @@
         </w:tc>
         <w:tc>
           <w:tcPr>
-            <w:tcW w:w="1398" w:type="dxa"/>
+            <w:tcW w:w="1368" w:type="dxa"/>
           </w:tcPr>
           <w:p>
             <w:r>
@@ -10531,13 +10531,13 @@
         </w:tc>
         <w:tc>
           <w:tcPr>
-            <w:tcW w:w="1340" w:type="dxa"/>
+            <w:tcW w:w="1467" w:type="dxa"/>
           </w:tcPr>
           <w:p/>
         </w:tc>
         <w:tc>
           <w:tcPr>
-            <w:tcW w:w="1769" w:type="dxa"/>
+            <w:tcW w:w="1729" w:type="dxa"/>
           </w:tcPr>
           <w:p>
             <w:r>
@@ -10551,6 +10551,21 @@
             <w:r>
               <w:t>” is “Delivery”</w:t>
             </w:r>
+            <w:r>
+              <w:t>.</w:t>
+            </w:r>
+          </w:p>
+          <w:p>
+            <w:r>
+              <w:lastRenderedPageBreak/>
+              <w:t xml:space="preserve">Can only be a valid </w:t>
+            </w:r>
+            <w:r>
+              <w:t>address</w:t>
+            </w:r>
+            <w:r>
+              <w:t>.</w:t>
+            </w:r>
           </w:p>
         </w:tc>
         <w:tc>
@@ -10559,6 +10574,7 @@
           </w:tcPr>
           <w:p>
             <w:r>
+              <w:lastRenderedPageBreak/>
               <w:t>None</w:t>
             </w:r>
           </w:p>
@@ -10567,24 +10583,26 @@
       <w:tr>
         <w:tc>
           <w:tcPr>
-            <w:tcW w:w="2287" w:type="dxa"/>
+            <w:tcW w:w="2230" w:type="dxa"/>
           </w:tcPr>
           <w:p>
             <w:proofErr w:type="spellStart"/>
             <w:r>
-              <w:lastRenderedPageBreak/>
-              <w:t>DeliveryFee</w:t>
+              <w:t>Delivery</w:t>
+            </w:r>
+            <w:r>
+              <w:t>City</w:t>
             </w:r>
             <w:proofErr w:type="spellEnd"/>
           </w:p>
         </w:tc>
         <w:tc>
           <w:tcPr>
-            <w:tcW w:w="1398" w:type="dxa"/>
-          </w:tcPr>
-          <w:p>
-            <w:r>
-              <w:t>Float</w:t>
+            <w:tcW w:w="1368" w:type="dxa"/>
+          </w:tcPr>
+          <w:p>
+            <w:r>
+              <w:t>String</w:t>
             </w:r>
           </w:p>
         </w:tc>
@@ -10600,13 +10618,13 @@
         </w:tc>
         <w:tc>
           <w:tcPr>
-            <w:tcW w:w="1340" w:type="dxa"/>
+            <w:tcW w:w="1467" w:type="dxa"/>
           </w:tcPr>
           <w:p/>
         </w:tc>
         <w:tc>
           <w:tcPr>
-            <w:tcW w:w="1769" w:type="dxa"/>
+            <w:tcW w:w="1729" w:type="dxa"/>
           </w:tcPr>
           <w:p>
             <w:r>
@@ -10619,6 +10637,20 @@
             <w:proofErr w:type="spellEnd"/>
             <w:r>
               <w:t>” is “Delivery”</w:t>
+            </w:r>
+            <w:r>
+              <w:t>.</w:t>
+            </w:r>
+          </w:p>
+          <w:p>
+            <w:r>
+              <w:t xml:space="preserve">Can only be a valid </w:t>
+            </w:r>
+            <w:r>
+              <w:t>city</w:t>
+            </w:r>
+            <w:r>
+              <w:t>.</w:t>
             </w:r>
           </w:p>
         </w:tc>
@@ -10636,19 +10668,22 @@
       <w:tr>
         <w:tc>
           <w:tcPr>
-            <w:tcW w:w="2287" w:type="dxa"/>
+            <w:tcW w:w="2230" w:type="dxa"/>
           </w:tcPr>
           <w:p>
             <w:proofErr w:type="spellStart"/>
             <w:r>
-              <w:t>OrderStatus</w:t>
+              <w:t>Delivery</w:t>
+            </w:r>
+            <w:r>
+              <w:t>Postcode</w:t>
             </w:r>
             <w:proofErr w:type="spellEnd"/>
           </w:p>
         </w:tc>
         <w:tc>
           <w:tcPr>
-            <w:tcW w:w="1398" w:type="dxa"/>
+            <w:tcW w:w="1368" w:type="dxa"/>
           </w:tcPr>
           <w:p>
             <w:r>
@@ -10668,27 +10703,28 @@
         </w:tc>
         <w:tc>
           <w:tcPr>
-            <w:tcW w:w="1340" w:type="dxa"/>
-          </w:tcPr>
-          <w:p>
-            <w:r>
-              <w:t>Pending</w:t>
-            </w:r>
-          </w:p>
-        </w:tc>
-        <w:tc>
-          <w:tcPr>
-            <w:tcW w:w="1769" w:type="dxa"/>
-          </w:tcPr>
-          <w:p>
-            <w:r>
-              <w:t xml:space="preserve">Can only be a set order </w:t>
-            </w:r>
-            <w:r>
-              <w:t xml:space="preserve">status </w:t>
-            </w:r>
-            <w:r>
-              <w:t>option</w:t>
+            <w:tcW w:w="1467" w:type="dxa"/>
+          </w:tcPr>
+          <w:p/>
+        </w:tc>
+        <w:tc>
+          <w:tcPr>
+            <w:tcW w:w="1729" w:type="dxa"/>
+          </w:tcPr>
+          <w:p>
+            <w:r>
+              <w:t>Only available to use if “</w:t>
+            </w:r>
+            <w:proofErr w:type="spellStart"/>
+            <w:r>
+              <w:t>OrderType</w:t>
+            </w:r>
+            <w:proofErr w:type="spellEnd"/>
+            <w:r>
+              <w:t>” is “Delivery”</w:t>
+            </w:r>
+            <w:r>
+              <w:t>. Can only be a valid postcode.</w:t>
             </w:r>
           </w:p>
         </w:tc>
@@ -10706,23 +10742,23 @@
       <w:tr>
         <w:tc>
           <w:tcPr>
-            <w:tcW w:w="2287" w:type="dxa"/>
+            <w:tcW w:w="2230" w:type="dxa"/>
           </w:tcPr>
           <w:p>
             <w:proofErr w:type="spellStart"/>
             <w:r>
-              <w:t>UsedDiscount</w:t>
+              <w:t>DeliveryFee</w:t>
             </w:r>
             <w:proofErr w:type="spellEnd"/>
           </w:p>
         </w:tc>
         <w:tc>
           <w:tcPr>
-            <w:tcW w:w="1398" w:type="dxa"/>
-          </w:tcPr>
-          <w:p>
-            <w:r>
-              <w:t>Bool</w:t>
+            <w:tcW w:w="1368" w:type="dxa"/>
+          </w:tcPr>
+          <w:p>
+            <w:r>
+              <w:t>Float</w:t>
             </w:r>
           </w:p>
         </w:tc>
@@ -10732,25 +10768,33 @@
           </w:tcPr>
           <w:p>
             <w:r>
-              <w:t>Yes</w:t>
-            </w:r>
-          </w:p>
-        </w:tc>
-        <w:tc>
-          <w:tcPr>
-            <w:tcW w:w="1340" w:type="dxa"/>
-          </w:tcPr>
-          <w:p>
-            <w:r>
-              <w:t>False</w:t>
-            </w:r>
-          </w:p>
-        </w:tc>
-        <w:tc>
-          <w:tcPr>
-            <w:tcW w:w="1769" w:type="dxa"/>
+              <w:t>No</w:t>
+            </w:r>
+          </w:p>
+        </w:tc>
+        <w:tc>
+          <w:tcPr>
+            <w:tcW w:w="1467" w:type="dxa"/>
           </w:tcPr>
           <w:p/>
+        </w:tc>
+        <w:tc>
+          <w:tcPr>
+            <w:tcW w:w="1729" w:type="dxa"/>
+          </w:tcPr>
+          <w:p>
+            <w:r>
+              <w:t>Only available to use if “</w:t>
+            </w:r>
+            <w:proofErr w:type="spellStart"/>
+            <w:r>
+              <w:t>OrderType</w:t>
+            </w:r>
+            <w:proofErr w:type="spellEnd"/>
+            <w:r>
+              <w:t>” is “Delivery”</w:t>
+            </w:r>
+          </w:p>
         </w:tc>
         <w:tc>
           <w:tcPr>
@@ -10766,11 +10810,141 @@
       <w:tr>
         <w:tc>
           <w:tcPr>
-            <w:tcW w:w="2287" w:type="dxa"/>
+            <w:tcW w:w="2230" w:type="dxa"/>
           </w:tcPr>
           <w:p>
             <w:proofErr w:type="spellStart"/>
             <w:r>
+              <w:t>OrderStatus</w:t>
+            </w:r>
+            <w:proofErr w:type="spellEnd"/>
+          </w:p>
+        </w:tc>
+        <w:tc>
+          <w:tcPr>
+            <w:tcW w:w="1368" w:type="dxa"/>
+          </w:tcPr>
+          <w:p>
+            <w:r>
+              <w:t>String</w:t>
+            </w:r>
+          </w:p>
+        </w:tc>
+        <w:tc>
+          <w:tcPr>
+            <w:tcW w:w="1207" w:type="dxa"/>
+          </w:tcPr>
+          <w:p>
+            <w:r>
+              <w:t>No</w:t>
+            </w:r>
+          </w:p>
+        </w:tc>
+        <w:tc>
+          <w:tcPr>
+            <w:tcW w:w="1467" w:type="dxa"/>
+          </w:tcPr>
+          <w:p>
+            <w:r>
+              <w:t>Pending</w:t>
+            </w:r>
+          </w:p>
+        </w:tc>
+        <w:tc>
+          <w:tcPr>
+            <w:tcW w:w="1729" w:type="dxa"/>
+          </w:tcPr>
+          <w:p>
+            <w:r>
+              <w:t xml:space="preserve">Can only be a set order </w:t>
+            </w:r>
+            <w:r>
+              <w:t xml:space="preserve">status </w:t>
+            </w:r>
+            <w:r>
+              <w:t>option</w:t>
+            </w:r>
+          </w:p>
+        </w:tc>
+        <w:tc>
+          <w:tcPr>
+            <w:tcW w:w="1015" w:type="dxa"/>
+          </w:tcPr>
+          <w:p>
+            <w:r>
+              <w:t>None</w:t>
+            </w:r>
+          </w:p>
+        </w:tc>
+      </w:tr>
+      <w:tr>
+        <w:tc>
+          <w:tcPr>
+            <w:tcW w:w="2230" w:type="dxa"/>
+          </w:tcPr>
+          <w:p>
+            <w:proofErr w:type="spellStart"/>
+            <w:r>
+              <w:t>UsedDiscount</w:t>
+            </w:r>
+            <w:proofErr w:type="spellEnd"/>
+          </w:p>
+        </w:tc>
+        <w:tc>
+          <w:tcPr>
+            <w:tcW w:w="1368" w:type="dxa"/>
+          </w:tcPr>
+          <w:p>
+            <w:r>
+              <w:t>Bool</w:t>
+            </w:r>
+          </w:p>
+        </w:tc>
+        <w:tc>
+          <w:tcPr>
+            <w:tcW w:w="1207" w:type="dxa"/>
+          </w:tcPr>
+          <w:p>
+            <w:r>
+              <w:t>Yes</w:t>
+            </w:r>
+          </w:p>
+        </w:tc>
+        <w:tc>
+          <w:tcPr>
+            <w:tcW w:w="1467" w:type="dxa"/>
+          </w:tcPr>
+          <w:p>
+            <w:r>
+              <w:t>False</w:t>
+            </w:r>
+          </w:p>
+        </w:tc>
+        <w:tc>
+          <w:tcPr>
+            <w:tcW w:w="1729" w:type="dxa"/>
+          </w:tcPr>
+          <w:p/>
+        </w:tc>
+        <w:tc>
+          <w:tcPr>
+            <w:tcW w:w="1015" w:type="dxa"/>
+          </w:tcPr>
+          <w:p>
+            <w:r>
+              <w:t>None</w:t>
+            </w:r>
+          </w:p>
+        </w:tc>
+      </w:tr>
+      <w:tr>
+        <w:tc>
+          <w:tcPr>
+            <w:tcW w:w="2230" w:type="dxa"/>
+          </w:tcPr>
+          <w:p>
+            <w:proofErr w:type="spellStart"/>
+            <w:r>
               <w:t>D</w:t>
             </w:r>
             <w:r>
@@ -10781,7 +10955,7 @@
         </w:tc>
         <w:tc>
           <w:tcPr>
-            <w:tcW w:w="1398" w:type="dxa"/>
+            <w:tcW w:w="1368" w:type="dxa"/>
           </w:tcPr>
           <w:p>
             <w:r>
@@ -10801,7 +10975,7 @@
         </w:tc>
         <w:tc>
           <w:tcPr>
-            <w:tcW w:w="1340" w:type="dxa"/>
+            <w:tcW w:w="1467" w:type="dxa"/>
           </w:tcPr>
           <w:p>
             <w:proofErr w:type="spellStart"/>
@@ -10813,7 +10987,7 @@
         </w:tc>
         <w:tc>
           <w:tcPr>
-            <w:tcW w:w="1769" w:type="dxa"/>
+            <w:tcW w:w="1729" w:type="dxa"/>
           </w:tcPr>
           <w:p/>
         </w:tc>
@@ -11365,10 +11539,7 @@
           <w:p>
             <w:proofErr w:type="spellStart"/>
             <w:r>
-              <w:t>Discount</w:t>
-            </w:r>
-            <w:r>
-              <w:t>sId</w:t>
+              <w:t>DiscountsId</w:t>
             </w:r>
             <w:proofErr w:type="spellEnd"/>
           </w:p>
@@ -11534,6 +11705,7 @@
           <w:p>
             <w:proofErr w:type="spellStart"/>
             <w:r>
+              <w:lastRenderedPageBreak/>
               <w:t>IsActive</w:t>
             </w:r>
             <w:proofErr w:type="spellEnd"/>
@@ -12063,7 +12235,6 @@
           <w:p>
             <w:proofErr w:type="spellStart"/>
             <w:r>
-              <w:lastRenderedPageBreak/>
               <w:t>BasketsId</w:t>
             </w:r>
             <w:proofErr w:type="spellEnd"/>
@@ -25861,7 +26032,9 @@
     <w:rsid w:val="005A739F"/>
     <w:rsid w:val="005B3EC5"/>
     <w:rsid w:val="005D45CD"/>
+    <w:rsid w:val="005D4E69"/>
     <w:rsid w:val="00604AD3"/>
+    <w:rsid w:val="006160F0"/>
     <w:rsid w:val="0067407C"/>
     <w:rsid w:val="007307AA"/>
     <w:rsid w:val="00754287"/>
@@ -26676,6 +26849,18 @@
 </file>
 
 <file path=customXml/item1.xml><?xml version="1.0" encoding="utf-8"?>
+<b:Sources xmlns:b="http://schemas.openxmlformats.org/officeDocument/2006/bibliography" xmlns="http://schemas.openxmlformats.org/officeDocument/2006/bibliography" SelectedStyle="\APASixthEditionOfficeOnline.xsl" StyleName="APA" Version="6"/>
+</file>
+
+<file path=customXml/item2.xml><?xml version="1.0" encoding="utf-8"?>
+<p:properties xmlns:p="http://schemas.microsoft.com/office/2006/metadata/properties" xmlns:xsi="http://www.w3.org/2001/XMLSchema-instance" xmlns:pc="http://schemas.microsoft.com/office/infopath/2007/PartnerControls">
+  <documentManagement>
+    <_activity xmlns="0858e797-1849-4dd5-9d5a-25e6beea22bc" xsi:nil="true"/>
+  </documentManagement>
+</p:properties>
+</file>
+
+<file path=customXml/item3.xml><?xml version="1.0" encoding="utf-8"?>
 <ct:contentTypeSchema xmlns:ct="http://schemas.microsoft.com/office/2006/metadata/contentType" xmlns:ma="http://schemas.microsoft.com/office/2006/metadata/properties/metaAttributes" ct:_="" ma:_="" ma:contentTypeName="Document" ma:contentTypeID="0x01010056C2B2184EA01F42B9D0C6F832942DBC" ma:contentTypeVersion="11" ma:contentTypeDescription="Create a new document." ma:contentTypeScope="" ma:versionID="55e0c6c1c4500967667bb16e4c70d9ff">
   <xsd:schema xmlns:xsd="http://www.w3.org/2001/XMLSchema" xmlns:xs="http://www.w3.org/2001/XMLSchema" xmlns:p="http://schemas.microsoft.com/office/2006/metadata/properties" xmlns:ns3="0858e797-1849-4dd5-9d5a-25e6beea22bc" targetNamespace="http://schemas.microsoft.com/office/2006/metadata/properties" ma:root="true" ma:fieldsID="db27273709eb546562b89a5719f57ae0" ns3:_="">
     <xsd:import namespace="0858e797-1849-4dd5-9d5a-25e6beea22bc"/>
@@ -26861,18 +27046,6 @@
 </ct:contentTypeSchema>
 </file>
 
-<file path=customXml/item2.xml><?xml version="1.0" encoding="utf-8"?>
-<p:properties xmlns:p="http://schemas.microsoft.com/office/2006/metadata/properties" xmlns:xsi="http://www.w3.org/2001/XMLSchema-instance" xmlns:pc="http://schemas.microsoft.com/office/infopath/2007/PartnerControls">
-  <documentManagement>
-    <_activity xmlns="0858e797-1849-4dd5-9d5a-25e6beea22bc" xsi:nil="true"/>
-  </documentManagement>
-</p:properties>
-</file>
-
-<file path=customXml/item3.xml><?xml version="1.0" encoding="utf-8"?>
-<b:Sources xmlns:b="http://schemas.openxmlformats.org/officeDocument/2006/bibliography" xmlns="http://schemas.openxmlformats.org/officeDocument/2006/bibliography" SelectedStyle="\APASixthEditionOfficeOnline.xsl" StyleName="APA" Version="6"/>
-</file>
-
 <file path=customXml/item4.xml><?xml version="1.0" encoding="utf-8"?>
 <?mso-contentType ?>
 <FormTemplates xmlns="http://schemas.microsoft.com/sharepoint/v3/contenttype/forms">
@@ -26883,6 +27056,24 @@
 </file>
 
 <file path=customXml/itemProps1.xml><?xml version="1.0" encoding="utf-8"?>
+<ds:datastoreItem xmlns:ds="http://schemas.openxmlformats.org/officeDocument/2006/customXml" ds:itemID="{C564E797-4C87-4565-A286-3540A1F927B3}">
+  <ds:schemaRefs>
+    <ds:schemaRef ds:uri="http://schemas.openxmlformats.org/officeDocument/2006/bibliography"/>
+  </ds:schemaRefs>
+</ds:datastoreItem>
+</file>
+
+<file path=customXml/itemProps2.xml><?xml version="1.0" encoding="utf-8"?>
+<ds:datastoreItem xmlns:ds="http://schemas.openxmlformats.org/officeDocument/2006/customXml" ds:itemID="{DD3E77BA-0A5F-412F-AD0C-65D1A89B375C}">
+  <ds:schemaRefs>
+    <ds:schemaRef ds:uri="http://schemas.microsoft.com/office/2006/metadata/properties"/>
+    <ds:schemaRef ds:uri="http://schemas.microsoft.com/office/infopath/2007/PartnerControls"/>
+    <ds:schemaRef ds:uri="0858e797-1849-4dd5-9d5a-25e6beea22bc"/>
+  </ds:schemaRefs>
+</ds:datastoreItem>
+</file>
+
+<file path=customXml/itemProps3.xml><?xml version="1.0" encoding="utf-8"?>
 <ds:datastoreItem xmlns:ds="http://schemas.openxmlformats.org/officeDocument/2006/customXml" ds:itemID="{9FA6C0A6-5F7F-48C7-A810-283E2A6F84D1}">
   <ds:schemaRefs>
     <ds:schemaRef ds:uri="http://schemas.microsoft.com/office/2006/metadata/contentType"/>
@@ -26900,24 +27091,6 @@
 </ds:datastoreItem>
 </file>
 
-<file path=customXml/itemProps2.xml><?xml version="1.0" encoding="utf-8"?>
-<ds:datastoreItem xmlns:ds="http://schemas.openxmlformats.org/officeDocument/2006/customXml" ds:itemID="{DD3E77BA-0A5F-412F-AD0C-65D1A89B375C}">
-  <ds:schemaRefs>
-    <ds:schemaRef ds:uri="http://schemas.microsoft.com/office/2006/metadata/properties"/>
-    <ds:schemaRef ds:uri="http://schemas.microsoft.com/office/infopath/2007/PartnerControls"/>
-    <ds:schemaRef ds:uri="0858e797-1849-4dd5-9d5a-25e6beea22bc"/>
-  </ds:schemaRefs>
-</ds:datastoreItem>
-</file>
-
-<file path=customXml/itemProps3.xml><?xml version="1.0" encoding="utf-8"?>
-<ds:datastoreItem xmlns:ds="http://schemas.openxmlformats.org/officeDocument/2006/customXml" ds:itemID="{C564E797-4C87-4565-A286-3540A1F927B3}">
-  <ds:schemaRefs>
-    <ds:schemaRef ds:uri="http://schemas.openxmlformats.org/officeDocument/2006/bibliography"/>
-  </ds:schemaRefs>
-</ds:datastoreItem>
-</file>
-
 <file path=customXml/itemProps4.xml><?xml version="1.0" encoding="utf-8"?>
 <ds:datastoreItem xmlns:ds="http://schemas.openxmlformats.org/officeDocument/2006/customXml" ds:itemID="{A9623E5C-50AC-4F4B-AA64-E3F8AA2679C6}">
   <ds:schemaRefs>

</xml_diff>

<commit_message>
Added additional test strategies
Fixed context mistakes
</commit_message>
<xml_diff>
--- a/Task1_DesignDocs_AllDesigns_717903_Ram_D.docx
+++ b/Task1_DesignDocs_AllDesigns_717903_Ram_D.docx
@@ -1,6 +1,6 @@
 
 <file path=word/document.xml><?xml version="1.0" encoding="utf-8"?>
-<w:document xmlns:wpc="http://schemas.microsoft.com/office/word/2010/wordprocessingCanvas" xmlns:cx="http://schemas.microsoft.com/office/drawing/2014/chartex" xmlns:cx1="http://schemas.microsoft.com/office/drawing/2015/9/8/chartex" xmlns:cx2="http://schemas.microsoft.com/office/drawing/2015/10/21/chartex" xmlns:cx3="http://schemas.microsoft.com/office/drawing/2016/5/9/chartex" xmlns:cx4="http://schemas.microsoft.com/office/drawing/2016/5/10/chartex" xmlns:cx5="http://schemas.microsoft.com/office/drawing/2016/5/11/chartex" xmlns:cx6="http://schemas.microsoft.com/office/drawing/2016/5/12/chartex" xmlns:cx7="http://schemas.microsoft.com/office/drawing/2016/5/13/chartex" xmlns:cx8="http://schemas.microsoft.com/office/drawing/2016/5/14/chartex" xmlns:mc="http://schemas.openxmlformats.org/markup-compatibility/2006" xmlns:aink="http://schemas.microsoft.com/office/drawing/2016/ink" xmlns:am3d="http://schemas.microsoft.com/office/drawing/2017/model3d" xmlns:o="urn:schemas-microsoft-com:office:office" xmlns:oel="http://schemas.microsoft.com/office/2019/extlst" xmlns:r="http://schemas.openxmlformats.org/officeDocument/2006/relationships" xmlns:m="http://schemas.openxmlformats.org/officeDocument/2006/math" xmlns:v="urn:schemas-microsoft-com:vml" xmlns:wp14="http://schemas.microsoft.com/office/word/2010/wordprocessingDrawing" xmlns:wp="http://schemas.openxmlformats.org/drawingml/2006/wordprocessingDrawing" xmlns:w10="urn:schemas-microsoft-com:office:word" xmlns:w="http://schemas.openxmlformats.org/wordprocessingml/2006/main" xmlns:w14="http://schemas.microsoft.com/office/word/2010/wordml" xmlns:w15="http://schemas.microsoft.com/office/word/2012/wordml" xmlns:w16cex="http://schemas.microsoft.com/office/word/2018/wordml/cex" xmlns:w16cid="http://schemas.microsoft.com/office/word/2016/wordml/cid" xmlns:w16="http://schemas.microsoft.com/office/word/2018/wordml" xmlns:w16du="http://schemas.microsoft.com/office/word/2023/wordml/word16du" xmlns:w16sdtdh="http://schemas.microsoft.com/office/word/2020/wordml/sdtdatahash" xmlns:w16sdtfl="http://schemas.microsoft.com/office/word/2024/wordml/sdtformatlock" xmlns:w16se="http://schemas.microsoft.com/office/word/2015/wordml/symex" xmlns:wpg="http://schemas.microsoft.com/office/word/2010/wordprocessingGroup" xmlns:wpi="http://schemas.microsoft.com/office/word/2010/wordprocessingInk" xmlns:wne="http://schemas.microsoft.com/office/word/2006/wordml" xmlns:wps="http://schemas.microsoft.com/office/word/2010/wordprocessingShape" mc:Ignorable="w14 w15 w16se w16cid w16 w16cex w16sdtdh w16sdtfl w16du wp14">
+<w:document xmlns:wpc="http://schemas.microsoft.com/office/word/2010/wordprocessingCanvas" xmlns:cx="http://schemas.microsoft.com/office/drawing/2014/chartex" xmlns:cx1="http://schemas.microsoft.com/office/drawing/2015/9/8/chartex" xmlns:cx2="http://schemas.microsoft.com/office/drawing/2015/10/21/chartex" xmlns:cx3="http://schemas.microsoft.com/office/drawing/2016/5/9/chartex" xmlns:cx4="http://schemas.microsoft.com/office/drawing/2016/5/10/chartex" xmlns:cx5="http://schemas.microsoft.com/office/drawing/2016/5/11/chartex" xmlns:cx6="http://schemas.microsoft.com/office/drawing/2016/5/12/chartex" xmlns:cx7="http://schemas.microsoft.com/office/drawing/2016/5/13/chartex" xmlns:cx8="http://schemas.microsoft.com/office/drawing/2016/5/14/chartex" xmlns:mc="http://schemas.openxmlformats.org/markup-compatibility/2006" xmlns:aink="http://schemas.microsoft.com/office/drawing/2016/ink" xmlns:am3d="http://schemas.microsoft.com/office/drawing/2017/model3d" xmlns:o="urn:schemas-microsoft-com:office:office" xmlns:r="http://schemas.openxmlformats.org/officeDocument/2006/relationships" xmlns:m="http://schemas.openxmlformats.org/officeDocument/2006/math" xmlns:v="urn:schemas-microsoft-com:vml" xmlns:wp14="http://schemas.microsoft.com/office/word/2010/wordprocessingDrawing" xmlns:wp="http://schemas.openxmlformats.org/drawingml/2006/wordprocessingDrawing" xmlns:w10="urn:schemas-microsoft-com:office:word" xmlns:w="http://schemas.openxmlformats.org/wordprocessingml/2006/main" xmlns:w14="http://schemas.microsoft.com/office/word/2010/wordml" xmlns:w15="http://schemas.microsoft.com/office/word/2012/wordml" xmlns:w16cex="http://schemas.microsoft.com/office/word/2018/wordml/cex" xmlns:w16cid="http://schemas.microsoft.com/office/word/2016/wordml/cid" xmlns:w16="http://schemas.microsoft.com/office/word/2018/wordml" xmlns:w16sdtdh="http://schemas.microsoft.com/office/word/2020/wordml/sdtdatahash" xmlns:w16se="http://schemas.microsoft.com/office/word/2015/wordml/symex" xmlns:wpg="http://schemas.microsoft.com/office/word/2010/wordprocessingGroup" xmlns:wpi="http://schemas.microsoft.com/office/word/2010/wordprocessingInk" xmlns:wne="http://schemas.microsoft.com/office/word/2006/wordml" xmlns:wps="http://schemas.microsoft.com/office/word/2010/wordprocessingShape" mc:Ignorable="w14 w15 w16se w16cid w16 w16cex w16sdtdh wp14">
   <w:body>
     <w:p>
       <w:pPr>
@@ -183,6 +183,7 @@
             <w:dataBinding w:prefixMappings="xmlns:ns0='http://purl.org/dc/elements/1.1/' xmlns:ns1='http://schemas.openxmlformats.org/package/2006/metadata/core-properties' " w:xpath="/ns1:coreProperties[1]/ns0:subject[1]" w:storeItemID="{6C3C8BC8-F283-45AE-878A-BAB7291924A1}"/>
             <w:text/>
           </w:sdtPr>
+          <w:sdtEndPr/>
           <w:sdtContent>
             <w:p>
               <w:pPr>
@@ -315,7 +316,7 @@
                   </wp:anchor>
                 </w:drawing>
               </mc:Choice>
-              <mc:Fallback>
+              <mc:Fallback xmlns:w16sdtfl="http://schemas.microsoft.com/office/word/2024/wordml/sdtformatlock" xmlns:w16du="http://schemas.microsoft.com/office/word/2023/wordml/word16du" xmlns:oel="http://schemas.microsoft.com/office/2019/extlst">
                 <w:pict>
                   <v:shapetype w14:anchorId="0823FE00" id="_x0000_t202" coordsize="21600,21600" o:spt="202" path="m,l,21600r21600,l21600,xe">
                     <v:stroke joinstyle="miter"/>
@@ -3483,9 +3484,9 @@
           <w:noProof/>
         </w:rPr>
         <w:drawing>
-          <wp:inline distT="0" distB="0" distL="0" distR="0" wp14:anchorId="0FC9CC48" wp14:editId="7229BC7B">
+          <wp:inline distT="0" distB="0" distL="0" distR="0" wp14:anchorId="0FC9CC48" wp14:editId="20A778CB">
             <wp:extent cx="5731510" cy="2883779"/>
-            <wp:effectExtent l="57150" t="0" r="59690" b="0"/>
+            <wp:effectExtent l="76200" t="0" r="59690" b="0"/>
             <wp:docPr id="489886502" name="Diagram 1"/>
             <wp:cNvGraphicFramePr/>
             <a:graphic xmlns:a="http://schemas.openxmlformats.org/drawingml/2006/main">
@@ -3606,17 +3607,6 @@
       </w:r>
       <w:r>
         <w:t>roduct = A page for users with a role of “Producer” to edit their product’s details</w:t>
-      </w:r>
-    </w:p>
-    <w:p>
-      <w:r>
-        <w:t xml:space="preserve">Delete </w:t>
-      </w:r>
-      <w:r>
-        <w:t>p</w:t>
-      </w:r>
-      <w:r>
-        <w:t>roduct = A page for users with a role of “Producer” to remove their product</w:t>
       </w:r>
     </w:p>
     <w:p>
@@ -3781,7 +3771,7 @@
               </wp:inline>
             </w:drawing>
           </mc:Choice>
-          <mc:Fallback>
+          <mc:Fallback xmlns:w16sdtfl="http://schemas.microsoft.com/office/word/2024/wordml/sdtformatlock" xmlns:w16du="http://schemas.microsoft.com/office/word/2023/wordml/word16du" xmlns:oel="http://schemas.microsoft.com/office/2019/extlst">
             <w:pict>
               <v:roundrect w14:anchorId="294CB9CF" id="Rectangle: Rounded Corners 2" o:spid="_x0000_s1026" style="width:16.5pt;height:17.25pt;visibility:visible;mso-wrap-style:square;mso-left-percent:-10001;mso-top-percent:-10001;mso-position-horizontal:absolute;mso-position-horizontal-relative:char;mso-position-vertical:absolute;mso-position-vertical-relative:line;mso-left-percent:-10001;mso-top-percent:-10001;v-text-anchor:middle" arcsize="10923f" o:gfxdata="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" fillcolor="#1f2a24" strokecolor="black [480]" strokeweight="1.5pt">
                 <v:stroke joinstyle="miter"/>
@@ -3904,7 +3894,7 @@
               </wp:inline>
             </w:drawing>
           </mc:Choice>
-          <mc:Fallback>
+          <mc:Fallback xmlns:w16sdtfl="http://schemas.microsoft.com/office/word/2024/wordml/sdtformatlock" xmlns:w16du="http://schemas.microsoft.com/office/word/2023/wordml/word16du" xmlns:oel="http://schemas.microsoft.com/office/2019/extlst">
             <w:pict>
               <v:roundrect w14:anchorId="7BA22B8E" id="Rectangle: Rounded Corners 2" o:spid="_x0000_s1027" style="width:17pt;height:17pt;visibility:visible;mso-wrap-style:square;mso-left-percent:-10001;mso-top-percent:-10001;mso-position-horizontal:absolute;mso-position-horizontal-relative:char;mso-position-vertical:absolute;mso-position-vertical-relative:line;mso-left-percent:-10001;mso-top-percent:-10001;v-text-anchor:middle" arcsize="10923f" o:gfxdata="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" fillcolor="#2f3e35" strokecolor="black [480]" strokeweight="1.5pt">
                 <v:stroke joinstyle="miter"/>
@@ -4061,7 +4051,7 @@
               </wp:inline>
             </w:drawing>
           </mc:Choice>
-          <mc:Fallback>
+          <mc:Fallback xmlns:w16sdtfl="http://schemas.microsoft.com/office/word/2024/wordml/sdtformatlock" xmlns:w16du="http://schemas.microsoft.com/office/word/2023/wordml/word16du" xmlns:oel="http://schemas.microsoft.com/office/2019/extlst">
             <w:pict>
               <v:roundrect w14:anchorId="6CFF735A" id="_x0000_s1028" style="width:16.5pt;height:17.25pt;visibility:visible;mso-wrap-style:square;mso-left-percent:-10001;mso-top-percent:-10001;mso-position-horizontal:absolute;mso-position-horizontal-relative:char;mso-position-vertical:absolute;mso-position-vertical-relative:line;mso-left-percent:-10001;mso-top-percent:-10001;v-text-anchor:middle" arcsize="10923f" o:gfxdata="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" fillcolor="#f5f5f5" strokecolor="black [480]" strokeweight="1.5pt">
                 <v:stroke joinstyle="miter"/>
@@ -4192,7 +4182,7 @@
               </wp:inline>
             </w:drawing>
           </mc:Choice>
-          <mc:Fallback>
+          <mc:Fallback xmlns:w16sdtfl="http://schemas.microsoft.com/office/word/2024/wordml/sdtformatlock" xmlns:w16du="http://schemas.microsoft.com/office/word/2023/wordml/word16du" xmlns:oel="http://schemas.microsoft.com/office/2019/extlst">
             <w:pict>
               <v:roundrect w14:anchorId="5B9A8121" id="_x0000_s1029" style="width:16.5pt;height:17.25pt;visibility:visible;mso-wrap-style:square;mso-left-percent:-10001;mso-top-percent:-10001;mso-position-horizontal:absolute;mso-position-horizontal-relative:char;mso-position-vertical:absolute;mso-position-vertical-relative:line;mso-left-percent:-10001;mso-top-percent:-10001;v-text-anchor:middle" arcsize="10923f" o:gfxdata="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" fillcolor="#c8d5c0" strokecolor="black [480]" strokeweight="1.5pt">
                 <v:stroke joinstyle="miter"/>
@@ -4335,7 +4325,7 @@
               </wp:inline>
             </w:drawing>
           </mc:Choice>
-          <mc:Fallback>
+          <mc:Fallback xmlns:w16sdtfl="http://schemas.microsoft.com/office/word/2024/wordml/sdtformatlock" xmlns:w16du="http://schemas.microsoft.com/office/word/2023/wordml/word16du" xmlns:oel="http://schemas.microsoft.com/office/2019/extlst">
             <w:pict>
               <v:roundrect w14:anchorId="29C0FE2C" id="_x0000_s1030" style="width:16.5pt;height:17.25pt;visibility:visible;mso-wrap-style:square;mso-left-percent:-10001;mso-top-percent:-10001;mso-position-horizontal:absolute;mso-position-horizontal-relative:char;mso-position-vertical:absolute;mso-position-vertical-relative:line;mso-left-percent:-10001;mso-top-percent:-10001;v-text-anchor:middle" arcsize="10923f" o:gfxdata="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" fillcolor="#6bbf59" strokecolor="black [480]" strokeweight="1.5pt">
                 <v:stroke joinstyle="miter"/>
@@ -4475,7 +4465,7 @@
               </wp:inline>
             </w:drawing>
           </mc:Choice>
-          <mc:Fallback>
+          <mc:Fallback xmlns:w16sdtfl="http://schemas.microsoft.com/office/word/2024/wordml/sdtformatlock" xmlns:w16du="http://schemas.microsoft.com/office/word/2023/wordml/word16du" xmlns:oel="http://schemas.microsoft.com/office/2019/extlst">
             <w:pict>
               <v:roundrect w14:anchorId="179D4785" id="_x0000_s1031" style="width:16.5pt;height:17.25pt;visibility:visible;mso-wrap-style:square;mso-left-percent:-10001;mso-top-percent:-10001;mso-position-horizontal:absolute;mso-position-horizontal-relative:char;mso-position-vertical:absolute;mso-position-vertical-relative:line;mso-left-percent:-10001;mso-top-percent:-10001;v-text-anchor:middle" arcsize="10923f" o:gfxdata="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" fillcolor="#4f9f4a" strokecolor="black [480]" strokeweight="1.5pt">
                 <v:stroke joinstyle="miter"/>
@@ -4526,6 +4516,7 @@
       </w:pPr>
       <w:bookmarkStart w:id="6" w:name="_Toc224235739"/>
       <w:r>
+        <w:lastRenderedPageBreak/>
         <w:t>Light Mode</w:t>
       </w:r>
       <w:bookmarkEnd w:id="6"/>
@@ -4622,7 +4613,7 @@
               </wp:inline>
             </w:drawing>
           </mc:Choice>
-          <mc:Fallback>
+          <mc:Fallback xmlns:w16sdtfl="http://schemas.microsoft.com/office/word/2024/wordml/sdtformatlock" xmlns:w16du="http://schemas.microsoft.com/office/word/2023/wordml/word16du" xmlns:oel="http://schemas.microsoft.com/office/2019/extlst">
             <w:pict>
               <v:roundrect w14:anchorId="667E51D7" id="Rectangle: Rounded Corners 2" o:spid="_x0000_s1026" style="width:16.5pt;height:17.25pt;visibility:visible;mso-wrap-style:square;mso-left-percent:-10001;mso-top-percent:-10001;mso-position-horizontal:absolute;mso-position-horizontal-relative:char;mso-position-vertical:absolute;mso-position-vertical-relative:line;mso-left-percent:-10001;mso-top-percent:-10001;v-text-anchor:middle" arcsize="10923f" o:gfxdata="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" fillcolor="#faf7f2" strokecolor="black [480]" strokeweight="1.5pt">
                 <v:stroke joinstyle="miter"/>
@@ -4752,7 +4743,7 @@
               </wp:inline>
             </w:drawing>
           </mc:Choice>
-          <mc:Fallback>
+          <mc:Fallback xmlns:w16sdtfl="http://schemas.microsoft.com/office/word/2024/wordml/sdtformatlock" xmlns:w16du="http://schemas.microsoft.com/office/word/2023/wordml/word16du" xmlns:oel="http://schemas.microsoft.com/office/2019/extlst">
             <w:pict>
               <v:roundrect w14:anchorId="32088A45" id="_x0000_s1032" style="width:17pt;height:17pt;visibility:visible;mso-wrap-style:square;mso-left-percent:-10001;mso-top-percent:-10001;mso-position-horizontal:absolute;mso-position-horizontal-relative:char;mso-position-vertical:absolute;mso-position-vertical-relative:line;mso-left-percent:-10001;mso-top-percent:-10001;v-text-anchor:middle" arcsize="10923f" o:gfxdata="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" strokecolor="black [480]" strokeweight="1.5pt">
                 <v:stroke joinstyle="miter"/>
@@ -4923,7 +4914,7 @@
               </wp:inline>
             </w:drawing>
           </mc:Choice>
-          <mc:Fallback>
+          <mc:Fallback xmlns:w16sdtfl="http://schemas.microsoft.com/office/word/2024/wordml/sdtformatlock" xmlns:w16du="http://schemas.microsoft.com/office/word/2023/wordml/word16du" xmlns:oel="http://schemas.microsoft.com/office/2019/extlst">
             <w:pict>
               <v:roundrect w14:anchorId="03C0396B" id="_x0000_s1033" style="width:16.5pt;height:17.25pt;visibility:visible;mso-wrap-style:square;mso-left-percent:-10001;mso-top-percent:-10001;mso-position-horizontal:absolute;mso-position-horizontal-relative:char;mso-position-vertical:absolute;mso-position-vertical-relative:line;mso-left-percent:-10001;mso-top-percent:-10001;v-text-anchor:middle" arcsize="10923f" o:gfxdata="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" fillcolor="#2b2b2b" strokecolor="black [480]" strokeweight="1.5pt">
                 <v:stroke joinstyle="miter"/>
@@ -5054,7 +5045,7 @@
               </wp:inline>
             </w:drawing>
           </mc:Choice>
-          <mc:Fallback>
+          <mc:Fallback xmlns:w16sdtfl="http://schemas.microsoft.com/office/word/2024/wordml/sdtformatlock" xmlns:w16du="http://schemas.microsoft.com/office/word/2023/wordml/word16du" xmlns:oel="http://schemas.microsoft.com/office/2019/extlst">
             <w:pict>
               <v:roundrect w14:anchorId="192401AD" id="_x0000_s1034" style="width:16.5pt;height:17.25pt;visibility:visible;mso-wrap-style:square;mso-left-percent:-10001;mso-top-percent:-10001;mso-position-horizontal:absolute;mso-position-horizontal-relative:char;mso-position-vertical:absolute;mso-position-vertical-relative:line;mso-left-percent:-10001;mso-top-percent:-10001;v-text-anchor:middle" arcsize="10923f" o:gfxdata="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" fillcolor="#6b6b6b" strokecolor="black [480]" strokeweight="1.5pt">
                 <v:stroke joinstyle="miter"/>
@@ -5204,7 +5195,7 @@
               </wp:inline>
             </w:drawing>
           </mc:Choice>
-          <mc:Fallback>
+          <mc:Fallback xmlns:w16sdtfl="http://schemas.microsoft.com/office/word/2024/wordml/sdtformatlock" xmlns:w16du="http://schemas.microsoft.com/office/word/2023/wordml/word16du" xmlns:oel="http://schemas.microsoft.com/office/2019/extlst">
             <w:pict>
               <v:roundrect w14:anchorId="4D6EB5A5" id="_x0000_s1035" style="width:16.5pt;height:17.25pt;visibility:visible;mso-wrap-style:square;mso-left-percent:-10001;mso-top-percent:-10001;mso-position-horizontal:absolute;mso-position-horizontal-relative:char;mso-position-vertical:absolute;mso-position-vertical-relative:line;mso-left-percent:-10001;mso-top-percent:-10001;v-text-anchor:middle" arcsize="10923f" o:gfxdata="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" fillcolor="#2f6f4e" strokecolor="black [480]" strokeweight="1.5pt">
                 <v:stroke joinstyle="miter"/>
@@ -5351,7 +5342,7 @@
               </wp:inline>
             </w:drawing>
           </mc:Choice>
-          <mc:Fallback>
+          <mc:Fallback xmlns:w16sdtfl="http://schemas.microsoft.com/office/word/2024/wordml/sdtformatlock" xmlns:w16du="http://schemas.microsoft.com/office/word/2023/wordml/word16du" xmlns:oel="http://schemas.microsoft.com/office/2019/extlst">
             <w:pict>
               <v:roundrect w14:anchorId="2C16EFAA" id="_x0000_s1036" style="width:16.5pt;height:17.25pt;visibility:visible;mso-wrap-style:square;mso-left-percent:-10001;mso-top-percent:-10001;mso-position-horizontal:absolute;mso-position-horizontal-relative:char;mso-position-vertical:absolute;mso-position-vertical-relative:line;mso-left-percent:-10001;mso-top-percent:-10001;v-text-anchor:middle" arcsize="10923f" o:gfxdata="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" fillcolor="#1f4f36" strokecolor="black [480]" strokeweight="1.5pt">
                 <v:stroke joinstyle="miter"/>
@@ -5638,7 +5629,7 @@
               </wp:inline>
             </w:drawing>
           </mc:Choice>
-          <mc:Fallback>
+          <mc:Fallback xmlns:w16sdtfl="http://schemas.microsoft.com/office/word/2024/wordml/sdtformatlock" xmlns:w16du="http://schemas.microsoft.com/office/word/2023/wordml/word16du" xmlns:oel="http://schemas.microsoft.com/office/2019/extlst">
             <w:pict>
               <v:roundrect w14:anchorId="5970E1FE" id="_x0000_s1037" style="width:16.5pt;height:17.25pt;visibility:visible;mso-wrap-style:square;mso-left-percent:-10001;mso-top-percent:-10001;mso-position-horizontal:absolute;mso-position-horizontal-relative:char;mso-position-vertical:absolute;mso-position-vertical-relative:line;mso-left-percent:-10001;mso-top-percent:-10001;v-text-anchor:middle" arcsize="10923f" o:gfxdata="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" fillcolor="#f4a259" strokecolor="black [480]" strokeweight="1.5pt">
                 <v:stroke joinstyle="miter"/>
@@ -5769,7 +5760,7 @@
               </wp:inline>
             </w:drawing>
           </mc:Choice>
-          <mc:Fallback>
+          <mc:Fallback xmlns:w16sdtfl="http://schemas.microsoft.com/office/word/2024/wordml/sdtformatlock" xmlns:w16du="http://schemas.microsoft.com/office/word/2023/wordml/word16du" xmlns:oel="http://schemas.microsoft.com/office/2019/extlst">
             <w:pict>
               <v:roundrect w14:anchorId="68B6314B" id="_x0000_s1038" style="width:16.5pt;height:17.25pt;visibility:visible;mso-wrap-style:square;mso-left-percent:-10001;mso-top-percent:-10001;mso-position-horizontal:absolute;mso-position-horizontal-relative:char;mso-position-vertical:absolute;mso-position-vertical-relative:line;mso-left-percent:-10001;mso-top-percent:-10001;v-text-anchor:middle" arcsize="10923f" o:gfxdata="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" fillcolor="#4caf50" strokecolor="black [480]" strokeweight="1.5pt">
                 <v:stroke joinstyle="miter"/>
@@ -5893,7 +5884,7 @@
               </wp:inline>
             </w:drawing>
           </mc:Choice>
-          <mc:Fallback>
+          <mc:Fallback xmlns:w16sdtfl="http://schemas.microsoft.com/office/word/2024/wordml/sdtformatlock" xmlns:w16du="http://schemas.microsoft.com/office/word/2023/wordml/word16du" xmlns:oel="http://schemas.microsoft.com/office/2019/extlst">
             <w:pict>
               <v:roundrect w14:anchorId="164D798E" id="_x0000_s1039" style="width:16.5pt;height:17.25pt;visibility:visible;mso-wrap-style:square;mso-left-percent:-10001;mso-top-percent:-10001;mso-position-horizontal:absolute;mso-position-horizontal-relative:char;mso-position-vertical:absolute;mso-position-vertical-relative:line;mso-left-percent:-10001;mso-top-percent:-10001;v-text-anchor:middle" arcsize="10923f" o:gfxdata="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" fillcolor="#e9b44c" strokecolor="black [480]" strokeweight="1.5pt">
                 <v:stroke joinstyle="miter"/>
@@ -6010,7 +6001,7 @@
               </wp:inline>
             </w:drawing>
           </mc:Choice>
-          <mc:Fallback>
+          <mc:Fallback xmlns:w16sdtfl="http://schemas.microsoft.com/office/word/2024/wordml/sdtformatlock" xmlns:w16du="http://schemas.microsoft.com/office/word/2023/wordml/word16du" xmlns:oel="http://schemas.microsoft.com/office/2019/extlst">
             <w:pict>
               <v:roundrect w14:anchorId="3CDDD8D2" id="_x0000_s1040" style="width:16.5pt;height:17.25pt;visibility:visible;mso-wrap-style:square;mso-left-percent:-10001;mso-top-percent:-10001;mso-position-horizontal:absolute;mso-position-horizontal-relative:char;mso-position-vertical:absolute;mso-position-vertical-relative:line;mso-left-percent:-10001;mso-top-percent:-10001;v-text-anchor:middle" arcsize="10923f" o:gfxdata="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" fillcolor="#d9534f" strokecolor="black [480]" strokeweight="1.5pt">
                 <v:stroke joinstyle="miter"/>
@@ -6289,11 +6280,11 @@
         <w:tblLook w:val="04A0" w:firstRow="1" w:lastRow="0" w:firstColumn="1" w:lastColumn="0" w:noHBand="0" w:noVBand="1"/>
       </w:tblPr>
       <w:tblGrid>
-        <w:gridCol w:w="2889"/>
-        <w:gridCol w:w="1565"/>
-        <w:gridCol w:w="1207"/>
-        <w:gridCol w:w="1023"/>
-        <w:gridCol w:w="1317"/>
+        <w:gridCol w:w="2911"/>
+        <w:gridCol w:w="1711"/>
+        <w:gridCol w:w="1152"/>
+        <w:gridCol w:w="976"/>
+        <w:gridCol w:w="1251"/>
         <w:gridCol w:w="1015"/>
       </w:tblGrid>
       <w:tr>
@@ -7218,11 +7209,11 @@
         <w:tblLook w:val="04A0" w:firstRow="1" w:lastRow="0" w:firstColumn="1" w:lastColumn="0" w:noHBand="0" w:noVBand="1"/>
       </w:tblPr>
       <w:tblGrid>
-        <w:gridCol w:w="2798"/>
-        <w:gridCol w:w="1656"/>
-        <w:gridCol w:w="1207"/>
-        <w:gridCol w:w="1023"/>
-        <w:gridCol w:w="1317"/>
+        <w:gridCol w:w="2911"/>
+        <w:gridCol w:w="1711"/>
+        <w:gridCol w:w="1152"/>
+        <w:gridCol w:w="976"/>
+        <w:gridCol w:w="1251"/>
         <w:gridCol w:w="1015"/>
       </w:tblGrid>
       <w:tr>
@@ -9178,7 +9169,6 @@
           <w:p>
             <w:proofErr w:type="spellStart"/>
             <w:r>
-              <w:lastRenderedPageBreak/>
               <w:t>UserId</w:t>
             </w:r>
             <w:proofErr w:type="spellEnd"/>
@@ -9401,6 +9391,7 @@
       </w:pPr>
       <w:bookmarkStart w:id="29" w:name="_Toc224235762"/>
       <w:r>
+        <w:lastRenderedPageBreak/>
         <w:t>Products</w:t>
       </w:r>
       <w:bookmarkEnd w:id="29"/>
@@ -10557,7 +10548,6 @@
           </w:p>
           <w:p>
             <w:r>
-              <w:lastRenderedPageBreak/>
               <w:t>Can only be a valid address.</w:t>
             </w:r>
           </w:p>
@@ -10568,7 +10558,6 @@
           </w:tcPr>
           <w:p>
             <w:r>
-              <w:lastRenderedPageBreak/>
               <w:t>None</w:t>
             </w:r>
           </w:p>
@@ -10655,6 +10644,7 @@
           <w:p>
             <w:proofErr w:type="spellStart"/>
             <w:r>
+              <w:lastRenderedPageBreak/>
               <w:t>DeliveryPostcode</w:t>
             </w:r>
             <w:proofErr w:type="spellEnd"/>
@@ -11681,7 +11671,6 @@
           <w:p>
             <w:proofErr w:type="spellStart"/>
             <w:r>
-              <w:lastRenderedPageBreak/>
               <w:t>IsActive</w:t>
             </w:r>
             <w:proofErr w:type="spellEnd"/>
@@ -12015,12 +12004,12 @@
         <w:tblLook w:val="04A0" w:firstRow="1" w:lastRow="0" w:firstColumn="1" w:lastColumn="0" w:noHBand="0" w:noVBand="1"/>
       </w:tblPr>
       <w:tblGrid>
-        <w:gridCol w:w="2662"/>
-        <w:gridCol w:w="1468"/>
-        <w:gridCol w:w="1207"/>
-        <w:gridCol w:w="1347"/>
-        <w:gridCol w:w="1317"/>
-        <w:gridCol w:w="1015"/>
+        <w:gridCol w:w="2712"/>
+        <w:gridCol w:w="1528"/>
+        <w:gridCol w:w="1197"/>
+        <w:gridCol w:w="1261"/>
+        <w:gridCol w:w="1307"/>
+        <w:gridCol w:w="1011"/>
       </w:tblGrid>
       <w:tr>
         <w:tc>
@@ -13014,11 +13003,11 @@
         <w:t>matches</w:t>
       </w:r>
       <w:r>
-        <w:t xml:space="preserve"> password. If the information is incorrect give them an </w:t>
+        <w:t xml:space="preserve"> password. If the information is incorrect give them an error message on </w:t>
       </w:r>
       <w:r>
         <w:lastRenderedPageBreak/>
-        <w:t>error message on their screen for the specific information field. If the information is correct send it to the table called “Users” and save the changes made to database.</w:t>
+        <w:t>their screen for the specific information field. If the information is correct send it to the table called “Users” and save the changes made to database.</w:t>
       </w:r>
     </w:p>
     <w:p/>
@@ -13134,7 +13123,13 @@
     </w:p>
     <w:p>
       <w:r>
-        <w:t>When the user clicks the filter button, filtered products are found from the table “Rooms” by the minimum price and maximum price inputted by the user. The filtered products are sent to the “Products” page to be displayed and then the user is sent to the “</w:t>
+        <w:t>When the user clicks the filter button, filtered products are found from the table “</w:t>
+      </w:r>
+      <w:r>
+        <w:t>Products</w:t>
+      </w:r>
+      <w:r>
+        <w:t>” by the minimum price and maximum price inputted by the user. The filtered products are sent to the “Products” page to be displayed and then the user is sent to the “</w:t>
       </w:r>
       <w:r>
         <w:t>Products</w:t>
@@ -13200,11 +13195,11 @@
     </w:p>
     <w:p>
       <w:r>
-        <w:t xml:space="preserve">When the user clicks the “Edit Product Availability” button, the user’s role is taken from the “User Roles” table and checked for if it is a “Producer” role. If the user role is not a “Producer” role then the user is denied access and sent to the “Access Denied” page. If </w:t>
+        <w:t xml:space="preserve">When the user clicks the “Edit Product Availability” button, the user’s role is taken from the “User Roles” table and checked for if it is a “Producer” role. If the user role is not a “Producer” role then the user is denied access and sent to the “Access Denied” page. If the user has access to page, then the product that’s availability is going to change is taken, and </w:t>
       </w:r>
       <w:r>
         <w:lastRenderedPageBreak/>
-        <w:t>the user has access to page, then the product that’s availability is going to change is taken, and the new availability status from the user. This new data is sent to the “Products” table and then saved to the database. Finally, the user is sent to the “Products” page.</w:t>
+        <w:t>the new availability status from the user. This new data is sent to the “Products” table and then saved to the database. Finally, the user is sent to the “Products” page.</w:t>
       </w:r>
     </w:p>
     <w:p>
@@ -13270,11 +13265,7 @@
         <w:t xml:space="preserve"> is checked to see if they are logged in, if they are not then they are redirected to the log in page. The product identification and quantity are inputted by the users for the product to be added to the basket. The quantity is checked for if it is less than 1, if that is true then a relevant error message is shown to the user and the user is redirected to the products page without no product being added to the basket. If the quantity is not less than 1, then the user’s basket identification is </w:t>
       </w:r>
       <w:r>
-        <w:t xml:space="preserve">retrieved from the table “Basket” using the user’s identification. The user identification, product identification and quantity are sent to the table “Basket” </w:t>
-      </w:r>
-      <w:r>
-        <w:lastRenderedPageBreak/>
-        <w:t>and then the changes are saved to the database. Finally, the user is sent to the products page with the product being added to the basket.</w:t>
+        <w:t>retrieved from the table “Basket” using the user’s identification. The user identification, product identification and quantity are sent to the table “Basket” and then the changes are saved to the database. Finally, the user is sent to the products page with the product being added to the basket.</w:t>
       </w:r>
     </w:p>
     <w:p>
@@ -13283,6 +13274,7 @@
       </w:pPr>
       <w:bookmarkStart w:id="41" w:name="_Toc224235774"/>
       <w:r>
+        <w:lastRenderedPageBreak/>
         <w:t>Test Strategy</w:t>
       </w:r>
       <w:bookmarkEnd w:id="41"/>
@@ -13414,7 +13406,11 @@
           <w:tcPr>
             <w:tcW w:w="1271" w:type="dxa"/>
           </w:tcPr>
-          <w:p/>
+          <w:p>
+            <w:r>
+              <w:t>14/04/26</w:t>
+            </w:r>
+          </w:p>
         </w:tc>
         <w:tc>
           <w:tcPr>
@@ -13653,7 +13649,11 @@
           <w:tcPr>
             <w:tcW w:w="1271" w:type="dxa"/>
           </w:tcPr>
-          <w:p/>
+          <w:p>
+            <w:r>
+              <w:t>14/04/26</w:t>
+            </w:r>
+          </w:p>
         </w:tc>
         <w:tc>
           <w:tcPr>
@@ -13707,10 +13707,7 @@
           </w:tcPr>
           <w:p>
             <w:r>
-              <w:t>The log-in page must be created</w:t>
-            </w:r>
-            <w:r>
-              <w:t>.</w:t>
+              <w:t>The log-in page must be created.</w:t>
             </w:r>
           </w:p>
           <w:p>
@@ -13720,10 +13717,7 @@
           </w:p>
           <w:p>
             <w:r>
-              <w:t xml:space="preserve">The </w:t>
-            </w:r>
-            <w:r>
-              <w:t>controller logic must work correctly.</w:t>
+              <w:t>The controller logic must work correctly.</w:t>
             </w:r>
           </w:p>
           <w:p/>
@@ -13796,16 +13790,12 @@
             </w:r>
             <w:proofErr w:type="spellStart"/>
             <w:r>
-              <w:t>bad</w:t>
-            </w:r>
-            <w:r>
-              <w:t>email</w:t>
+              <w:t>bademail</w:t>
             </w:r>
             <w:proofErr w:type="spellEnd"/>
           </w:p>
           <w:p>
             <w:r>
-              <w:lastRenderedPageBreak/>
               <w:t>Password: 111</w:t>
             </w:r>
           </w:p>
@@ -13847,7 +13837,12 @@
           <w:tcPr>
             <w:tcW w:w="1271" w:type="dxa"/>
           </w:tcPr>
-          <w:p/>
+          <w:p>
+            <w:r>
+              <w:lastRenderedPageBreak/>
+              <w:t>14/04/26</w:t>
+            </w:r>
+          </w:p>
         </w:tc>
         <w:tc>
           <w:tcPr>
@@ -13896,18 +13891,12 @@
           </w:tcPr>
           <w:p>
             <w:r>
-              <w:t>Log in system must be fully functional</w:t>
-            </w:r>
-            <w:r>
-              <w:t xml:space="preserve"> and allow users to create accounts.</w:t>
-            </w:r>
-          </w:p>
-          <w:p>
-            <w:r>
-              <w:t>Log out button</w:t>
-            </w:r>
-            <w:r>
-              <w:t xml:space="preserve"> must work and be visible to the users.</w:t>
+              <w:t>Log in system must be fully functional and allow users to create accounts.</w:t>
+            </w:r>
+          </w:p>
+          <w:p>
+            <w:r>
+              <w:t>Log out button must work and be visible to the users.</w:t>
             </w:r>
           </w:p>
           <w:p>
@@ -13922,7 +13911,11 @@
           <w:tcPr>
             <w:tcW w:w="1271" w:type="dxa"/>
           </w:tcPr>
-          <w:p/>
+          <w:p>
+            <w:r>
+              <w:t>14/04/26</w:t>
+            </w:r>
+          </w:p>
         </w:tc>
         <w:tc>
           <w:tcPr>
@@ -13971,38 +13964,17 @@
           </w:tcPr>
           <w:p>
             <w:r>
-              <w:t xml:space="preserve">Log in </w:t>
-            </w:r>
-            <w:r>
-              <w:t>system must be fully functional</w:t>
-            </w:r>
-            <w:r>
-              <w:t>.</w:t>
-            </w:r>
-          </w:p>
-          <w:p>
-            <w:r>
-              <w:t>Valid account should exist</w:t>
-            </w:r>
-            <w:r>
-              <w:t>.</w:t>
-            </w:r>
-          </w:p>
-          <w:p>
-            <w:r>
-              <w:t xml:space="preserve">Tester must </w:t>
-            </w:r>
-            <w:r>
-              <w:t>click the remember me check box when logging in</w:t>
-            </w:r>
-            <w:r>
-              <w:t xml:space="preserve">, leave the page, open the </w:t>
-            </w:r>
-            <w:r>
-              <w:t>page on the same device and check if site kept the user logged in</w:t>
-            </w:r>
-            <w:r>
-              <w:t>.</w:t>
+              <w:t>Log in system must be fully functional.</w:t>
+            </w:r>
+          </w:p>
+          <w:p>
+            <w:r>
+              <w:t>Valid account should exist.</w:t>
+            </w:r>
+          </w:p>
+          <w:p>
+            <w:r>
+              <w:t>Tester must click the remember me check box when logging in, leave the page, open the page on the same device and check if site kept the user logged in.</w:t>
             </w:r>
           </w:p>
           <w:p>
@@ -14017,7 +13989,11 @@
           <w:tcPr>
             <w:tcW w:w="1271" w:type="dxa"/>
           </w:tcPr>
-          <w:p/>
+          <w:p>
+            <w:r>
+              <w:t>14/04/26</w:t>
+            </w:r>
+          </w:p>
         </w:tc>
         <w:tc>
           <w:tcPr>
@@ -14076,33 +14052,12 @@
           </w:p>
           <w:p>
             <w:r>
-              <w:t>Forgotten</w:t>
-            </w:r>
-            <w:r>
-              <w:t xml:space="preserve"> </w:t>
-            </w:r>
-            <w:r>
-              <w:t>system must be fully functional.</w:t>
-            </w:r>
-          </w:p>
-          <w:p>
-            <w:r>
-              <w:t xml:space="preserve">Tester should click </w:t>
-            </w:r>
-            <w:r>
-              <w:t xml:space="preserve">forgot </w:t>
-            </w:r>
-            <w:r>
-              <w:t>password,</w:t>
-            </w:r>
-            <w:r>
-              <w:t xml:space="preserve"> and a reset email</w:t>
-            </w:r>
-            <w:r>
-              <w:t xml:space="preserve"> should be sent to </w:t>
-            </w:r>
-            <w:r>
-              <w:t>reset password.</w:t>
+              <w:t>Forgotten system must be fully functional.</w:t>
+            </w:r>
+          </w:p>
+          <w:p>
+            <w:r>
+              <w:t>Tester should click forgot password, and a reset email should be sent to reset password.</w:t>
             </w:r>
           </w:p>
           <w:p>
@@ -14117,7 +14072,11 @@
           <w:tcPr>
             <w:tcW w:w="1271" w:type="dxa"/>
           </w:tcPr>
-          <w:p/>
+          <w:p>
+            <w:r>
+              <w:t>14/04/26</w:t>
+            </w:r>
+          </w:p>
         </w:tc>
         <w:tc>
           <w:tcPr>
@@ -14161,44 +14120,17 @@
           </w:tcPr>
           <w:p>
             <w:r>
-              <w:t>All the pages</w:t>
-            </w:r>
-            <w:r>
-              <w:t xml:space="preserve"> for each link should be made </w:t>
-            </w:r>
-            <w:r>
-              <w:t>and the controller logic for each link must work correctly.</w:t>
-            </w:r>
-          </w:p>
-          <w:p>
-            <w:r>
-              <w:t xml:space="preserve">The </w:t>
-            </w:r>
-            <w:r>
-              <w:t>navigation</w:t>
-            </w:r>
-            <w:r>
-              <w:t xml:space="preserve"> </w:t>
-            </w:r>
-            <w:r>
-              <w:t>bar should be made and be fully functional.</w:t>
-            </w:r>
-          </w:p>
-          <w:p>
-            <w:r>
-              <w:t xml:space="preserve">Tester must </w:t>
-            </w:r>
-            <w:r>
-              <w:t xml:space="preserve">check each link to see if it leads to the </w:t>
-            </w:r>
-            <w:r>
-              <w:t>correct</w:t>
-            </w:r>
-            <w:r>
-              <w:t xml:space="preserve"> page</w:t>
-            </w:r>
-            <w:r>
-              <w:t>.</w:t>
+              <w:t>All the pages for each link should be made and the controller logic for each link must work correctly.</w:t>
+            </w:r>
+          </w:p>
+          <w:p>
+            <w:r>
+              <w:t>The navigation bar should be made and be fully functional.</w:t>
+            </w:r>
+          </w:p>
+          <w:p>
+            <w:r>
+              <w:t>Tester must check each link to see if it leads to the correct page.</w:t>
             </w:r>
           </w:p>
           <w:p>
@@ -14213,7 +14145,11 @@
           <w:tcPr>
             <w:tcW w:w="1271" w:type="dxa"/>
           </w:tcPr>
-          <w:p/>
+          <w:p>
+            <w:r>
+              <w:t>14/04/26</w:t>
+            </w:r>
+          </w:p>
         </w:tc>
         <w:tc>
           <w:tcPr>
@@ -14221,10 +14157,7 @@
           </w:tcPr>
           <w:p>
             <w:r>
-              <w:t>Logo on the navigation bar</w:t>
-            </w:r>
-            <w:r>
-              <w:t xml:space="preserve"> and the footer</w:t>
+              <w:t>Logo on the navigation bar and the footer</w:t>
             </w:r>
           </w:p>
         </w:tc>
@@ -14260,13 +14193,7 @@
           </w:tcPr>
           <w:p>
             <w:r>
-              <w:t xml:space="preserve">Home page should be made and be </w:t>
-            </w:r>
-            <w:r>
-              <w:t xml:space="preserve">fully </w:t>
-            </w:r>
-            <w:r>
-              <w:t>functional.</w:t>
+              <w:t>Home page should be made and be fully functional.</w:t>
             </w:r>
           </w:p>
           <w:p>
@@ -14281,13 +14208,7 @@
           </w:p>
           <w:p>
             <w:r>
-              <w:t>Tester should click the logo</w:t>
-            </w:r>
-            <w:r>
-              <w:t xml:space="preserve"> to check if they are taken to the home page</w:t>
-            </w:r>
-            <w:r>
-              <w:t>.</w:t>
+              <w:t>Tester should click the logo to check if they are taken to the home page.</w:t>
             </w:r>
           </w:p>
           <w:p>
@@ -14302,7 +14223,11 @@
           <w:tcPr>
             <w:tcW w:w="1271" w:type="dxa"/>
           </w:tcPr>
-          <w:p/>
+          <w:p>
+            <w:r>
+              <w:t>14/04/26</w:t>
+            </w:r>
+          </w:p>
         </w:tc>
         <w:tc>
           <w:tcPr>
@@ -14371,7 +14296,12 @@
           <w:tcPr>
             <w:tcW w:w="1271" w:type="dxa"/>
           </w:tcPr>
-          <w:p/>
+          <w:p>
+            <w:r>
+              <w:lastRenderedPageBreak/>
+              <w:t>14/04/26</w:t>
+            </w:r>
+          </w:p>
         </w:tc>
         <w:tc>
           <w:tcPr>
@@ -14503,7 +14433,11 @@
           <w:tcPr>
             <w:tcW w:w="1271" w:type="dxa"/>
           </w:tcPr>
-          <w:p/>
+          <w:p>
+            <w:r>
+              <w:t>14/04/26</w:t>
+            </w:r>
+          </w:p>
         </w:tc>
         <w:tc>
           <w:tcPr>
@@ -14617,7 +14551,11 @@
           <w:tcPr>
             <w:tcW w:w="1271" w:type="dxa"/>
           </w:tcPr>
-          <w:p/>
+          <w:p>
+            <w:r>
+              <w:t>14/04/26</w:t>
+            </w:r>
+          </w:p>
         </w:tc>
         <w:tc>
           <w:tcPr>
@@ -14625,13 +14563,7 @@
           </w:tcPr>
           <w:p>
             <w:r>
-              <w:t xml:space="preserve">Basket </w:t>
-            </w:r>
-            <w:r>
-              <w:t>items number</w:t>
-            </w:r>
-            <w:r>
-              <w:t xml:space="preserve"> text on the navigation bar</w:t>
+              <w:t>Basket items number text on the navigation bar</w:t>
             </w:r>
           </w:p>
         </w:tc>
@@ -14773,7 +14705,11 @@
           <w:tcPr>
             <w:tcW w:w="1271" w:type="dxa"/>
           </w:tcPr>
-          <w:p/>
+          <w:p>
+            <w:r>
+              <w:t>14/04/26</w:t>
+            </w:r>
+          </w:p>
         </w:tc>
         <w:tc>
           <w:tcPr>
@@ -14912,6 +14848,7 @@
                 <w:sz w:val="23"/>
                 <w:szCs w:val="23"/>
               </w:rPr>
+              <w:lastRenderedPageBreak/>
               <w:t>Migrations and update database must be applied.</w:t>
             </w:r>
           </w:p>
@@ -14920,16 +14857,7 @@
               <w:pStyle w:val="Default"/>
             </w:pPr>
             <w:r>
-              <w:t>Tester</w:t>
-            </w:r>
-            <w:r>
-              <w:t xml:space="preserve"> must click the “Previous Baskets” button to check if they get redirected to the </w:t>
-            </w:r>
-            <w:r>
-              <w:t>all-baskets’</w:t>
-            </w:r>
-            <w:r>
-              <w:t xml:space="preserve"> page.</w:t>
+              <w:t>Tester must click the “Previous Baskets” button to check if they get redirected to the all-baskets’ page.</w:t>
             </w:r>
           </w:p>
           <w:p>
@@ -14951,7 +14879,12 @@
           <w:tcPr>
             <w:tcW w:w="1271" w:type="dxa"/>
           </w:tcPr>
-          <w:p/>
+          <w:p>
+            <w:r>
+              <w:lastRenderedPageBreak/>
+              <w:t>14/04/26</w:t>
+            </w:r>
+          </w:p>
         </w:tc>
         <w:tc>
           <w:tcPr>
@@ -14959,13 +14892,7 @@
           </w:tcPr>
           <w:p>
             <w:r>
-              <w:t>Checkout using</w:t>
-            </w:r>
-            <w:r>
-              <w:t xml:space="preserve"> the “CHECKOUT” button on</w:t>
-            </w:r>
-            <w:r>
-              <w:t xml:space="preserve"> the basket side bar</w:t>
+              <w:t>Checkout using the “CHECKOUT” button on the basket side bar</w:t>
             </w:r>
           </w:p>
         </w:tc>
@@ -15128,7 +15055,11 @@
           <w:tcPr>
             <w:tcW w:w="1271" w:type="dxa"/>
           </w:tcPr>
-          <w:p/>
+          <w:p>
+            <w:r>
+              <w:t>14/04/26</w:t>
+            </w:r>
+          </w:p>
         </w:tc>
         <w:tc>
           <w:tcPr>
@@ -15292,7 +15223,11 @@
           <w:tcPr>
             <w:tcW w:w="1271" w:type="dxa"/>
           </w:tcPr>
-          <w:p/>
+          <w:p>
+            <w:r>
+              <w:t>14/04/26</w:t>
+            </w:r>
+          </w:p>
         </w:tc>
         <w:tc>
           <w:tcPr>
@@ -15336,39 +15271,12 @@
           </w:tcPr>
           <w:p>
             <w:r>
-              <w:t>Accessibility system must be fully functional</w:t>
-            </w:r>
-            <w:r>
-              <w:t xml:space="preserve"> and accessible by users</w:t>
-            </w:r>
-            <w:r>
-              <w:t>.</w:t>
-            </w:r>
-          </w:p>
-          <w:p>
-            <w:r>
-              <w:t>Tester should test each accessibility feature</w:t>
-            </w:r>
-            <w:r>
-              <w:t xml:space="preserve"> to see if it works</w:t>
-            </w:r>
-            <w:r>
-              <w:t>. F</w:t>
-            </w:r>
-            <w:r>
-              <w:t xml:space="preserve">or </w:t>
-            </w:r>
-            <w:r>
-              <w:t>example,</w:t>
-            </w:r>
-            <w:r>
-              <w:t xml:space="preserve"> </w:t>
-            </w:r>
-            <w:r>
-              <w:t>colour mode, text resize</w:t>
-            </w:r>
-            <w:r>
-              <w:t xml:space="preserve"> and text-to-speech.</w:t>
+              <w:t>Accessibility system must be fully functional and accessible by users.</w:t>
+            </w:r>
+          </w:p>
+          <w:p>
+            <w:r>
+              <w:t>Tester should test each accessibility feature to see if it works. For example, colour mode, text resize and text-to-speech.</w:t>
             </w:r>
           </w:p>
           <w:p>
@@ -15383,7 +15291,11 @@
           <w:tcPr>
             <w:tcW w:w="1271" w:type="dxa"/>
           </w:tcPr>
-          <w:p/>
+          <w:p>
+            <w:r>
+              <w:t>14/04/26</w:t>
+            </w:r>
+          </w:p>
         </w:tc>
         <w:tc>
           <w:tcPr>
@@ -15417,6 +15329,7 @@
           </w:p>
           <w:p>
             <w:r>
+              <w:lastRenderedPageBreak/>
               <w:t>Integration</w:t>
             </w:r>
           </w:p>
@@ -15427,47 +15340,19 @@
           </w:tcPr>
           <w:p>
             <w:r>
-              <w:t xml:space="preserve">Cookies </w:t>
-            </w:r>
-            <w:r>
-              <w:t>UI must be made.</w:t>
-            </w:r>
-          </w:p>
-          <w:p>
-            <w:r>
-              <w:t xml:space="preserve">Tester must </w:t>
-            </w:r>
-            <w:r>
-              <w:t>check</w:t>
-            </w:r>
-            <w:r>
-              <w:t xml:space="preserve"> if </w:t>
-            </w:r>
-            <w:r>
-              <w:t>the cookies show</w:t>
-            </w:r>
-            <w:r>
-              <w:t>/pop</w:t>
-            </w:r>
-            <w:r>
-              <w:t xml:space="preserve"> up when new users enter </w:t>
-            </w:r>
-            <w:r>
-              <w:t>the site</w:t>
-            </w:r>
-            <w:r>
-              <w:t>.</w:t>
-            </w:r>
-          </w:p>
-          <w:p>
-            <w:r>
-              <w:t>No test</w:t>
-            </w:r>
-            <w:r>
-              <w:t xml:space="preserve"> data</w:t>
-            </w:r>
-            <w:r>
-              <w:t xml:space="preserve"> needed.</w:t>
+              <w:lastRenderedPageBreak/>
+              <w:t>Cookies UI must be made.</w:t>
+            </w:r>
+          </w:p>
+          <w:p>
+            <w:r>
+              <w:lastRenderedPageBreak/>
+              <w:t>Tester must check if the cookies show/pop up when new users enter the site.</w:t>
+            </w:r>
+          </w:p>
+          <w:p>
+            <w:r>
+              <w:t>No test data needed.</w:t>
             </w:r>
           </w:p>
         </w:tc>
@@ -15477,7 +15362,12 @@
           <w:tcPr>
             <w:tcW w:w="1271" w:type="dxa"/>
           </w:tcPr>
-          <w:p/>
+          <w:p>
+            <w:r>
+              <w:lastRenderedPageBreak/>
+              <w:t>14/04/26</w:t>
+            </w:r>
+          </w:p>
         </w:tc>
         <w:tc>
           <w:tcPr>
@@ -15526,36 +15416,12 @@
           </w:tcPr>
           <w:p>
             <w:r>
-              <w:t>Cookies must be fully functional</w:t>
-            </w:r>
-            <w:r>
-              <w:t xml:space="preserve"> and must pop</w:t>
-            </w:r>
-            <w:r>
-              <w:t xml:space="preserve"> up using JavaScript.</w:t>
-            </w:r>
-          </w:p>
-          <w:p>
-            <w:r>
-              <w:t>Testers must check</w:t>
-            </w:r>
-            <w:r>
-              <w:t xml:space="preserve"> if the cookies disappear after </w:t>
-            </w:r>
-            <w:r>
-              <w:t xml:space="preserve">either one </w:t>
-            </w:r>
-            <w:r>
-              <w:t xml:space="preserve">of </w:t>
-            </w:r>
-            <w:r>
-              <w:t xml:space="preserve">the </w:t>
-            </w:r>
-            <w:r>
-              <w:t>buttons</w:t>
-            </w:r>
-            <w:r>
-              <w:t xml:space="preserve"> on the cookies is clicked.</w:t>
+              <w:t>Cookies must be fully functional and must pop up using JavaScript.</w:t>
+            </w:r>
+          </w:p>
+          <w:p>
+            <w:r>
+              <w:t>Testers must check if the cookies disappear after either one of the buttons on the cookies is clicked.</w:t>
             </w:r>
           </w:p>
           <w:p>
@@ -15570,7 +15436,11 @@
           <w:tcPr>
             <w:tcW w:w="1271" w:type="dxa"/>
           </w:tcPr>
-          <w:p/>
+          <w:p>
+            <w:r>
+              <w:t>14/04/26</w:t>
+            </w:r>
+          </w:p>
         </w:tc>
         <w:tc>
           <w:tcPr>
@@ -15693,21 +15563,7 @@
                 <w:sz w:val="23"/>
                 <w:szCs w:val="23"/>
               </w:rPr>
-              <w:t xml:space="preserve">Tester must be able to view some of the existing products on the rooms section on the homepage and view more using </w:t>
-            </w:r>
-            <w:r>
-              <w:rPr>
-                <w:sz w:val="23"/>
-                <w:szCs w:val="23"/>
-              </w:rPr>
-              <w:t>the “BROWSE ALL PRODUCE” button</w:t>
-            </w:r>
-            <w:r>
-              <w:rPr>
-                <w:sz w:val="23"/>
-                <w:szCs w:val="23"/>
-              </w:rPr>
-              <w:t xml:space="preserve">. </w:t>
+              <w:t xml:space="preserve">Tester must be able to view some of the existing products on the products section on the homepage and view more using the “BROWSE ALL PRODUCE” button. </w:t>
             </w:r>
           </w:p>
           <w:p>
@@ -15726,7 +15582,11 @@
           <w:tcPr>
             <w:tcW w:w="1271" w:type="dxa"/>
           </w:tcPr>
-          <w:p/>
+          <w:p>
+            <w:r>
+              <w:t>14/04/26</w:t>
+            </w:r>
+          </w:p>
         </w:tc>
         <w:tc>
           <w:tcPr>
@@ -15734,13 +15594,7 @@
           </w:tcPr>
           <w:p>
             <w:r>
-              <w:t>“ADD” button on the products</w:t>
-            </w:r>
-            <w:r>
-              <w:t>’</w:t>
-            </w:r>
-            <w:r>
-              <w:t xml:space="preserve"> section on the home page</w:t>
+              <w:t>“ADD” button on the products’ section on the home page</w:t>
             </w:r>
           </w:p>
         </w:tc>
@@ -15880,10 +15734,7 @@
           </w:p>
           <w:p>
             <w:r>
-              <w:t>Tester must login using a “Customer” role account. Then the tester must click the “ADD” button for any product on the products section and check if that product is added to the basket</w:t>
-            </w:r>
-            <w:r>
-              <w:t xml:space="preserve"> with right amount of quantity.</w:t>
+              <w:t>Tester must login using a “Customer” role account. Then the tester must click the “ADD” button for any product on the products section and check if that product is added to the basket with right amount of quantity.</w:t>
             </w:r>
           </w:p>
           <w:p>
@@ -15898,7 +15749,11 @@
           <w:tcPr>
             <w:tcW w:w="1271" w:type="dxa"/>
           </w:tcPr>
-          <w:p/>
+          <w:p>
+            <w:r>
+              <w:t>17/04/26</w:t>
+            </w:r>
+          </w:p>
         </w:tc>
         <w:tc>
           <w:tcPr>
@@ -16041,24 +15896,27 @@
           </w:p>
           <w:p>
             <w:r>
+              <w:t>Basket controller should be made and fully functional.</w:t>
+            </w:r>
+          </w:p>
+          <w:p>
+            <w:r>
+              <w:t xml:space="preserve">Quantity changing </w:t>
+            </w:r>
+            <w:r>
+              <w:t>functionality should be made.</w:t>
+            </w:r>
+          </w:p>
+          <w:p>
+            <w:r>
+              <w:t>Tester must login using a “Customer” role account. Then</w:t>
+            </w:r>
+            <w:r>
+              <w:t xml:space="preserve"> the tester must use the plus and minus buttons to change </w:t>
+            </w:r>
+            <w:r>
               <w:lastRenderedPageBreak/>
-              <w:t>Basket controller should be made and fully functional.</w:t>
-            </w:r>
-          </w:p>
-          <w:p>
-            <w:r>
-              <w:t xml:space="preserve">Quantity changing </w:t>
-            </w:r>
-            <w:r>
-              <w:t>functionality should be made.</w:t>
-            </w:r>
-          </w:p>
-          <w:p>
-            <w:r>
-              <w:t>Tester must login using a “Customer” role account. Then</w:t>
-            </w:r>
-            <w:r>
-              <w:t xml:space="preserve"> the tester must use the plus and minus buttons to change the quantity to be added to the basket when clicked “ADD”. Afterwards the quantity has changed the tester must add the product with the changed quantity to the basket and check if the correct amount of quantity for the specific product was added to the basket.</w:t>
+              <w:t>the quantity to be added to the basket when clicked “ADD”. Afterwards the quantity has changed the tester must add the product with the changed quantity to the basket and check if the correct amount of quantity for the specific product was added to the basket.</w:t>
             </w:r>
           </w:p>
           <w:p>
@@ -16073,7 +15931,12 @@
           <w:tcPr>
             <w:tcW w:w="1271" w:type="dxa"/>
           </w:tcPr>
-          <w:p/>
+          <w:p>
+            <w:r>
+              <w:lastRenderedPageBreak/>
+              <w:t>17/04/26</w:t>
+            </w:r>
+          </w:p>
         </w:tc>
         <w:tc>
           <w:tcPr>
@@ -16200,16 +16063,7 @@
           </w:p>
           <w:p>
             <w:r>
-              <w:t xml:space="preserve">The tester must click the “BROWSE ALL PRODUCE” button and must check if they are redirected to the </w:t>
-            </w:r>
-            <w:r>
-              <w:t>products’</w:t>
-            </w:r>
-            <w:r>
-              <w:t xml:space="preserve"> page</w:t>
-            </w:r>
-            <w:r>
-              <w:t>.</w:t>
+              <w:t>The tester must click the “BROWSE ALL PRODUCE” button and must check if they are redirected to the products’ page.</w:t>
             </w:r>
           </w:p>
           <w:p>
@@ -16224,7 +16078,11 @@
           <w:tcPr>
             <w:tcW w:w="1271" w:type="dxa"/>
           </w:tcPr>
-          <w:p/>
+          <w:p>
+            <w:r>
+              <w:t>17/04/26</w:t>
+            </w:r>
+          </w:p>
         </w:tc>
         <w:tc>
           <w:tcPr>
@@ -16361,14 +16219,7 @@
                 <w:sz w:val="23"/>
                 <w:szCs w:val="23"/>
               </w:rPr>
-              <w:t>Tester must check if they can view some of the producers that sell their products using the platform. The details of the producers should be shown</w:t>
-            </w:r>
-            <w:r>
-              <w:rPr>
-                <w:sz w:val="23"/>
-                <w:szCs w:val="23"/>
-              </w:rPr>
-              <w:t xml:space="preserve"> using a card and an image of the producer or their farm.</w:t>
+              <w:t>Tester must check if they can view some of the producers that sell their products using the platform. The details of the producers should be shown using a card and an image of the producer or their farm.</w:t>
             </w:r>
           </w:p>
           <w:p>
@@ -16389,7 +16240,11 @@
           <w:tcPr>
             <w:tcW w:w="1271" w:type="dxa"/>
           </w:tcPr>
-          <w:p/>
+          <w:p>
+            <w:r>
+              <w:t>17/04/26</w:t>
+            </w:r>
+          </w:p>
         </w:tc>
         <w:tc>
           <w:tcPr>
@@ -16526,11 +16381,7 @@
               <w:pStyle w:val="Default"/>
             </w:pPr>
             <w:r>
-              <w:t xml:space="preserve">The tester must click the “ALL PRODUCERS” button and must check if </w:t>
-            </w:r>
-            <w:r>
-              <w:lastRenderedPageBreak/>
-              <w:t>they are redirected to the producers’ page.</w:t>
+              <w:t>The tester must click the “ALL PRODUCERS” button and must check if they are redirected to the producers’ page.</w:t>
             </w:r>
           </w:p>
           <w:p>
@@ -16552,7 +16403,11 @@
           <w:tcPr>
             <w:tcW w:w="1271" w:type="dxa"/>
           </w:tcPr>
-          <w:p/>
+          <w:p>
+            <w:r>
+              <w:t>17/04/26</w:t>
+            </w:r>
+          </w:p>
         </w:tc>
         <w:tc>
           <w:tcPr>
@@ -16560,7 +16415,11 @@
           </w:tcPr>
           <w:p>
             <w:r>
-              <w:t xml:space="preserve">“BROWSE ALL PRODUCE” button on the call-to-action section of the homepage </w:t>
+              <w:t>“BROWSE ALL PRODUCE” button on the call-to-</w:t>
+            </w:r>
+            <w:r>
+              <w:lastRenderedPageBreak/>
+              <w:t xml:space="preserve">action section of the homepage </w:t>
             </w:r>
           </w:p>
         </w:tc>
@@ -16581,6 +16440,7 @@
                 <w:sz w:val="23"/>
                 <w:szCs w:val="23"/>
               </w:rPr>
+              <w:lastRenderedPageBreak/>
               <w:t xml:space="preserve">White box </w:t>
             </w:r>
           </w:p>
@@ -16666,7 +16526,20 @@
                 <w:sz w:val="23"/>
                 <w:szCs w:val="23"/>
               </w:rPr>
-              <w:t xml:space="preserve">Products page should be made and be fully functional. </w:t>
+              <w:t>Products page should be made and be fully functional.</w:t>
+            </w:r>
+          </w:p>
+          <w:p>
+            <w:pPr>
+              <w:pStyle w:val="Default"/>
+              <w:rPr>
+                <w:sz w:val="23"/>
+                <w:szCs w:val="23"/>
+              </w:rPr>
+            </w:pPr>
+            <w:r>
+              <w:lastRenderedPageBreak/>
+              <w:t>No test data needed.</w:t>
             </w:r>
           </w:p>
           <w:p>
@@ -16711,7 +16584,12 @@
           <w:tcPr>
             <w:tcW w:w="1271" w:type="dxa"/>
           </w:tcPr>
-          <w:p/>
+          <w:p>
+            <w:r>
+              <w:lastRenderedPageBreak/>
+              <w:t>17/04/26</w:t>
+            </w:r>
+          </w:p>
         </w:tc>
         <w:tc>
           <w:tcPr>
@@ -16836,28 +16714,7 @@
                 <w:sz w:val="23"/>
                 <w:szCs w:val="23"/>
               </w:rPr>
-              <w:t>Product</w:t>
-            </w:r>
-            <w:r>
-              <w:rPr>
-                <w:sz w:val="23"/>
-                <w:szCs w:val="23"/>
-              </w:rPr>
-              <w:t>s</w:t>
-            </w:r>
-            <w:r>
-              <w:rPr>
-                <w:sz w:val="23"/>
-                <w:szCs w:val="23"/>
-              </w:rPr>
-              <w:t>’</w:t>
-            </w:r>
-            <w:r>
-              <w:rPr>
-                <w:sz w:val="23"/>
-                <w:szCs w:val="23"/>
-              </w:rPr>
-              <w:t xml:space="preserve"> page should be made and be fully functional. </w:t>
+              <w:t xml:space="preserve">Products’ page should be made and be fully functional. </w:t>
             </w:r>
           </w:p>
           <w:p>
@@ -16905,63 +16762,7 @@
                 <w:sz w:val="23"/>
                 <w:szCs w:val="23"/>
               </w:rPr>
-              <w:t xml:space="preserve">Tester must go on the </w:t>
-            </w:r>
-            <w:r>
-              <w:rPr>
-                <w:sz w:val="23"/>
-                <w:szCs w:val="23"/>
-              </w:rPr>
-              <w:t>products’</w:t>
-            </w:r>
-            <w:r>
-              <w:rPr>
-                <w:sz w:val="23"/>
-                <w:szCs w:val="23"/>
-              </w:rPr>
-              <w:t xml:space="preserve"> page and change the various fields provided in the filters section. Then wait for the </w:t>
-            </w:r>
-            <w:r>
-              <w:rPr>
-                <w:sz w:val="23"/>
-                <w:szCs w:val="23"/>
-              </w:rPr>
-              <w:t>product</w:t>
-            </w:r>
-            <w:r>
-              <w:rPr>
-                <w:sz w:val="23"/>
-                <w:szCs w:val="23"/>
-              </w:rPr>
-              <w:t xml:space="preserve">s to be changed according to the specific filters applied. Tester must check if the </w:t>
-            </w:r>
-            <w:r>
-              <w:rPr>
-                <w:sz w:val="23"/>
-                <w:szCs w:val="23"/>
-              </w:rPr>
-              <w:t>product</w:t>
-            </w:r>
-            <w:r>
-              <w:rPr>
-                <w:sz w:val="23"/>
-                <w:szCs w:val="23"/>
-              </w:rPr>
-              <w:t xml:space="preserve">s </w:t>
-            </w:r>
-            <w:r>
-              <w:rPr>
-                <w:sz w:val="23"/>
-                <w:szCs w:val="23"/>
-              </w:rPr>
-              <w:t>have been filtered</w:t>
-            </w:r>
-            <w:r>
-              <w:rPr>
-                <w:sz w:val="23"/>
-                <w:szCs w:val="23"/>
-              </w:rPr>
-              <w:t xml:space="preserve"> according to the specific filters applied. </w:t>
+              <w:t xml:space="preserve">Tester must go on the products’ page and change the various fields provided in the filters section. Then wait for the products to be changed according to the specific filters applied. Tester must check if the products have been filtered according to the specific filters applied. </w:t>
             </w:r>
           </w:p>
           <w:p>
@@ -16987,7 +16788,11 @@
           <w:tcPr>
             <w:tcW w:w="1271" w:type="dxa"/>
           </w:tcPr>
-          <w:p/>
+          <w:p>
+            <w:r>
+              <w:t>17/04/26</w:t>
+            </w:r>
+          </w:p>
         </w:tc>
         <w:tc>
           <w:tcPr>
@@ -17006,7 +16811,7 @@
                 <w:sz w:val="23"/>
                 <w:szCs w:val="23"/>
               </w:rPr>
-              <w:t>Search rooms on the rooms page</w:t>
+              <w:t>Search products on the products page</w:t>
             </w:r>
           </w:p>
         </w:tc>
@@ -17112,14 +16917,7 @@
                 <w:sz w:val="23"/>
                 <w:szCs w:val="23"/>
               </w:rPr>
-              <w:t xml:space="preserve">Products’ page </w:t>
-            </w:r>
-            <w:r>
-              <w:rPr>
-                <w:sz w:val="23"/>
-                <w:szCs w:val="23"/>
-              </w:rPr>
-              <w:t xml:space="preserve">should be made and be fully functional. </w:t>
+              <w:t xml:space="preserve">Products’ page should be made and be fully functional. </w:t>
             </w:r>
           </w:p>
           <w:p>
@@ -17167,49 +16965,7 @@
                 <w:sz w:val="23"/>
                 <w:szCs w:val="23"/>
               </w:rPr>
-              <w:t xml:space="preserve">Tester must go on the </w:t>
-            </w:r>
-            <w:r>
-              <w:rPr>
-                <w:sz w:val="23"/>
-                <w:szCs w:val="23"/>
-              </w:rPr>
-              <w:t>products’</w:t>
-            </w:r>
-            <w:r>
-              <w:rPr>
-                <w:sz w:val="23"/>
-                <w:szCs w:val="23"/>
-              </w:rPr>
-              <w:t xml:space="preserve"> page and then use the search bar to search different </w:t>
-            </w:r>
-            <w:r>
-              <w:rPr>
-                <w:sz w:val="23"/>
-                <w:szCs w:val="23"/>
-              </w:rPr>
-              <w:t>products</w:t>
-            </w:r>
-            <w:r>
-              <w:rPr>
-                <w:sz w:val="23"/>
-                <w:szCs w:val="23"/>
-              </w:rPr>
-              <w:t xml:space="preserve"> by their names. Then the tester must check if only the </w:t>
-            </w:r>
-            <w:r>
-              <w:rPr>
-                <w:sz w:val="23"/>
-                <w:szCs w:val="23"/>
-              </w:rPr>
-              <w:t>products</w:t>
-            </w:r>
-            <w:r>
-              <w:rPr>
-                <w:sz w:val="23"/>
-                <w:szCs w:val="23"/>
-              </w:rPr>
-              <w:t xml:space="preserve"> that match the search query roughly are shown.</w:t>
+              <w:t>Tester must go on the products’ page and then use the search bar to search different products by their names. Then the tester must check if only the products that match the search query roughly are shown.</w:t>
             </w:r>
           </w:p>
           <w:p>
@@ -17235,7 +16991,11 @@
           <w:tcPr>
             <w:tcW w:w="1271" w:type="dxa"/>
           </w:tcPr>
-          <w:p/>
+          <w:p>
+            <w:r>
+              <w:t>17/04/26</w:t>
+            </w:r>
+          </w:p>
         </w:tc>
         <w:tc>
           <w:tcPr>
@@ -17344,7 +17104,250 @@
                 <w:sz w:val="23"/>
                 <w:szCs w:val="23"/>
               </w:rPr>
-              <w:t>Products’</w:t>
+              <w:t xml:space="preserve">Products’ page should be made and be fully functional. </w:t>
+            </w:r>
+          </w:p>
+          <w:p>
+            <w:pPr>
+              <w:pStyle w:val="Default"/>
+              <w:rPr>
+                <w:sz w:val="23"/>
+                <w:szCs w:val="23"/>
+              </w:rPr>
+            </w:pPr>
+            <w:r>
+              <w:rPr>
+                <w:sz w:val="23"/>
+                <w:szCs w:val="23"/>
+              </w:rPr>
+              <w:t xml:space="preserve">All models should be made. </w:t>
+            </w:r>
+          </w:p>
+          <w:p>
+            <w:pPr>
+              <w:pStyle w:val="Default"/>
+              <w:rPr>
+                <w:sz w:val="23"/>
+                <w:szCs w:val="23"/>
+              </w:rPr>
+            </w:pPr>
+            <w:r>
+              <w:rPr>
+                <w:sz w:val="23"/>
+                <w:szCs w:val="23"/>
+              </w:rPr>
+              <w:t xml:space="preserve">Migrations and update database must be applied. </w:t>
+            </w:r>
+          </w:p>
+          <w:p>
+            <w:pPr>
+              <w:pStyle w:val="Default"/>
+              <w:rPr>
+                <w:sz w:val="23"/>
+                <w:szCs w:val="23"/>
+              </w:rPr>
+            </w:pPr>
+            <w:r>
+              <w:rPr>
+                <w:sz w:val="23"/>
+                <w:szCs w:val="23"/>
+              </w:rPr>
+              <w:t>Tester must use the pagination buttons to see the other products that have been not shown on the products’ page, to allow for better performance of the website.</w:t>
+            </w:r>
+          </w:p>
+          <w:p>
+            <w:pPr>
+              <w:pStyle w:val="Default"/>
+              <w:rPr>
+                <w:sz w:val="23"/>
+                <w:szCs w:val="23"/>
+              </w:rPr>
+            </w:pPr>
+            <w:r>
+              <w:rPr>
+                <w:sz w:val="23"/>
+                <w:szCs w:val="23"/>
+              </w:rPr>
+              <w:t xml:space="preserve">No test data needed. </w:t>
+            </w:r>
+          </w:p>
+        </w:tc>
+      </w:tr>
+      <w:tr>
+        <w:tc>
+          <w:tcPr>
+            <w:tcW w:w="1271" w:type="dxa"/>
+          </w:tcPr>
+          <w:p>
+            <w:r>
+              <w:lastRenderedPageBreak/>
+              <w:t>17/04/26</w:t>
+            </w:r>
+          </w:p>
+        </w:tc>
+        <w:tc>
+          <w:tcPr>
+            <w:tcW w:w="1985" w:type="dxa"/>
+          </w:tcPr>
+          <w:p>
+            <w:pPr>
+              <w:pStyle w:val="Default"/>
+              <w:rPr>
+                <w:sz w:val="23"/>
+                <w:szCs w:val="23"/>
+              </w:rPr>
+            </w:pPr>
+            <w:r>
+              <w:rPr>
+                <w:sz w:val="23"/>
+                <w:szCs w:val="23"/>
+              </w:rPr>
+              <w:t>Order a product through the order page</w:t>
+            </w:r>
+          </w:p>
+        </w:tc>
+        <w:tc>
+          <w:tcPr>
+            <w:tcW w:w="1701" w:type="dxa"/>
+          </w:tcPr>
+          <w:p>
+            <w:pPr>
+              <w:pStyle w:val="Default"/>
+              <w:rPr>
+                <w:sz w:val="23"/>
+                <w:szCs w:val="23"/>
+              </w:rPr>
+            </w:pPr>
+            <w:r>
+              <w:rPr>
+                <w:sz w:val="23"/>
+                <w:szCs w:val="23"/>
+              </w:rPr>
+              <w:t xml:space="preserve">White box </w:t>
+            </w:r>
+          </w:p>
+          <w:p>
+            <w:pPr>
+              <w:pStyle w:val="Default"/>
+              <w:rPr>
+                <w:sz w:val="23"/>
+                <w:szCs w:val="23"/>
+              </w:rPr>
+            </w:pPr>
+            <w:r>
+              <w:rPr>
+                <w:sz w:val="23"/>
+                <w:szCs w:val="23"/>
+              </w:rPr>
+              <w:t xml:space="preserve">Black box </w:t>
+            </w:r>
+          </w:p>
+          <w:p>
+            <w:pPr>
+              <w:pStyle w:val="Default"/>
+              <w:rPr>
+                <w:sz w:val="23"/>
+                <w:szCs w:val="23"/>
+              </w:rPr>
+            </w:pPr>
+            <w:r>
+              <w:rPr>
+                <w:sz w:val="23"/>
+                <w:szCs w:val="23"/>
+              </w:rPr>
+              <w:t xml:space="preserve">Functionality </w:t>
+            </w:r>
+          </w:p>
+          <w:p>
+            <w:pPr>
+              <w:pStyle w:val="Default"/>
+              <w:rPr>
+                <w:sz w:val="23"/>
+                <w:szCs w:val="23"/>
+              </w:rPr>
+            </w:pPr>
+            <w:r>
+              <w:rPr>
+                <w:sz w:val="23"/>
+                <w:szCs w:val="23"/>
+              </w:rPr>
+              <w:t>Integration</w:t>
+            </w:r>
+          </w:p>
+        </w:tc>
+        <w:tc>
+          <w:tcPr>
+            <w:tcW w:w="4059" w:type="dxa"/>
+          </w:tcPr>
+          <w:p>
+            <w:pPr>
+              <w:pStyle w:val="Default"/>
+              <w:rPr>
+                <w:sz w:val="23"/>
+                <w:szCs w:val="23"/>
+              </w:rPr>
+            </w:pPr>
+            <w:r>
+              <w:rPr>
+                <w:sz w:val="23"/>
+                <w:szCs w:val="23"/>
+              </w:rPr>
+              <w:t xml:space="preserve">Home page should be made and be fully functional. </w:t>
+            </w:r>
+          </w:p>
+          <w:p>
+            <w:pPr>
+              <w:pStyle w:val="Default"/>
+              <w:rPr>
+                <w:sz w:val="23"/>
+                <w:szCs w:val="23"/>
+              </w:rPr>
+            </w:pPr>
+            <w:r>
+              <w:rPr>
+                <w:sz w:val="23"/>
+                <w:szCs w:val="23"/>
+              </w:rPr>
+              <w:t xml:space="preserve">Products’ page should be made and be fully functional. </w:t>
+            </w:r>
+          </w:p>
+          <w:p>
+            <w:pPr>
+              <w:pStyle w:val="Default"/>
+              <w:rPr>
+                <w:sz w:val="23"/>
+                <w:szCs w:val="23"/>
+              </w:rPr>
+            </w:pPr>
+            <w:r>
+              <w:rPr>
+                <w:sz w:val="23"/>
+                <w:szCs w:val="23"/>
+              </w:rPr>
+              <w:t>“My Basket” ’s</w:t>
+            </w:r>
+            <w:r>
+              <w:rPr>
+                <w:sz w:val="23"/>
+                <w:szCs w:val="23"/>
+              </w:rPr>
+              <w:t xml:space="preserve"> page should be made and be fully functional.</w:t>
+            </w:r>
+          </w:p>
+          <w:p>
+            <w:pPr>
+              <w:pStyle w:val="Default"/>
+              <w:rPr>
+                <w:sz w:val="23"/>
+                <w:szCs w:val="23"/>
+              </w:rPr>
+            </w:pPr>
+            <w:r>
+              <w:rPr>
+                <w:sz w:val="23"/>
+                <w:szCs w:val="23"/>
+              </w:rPr>
+              <w:t>Order’s</w:t>
             </w:r>
             <w:r>
               <w:rPr>
@@ -17399,38 +17402,346 @@
                 <w:sz w:val="23"/>
                 <w:szCs w:val="23"/>
               </w:rPr>
+              <w:t xml:space="preserve">The tester must add certain products to their basket and proceed to the checkout using the “CHECKOUT” button. From there the tester must </w:t>
+            </w:r>
+            <w:r>
+              <w:rPr>
+                <w:sz w:val="23"/>
+                <w:szCs w:val="23"/>
+              </w:rPr>
+              <w:t>click “PROCEED TO ORDER” button from the “My Basket” page. When they are on the “Order” page they must check they can see the correct products and prices on the order section. Then the tester should also use some test to check if valid data is accepted and invalid data gives appropriate error messages.</w:t>
+            </w:r>
+          </w:p>
+          <w:p>
+            <w:pPr>
+              <w:pStyle w:val="Default"/>
+              <w:rPr>
+                <w:sz w:val="23"/>
+                <w:szCs w:val="23"/>
+              </w:rPr>
+            </w:pPr>
+          </w:p>
+          <w:p>
+            <w:pPr>
+              <w:rPr>
+                <w:b/>
+                <w:bCs/>
+              </w:rPr>
+            </w:pPr>
+            <w:r>
+              <w:rPr>
+                <w:b/>
+                <w:bCs/>
+              </w:rPr>
+              <w:t>Test Data:</w:t>
+            </w:r>
+          </w:p>
+          <w:p>
+            <w:pPr>
+              <w:rPr>
+                <w:b/>
+                <w:bCs/>
+              </w:rPr>
+            </w:pPr>
+            <w:r>
+              <w:rPr>
+                <w:b/>
+                <w:bCs/>
+              </w:rPr>
+              <w:t>Normal</w:t>
+            </w:r>
+          </w:p>
+          <w:p>
+            <w:r>
+              <w:t xml:space="preserve">Products in basket: </w:t>
+            </w:r>
+            <w:r>
+              <w:t>2</w:t>
+            </w:r>
+            <w:r>
+              <w:t xml:space="preserve"> “Watermelon Slice (100g)” for £0.89 and </w:t>
+            </w:r>
+            <w:r>
+              <w:t>2</w:t>
+            </w:r>
+            <w:r>
+              <w:t xml:space="preserve"> “</w:t>
+            </w:r>
+            <w:r>
+              <w:t>Apple bag (100g)</w:t>
+            </w:r>
+            <w:r>
+              <w:t>”</w:t>
+            </w:r>
+            <w:r>
+              <w:t xml:space="preserve"> for £1.59</w:t>
+            </w:r>
+          </w:p>
+          <w:p>
+            <w:r>
+              <w:t>Order Type: Collection</w:t>
+            </w:r>
+          </w:p>
+          <w:p>
+            <w:r>
+              <w:t>Collection Date: 09/05/2026</w:t>
+            </w:r>
+          </w:p>
+          <w:p>
+            <w:r>
+              <w:t>Discount Code: SUMMER10!</w:t>
+            </w:r>
+          </w:p>
+          <w:p>
+            <w:r>
+              <w:t>Address: 1 Spon Lane</w:t>
+            </w:r>
+          </w:p>
+          <w:p>
+            <w:r>
+              <w:t>City: Birmingham</w:t>
+            </w:r>
+          </w:p>
+          <w:p>
+            <w:r>
+              <w:t>Postcode: B70 6AW</w:t>
+            </w:r>
+          </w:p>
+          <w:p>
+            <w:pPr>
+              <w:rPr>
+                <w:b/>
+                <w:bCs/>
+              </w:rPr>
+            </w:pPr>
+            <w:r>
+              <w:rPr>
+                <w:b/>
+                <w:bCs/>
+              </w:rPr>
+              <w:t>Erroneous</w:t>
+            </w:r>
+          </w:p>
+          <w:p>
+            <w:r>
+              <w:t xml:space="preserve">Order Type: </w:t>
+            </w:r>
+            <w:r>
+              <w:t>Empty</w:t>
+            </w:r>
+          </w:p>
+          <w:p>
+            <w:r>
+              <w:t xml:space="preserve">Collection Date: </w:t>
+            </w:r>
+            <w:r>
+              <w:t>??/--/!!</w:t>
+            </w:r>
+          </w:p>
+          <w:p>
+            <w:r>
+              <w:t>Address: 1</w:t>
+            </w:r>
+            <w:r>
+              <w:t>23</w:t>
+            </w:r>
+            <w:r>
+              <w:t xml:space="preserve"> </w:t>
+            </w:r>
+            <w:r>
+              <w:t>Example</w:t>
+            </w:r>
+            <w:r>
+              <w:t xml:space="preserve"> </w:t>
+            </w:r>
+            <w:r>
+              <w:t>Road</w:t>
+            </w:r>
+          </w:p>
+          <w:p>
+            <w:r>
+              <w:t xml:space="preserve">City: </w:t>
+            </w:r>
+            <w:r>
+              <w:t>Fake City</w:t>
+            </w:r>
+          </w:p>
+          <w:p>
+            <w:r>
+              <w:t xml:space="preserve">Postcode: </w:t>
+            </w:r>
+            <w:r>
+              <w:t>BBB 321</w:t>
+            </w:r>
+          </w:p>
+          <w:p>
+            <w:pPr>
+              <w:rPr>
+                <w:b/>
+                <w:bCs/>
+              </w:rPr>
+            </w:pPr>
+            <w:r>
+              <w:rPr>
+                <w:b/>
+                <w:bCs/>
+              </w:rPr>
+              <w:t>Extreme</w:t>
+            </w:r>
+          </w:p>
+          <w:p>
+            <w:r>
+              <w:t xml:space="preserve">Products in basket: </w:t>
+            </w:r>
+            <w:r>
+              <w:t>-4000</w:t>
+            </w:r>
+            <w:r>
+              <w:t xml:space="preserve"> “Watermelon Slice (100g)” for £0.89 and </w:t>
+            </w:r>
+            <w:r>
+              <w:t>-4000</w:t>
+            </w:r>
+            <w:r>
+              <w:t xml:space="preserve"> “Apple bag (100g)” for £1.59</w:t>
+            </w:r>
+          </w:p>
+        </w:tc>
+      </w:tr>
+      <w:tr>
+        <w:tc>
+          <w:tcPr>
+            <w:tcW w:w="1271" w:type="dxa"/>
+          </w:tcPr>
+          <w:p>
+            <w:r>
+              <w:t>17/04/26</w:t>
+            </w:r>
+          </w:p>
+        </w:tc>
+        <w:tc>
+          <w:tcPr>
+            <w:tcW w:w="1985" w:type="dxa"/>
+          </w:tcPr>
+          <w:p>
+            <w:pPr>
+              <w:pStyle w:val="Default"/>
+              <w:rPr>
+                <w:sz w:val="23"/>
+                <w:szCs w:val="23"/>
+              </w:rPr>
+            </w:pPr>
+            <w:r>
+              <w:rPr>
+                <w:sz w:val="23"/>
+                <w:szCs w:val="23"/>
+              </w:rPr>
+              <w:t>Product details on</w:t>
+            </w:r>
+            <w:r>
+              <w:rPr>
+                <w:sz w:val="23"/>
+                <w:szCs w:val="23"/>
+              </w:rPr>
+              <w:t xml:space="preserve"> </w:t>
+            </w:r>
+            <w:r>
+              <w:rPr>
+                <w:sz w:val="23"/>
+                <w:szCs w:val="23"/>
+              </w:rPr>
+              <w:t>the “Product</w:t>
+            </w:r>
+            <w:r>
+              <w:rPr>
+                <w:sz w:val="23"/>
+                <w:szCs w:val="23"/>
+              </w:rPr>
+              <w:t>”</w:t>
+            </w:r>
+            <w:r>
+              <w:rPr>
+                <w:sz w:val="23"/>
+                <w:szCs w:val="23"/>
+              </w:rPr>
+              <w:t xml:space="preserve"> page</w:t>
+            </w:r>
+          </w:p>
+        </w:tc>
+        <w:tc>
+          <w:tcPr>
+            <w:tcW w:w="1701" w:type="dxa"/>
+          </w:tcPr>
+          <w:p>
+            <w:pPr>
+              <w:pStyle w:val="Default"/>
+              <w:rPr>
+                <w:sz w:val="23"/>
+                <w:szCs w:val="23"/>
+              </w:rPr>
+            </w:pPr>
+            <w:r>
+              <w:rPr>
+                <w:sz w:val="23"/>
+                <w:szCs w:val="23"/>
+              </w:rPr>
+              <w:t xml:space="preserve">White box </w:t>
+            </w:r>
+          </w:p>
+          <w:p>
+            <w:pPr>
+              <w:pStyle w:val="Default"/>
+              <w:rPr>
+                <w:sz w:val="23"/>
+                <w:szCs w:val="23"/>
+              </w:rPr>
+            </w:pPr>
+            <w:r>
+              <w:rPr>
+                <w:sz w:val="23"/>
+                <w:szCs w:val="23"/>
+              </w:rPr>
+              <w:t xml:space="preserve">Black box </w:t>
+            </w:r>
+          </w:p>
+          <w:p>
+            <w:pPr>
+              <w:pStyle w:val="Default"/>
+              <w:rPr>
+                <w:sz w:val="23"/>
+                <w:szCs w:val="23"/>
+              </w:rPr>
+            </w:pPr>
+            <w:r>
+              <w:rPr>
+                <w:sz w:val="23"/>
+                <w:szCs w:val="23"/>
+              </w:rPr>
+              <w:t xml:space="preserve">Functionality </w:t>
+            </w:r>
+          </w:p>
+          <w:p>
+            <w:pPr>
+              <w:pStyle w:val="Default"/>
+              <w:rPr>
+                <w:sz w:val="23"/>
+                <w:szCs w:val="23"/>
+              </w:rPr>
+            </w:pPr>
+            <w:r>
+              <w:rPr>
+                <w:sz w:val="23"/>
+                <w:szCs w:val="23"/>
+              </w:rPr>
               <w:lastRenderedPageBreak/>
-              <w:t xml:space="preserve">Tester must use the pagination buttons to see the other </w:t>
-            </w:r>
-            <w:r>
-              <w:rPr>
-                <w:sz w:val="23"/>
-                <w:szCs w:val="23"/>
-              </w:rPr>
-              <w:t>product</w:t>
-            </w:r>
-            <w:r>
-              <w:rPr>
-                <w:sz w:val="23"/>
-                <w:szCs w:val="23"/>
-              </w:rPr>
-              <w:t xml:space="preserve">s that have been not shown on the </w:t>
-            </w:r>
-            <w:r>
-              <w:rPr>
-                <w:sz w:val="23"/>
-                <w:szCs w:val="23"/>
-              </w:rPr>
-              <w:t>products’</w:t>
-            </w:r>
-            <w:r>
-              <w:rPr>
-                <w:sz w:val="23"/>
-                <w:szCs w:val="23"/>
-              </w:rPr>
-              <w:t xml:space="preserve"> page, to allow for better performance of the website.</w:t>
-            </w:r>
-          </w:p>
+              <w:t>Integration</w:t>
+            </w:r>
+          </w:p>
+        </w:tc>
+        <w:tc>
+          <w:tcPr>
+            <w:tcW w:w="4059" w:type="dxa"/>
+          </w:tcPr>
           <w:p>
             <w:pPr>
               <w:pStyle w:val="Default"/>
@@ -17444,7 +17755,1308 @@
                 <w:sz w:val="23"/>
                 <w:szCs w:val="23"/>
               </w:rPr>
-              <w:t xml:space="preserve">No test data needed. </w:t>
+              <w:lastRenderedPageBreak/>
+              <w:t xml:space="preserve">Home page should be made and be fully functional. </w:t>
+            </w:r>
+          </w:p>
+          <w:p>
+            <w:pPr>
+              <w:pStyle w:val="Default"/>
+              <w:rPr>
+                <w:sz w:val="23"/>
+                <w:szCs w:val="23"/>
+              </w:rPr>
+            </w:pPr>
+            <w:r>
+              <w:rPr>
+                <w:sz w:val="23"/>
+                <w:szCs w:val="23"/>
+              </w:rPr>
+              <w:lastRenderedPageBreak/>
+              <w:t xml:space="preserve">Products’ page should be made and be fully functional. </w:t>
+            </w:r>
+          </w:p>
+          <w:p>
+            <w:pPr>
+              <w:pStyle w:val="Default"/>
+              <w:rPr>
+                <w:sz w:val="23"/>
+                <w:szCs w:val="23"/>
+              </w:rPr>
+            </w:pPr>
+            <w:r>
+              <w:rPr>
+                <w:sz w:val="23"/>
+                <w:szCs w:val="23"/>
+              </w:rPr>
+              <w:t xml:space="preserve">“Product” page </w:t>
+            </w:r>
+            <w:r>
+              <w:rPr>
+                <w:sz w:val="23"/>
+                <w:szCs w:val="23"/>
+              </w:rPr>
+              <w:t>should be made and be fully functional.</w:t>
+            </w:r>
+          </w:p>
+          <w:p>
+            <w:pPr>
+              <w:pStyle w:val="Default"/>
+              <w:rPr>
+                <w:sz w:val="23"/>
+                <w:szCs w:val="23"/>
+              </w:rPr>
+            </w:pPr>
+            <w:r>
+              <w:rPr>
+                <w:sz w:val="23"/>
+                <w:szCs w:val="23"/>
+              </w:rPr>
+              <w:t xml:space="preserve">All models should be made. </w:t>
+            </w:r>
+          </w:p>
+          <w:p>
+            <w:pPr>
+              <w:pStyle w:val="Default"/>
+              <w:rPr>
+                <w:sz w:val="23"/>
+                <w:szCs w:val="23"/>
+              </w:rPr>
+            </w:pPr>
+            <w:r>
+              <w:rPr>
+                <w:sz w:val="23"/>
+                <w:szCs w:val="23"/>
+              </w:rPr>
+              <w:t>Migrations and update database must be applied.</w:t>
+            </w:r>
+          </w:p>
+          <w:p>
+            <w:pPr>
+              <w:pStyle w:val="Default"/>
+              <w:rPr>
+                <w:sz w:val="23"/>
+                <w:szCs w:val="23"/>
+              </w:rPr>
+            </w:pPr>
+            <w:r>
+              <w:rPr>
+                <w:sz w:val="23"/>
+                <w:szCs w:val="23"/>
+              </w:rPr>
+              <w:t>Tester must go to the products page through the “Products” button or “BROWSE ALL PRODUCE” button. Then they must click on one of product cards and be redirected to the “Product” page for the specific product. There the tester must check if the correct details of the product are being shown in the correct places or sections.</w:t>
+            </w:r>
+          </w:p>
+          <w:p>
+            <w:pPr>
+              <w:pStyle w:val="Default"/>
+              <w:rPr>
+                <w:sz w:val="23"/>
+                <w:szCs w:val="23"/>
+              </w:rPr>
+            </w:pPr>
+            <w:r>
+              <w:t>No test data needed.</w:t>
+            </w:r>
+          </w:p>
+        </w:tc>
+      </w:tr>
+      <w:tr>
+        <w:tc>
+          <w:tcPr>
+            <w:tcW w:w="1271" w:type="dxa"/>
+          </w:tcPr>
+          <w:p>
+            <w:r>
+              <w:lastRenderedPageBreak/>
+              <w:t>17/04/26</w:t>
+            </w:r>
+          </w:p>
+        </w:tc>
+        <w:tc>
+          <w:tcPr>
+            <w:tcW w:w="1985" w:type="dxa"/>
+          </w:tcPr>
+          <w:p>
+            <w:pPr>
+              <w:pStyle w:val="Default"/>
+              <w:rPr>
+                <w:sz w:val="23"/>
+                <w:szCs w:val="23"/>
+              </w:rPr>
+            </w:pPr>
+            <w:r>
+              <w:rPr>
+                <w:sz w:val="23"/>
+                <w:szCs w:val="23"/>
+              </w:rPr>
+              <w:t xml:space="preserve">Producers’ details on </w:t>
+            </w:r>
+            <w:r>
+              <w:rPr>
+                <w:sz w:val="23"/>
+                <w:szCs w:val="23"/>
+              </w:rPr>
+              <w:t xml:space="preserve">the </w:t>
+            </w:r>
+            <w:r>
+              <w:rPr>
+                <w:sz w:val="23"/>
+                <w:szCs w:val="23"/>
+              </w:rPr>
+              <w:t>“Our Producer</w:t>
+            </w:r>
+            <w:r>
+              <w:rPr>
+                <w:sz w:val="23"/>
+                <w:szCs w:val="23"/>
+              </w:rPr>
+              <w:t>s</w:t>
+            </w:r>
+            <w:r>
+              <w:rPr>
+                <w:sz w:val="23"/>
+                <w:szCs w:val="23"/>
+              </w:rPr>
+              <w:t>” page</w:t>
+            </w:r>
+          </w:p>
+        </w:tc>
+        <w:tc>
+          <w:tcPr>
+            <w:tcW w:w="1701" w:type="dxa"/>
+          </w:tcPr>
+          <w:p>
+            <w:pPr>
+              <w:pStyle w:val="Default"/>
+              <w:rPr>
+                <w:sz w:val="23"/>
+                <w:szCs w:val="23"/>
+              </w:rPr>
+            </w:pPr>
+            <w:r>
+              <w:rPr>
+                <w:sz w:val="23"/>
+                <w:szCs w:val="23"/>
+              </w:rPr>
+              <w:t xml:space="preserve">White box </w:t>
+            </w:r>
+          </w:p>
+          <w:p>
+            <w:pPr>
+              <w:pStyle w:val="Default"/>
+              <w:rPr>
+                <w:sz w:val="23"/>
+                <w:szCs w:val="23"/>
+              </w:rPr>
+            </w:pPr>
+            <w:r>
+              <w:rPr>
+                <w:sz w:val="23"/>
+                <w:szCs w:val="23"/>
+              </w:rPr>
+              <w:t xml:space="preserve">Black box </w:t>
+            </w:r>
+          </w:p>
+          <w:p>
+            <w:pPr>
+              <w:pStyle w:val="Default"/>
+              <w:rPr>
+                <w:sz w:val="23"/>
+                <w:szCs w:val="23"/>
+              </w:rPr>
+            </w:pPr>
+            <w:r>
+              <w:rPr>
+                <w:sz w:val="23"/>
+                <w:szCs w:val="23"/>
+              </w:rPr>
+              <w:t xml:space="preserve">Functionality </w:t>
+            </w:r>
+          </w:p>
+          <w:p>
+            <w:pPr>
+              <w:pStyle w:val="Default"/>
+              <w:rPr>
+                <w:sz w:val="23"/>
+                <w:szCs w:val="23"/>
+              </w:rPr>
+            </w:pPr>
+            <w:r>
+              <w:rPr>
+                <w:sz w:val="23"/>
+                <w:szCs w:val="23"/>
+              </w:rPr>
+              <w:t>Integration</w:t>
+            </w:r>
+          </w:p>
+        </w:tc>
+        <w:tc>
+          <w:tcPr>
+            <w:tcW w:w="4059" w:type="dxa"/>
+          </w:tcPr>
+          <w:p>
+            <w:pPr>
+              <w:pStyle w:val="Default"/>
+              <w:rPr>
+                <w:sz w:val="23"/>
+                <w:szCs w:val="23"/>
+              </w:rPr>
+            </w:pPr>
+            <w:r>
+              <w:rPr>
+                <w:sz w:val="23"/>
+                <w:szCs w:val="23"/>
+              </w:rPr>
+              <w:t xml:space="preserve">Home page should be made and be fully functional. </w:t>
+            </w:r>
+          </w:p>
+          <w:p>
+            <w:pPr>
+              <w:pStyle w:val="Default"/>
+              <w:rPr>
+                <w:sz w:val="23"/>
+                <w:szCs w:val="23"/>
+              </w:rPr>
+            </w:pPr>
+            <w:r>
+              <w:rPr>
+                <w:sz w:val="23"/>
+                <w:szCs w:val="23"/>
+              </w:rPr>
+              <w:t>Producers’ page should be made and be fully functional.</w:t>
+            </w:r>
+          </w:p>
+          <w:p>
+            <w:pPr>
+              <w:pStyle w:val="Default"/>
+              <w:rPr>
+                <w:sz w:val="23"/>
+                <w:szCs w:val="23"/>
+              </w:rPr>
+            </w:pPr>
+            <w:r>
+              <w:rPr>
+                <w:sz w:val="23"/>
+                <w:szCs w:val="23"/>
+              </w:rPr>
+              <w:t xml:space="preserve">All models should be made. </w:t>
+            </w:r>
+          </w:p>
+          <w:p>
+            <w:pPr>
+              <w:rPr>
+                <w:sz w:val="23"/>
+                <w:szCs w:val="23"/>
+              </w:rPr>
+            </w:pPr>
+            <w:r>
+              <w:rPr>
+                <w:sz w:val="23"/>
+                <w:szCs w:val="23"/>
+              </w:rPr>
+              <w:t>Migrations and update database must be applied.</w:t>
+            </w:r>
+          </w:p>
+          <w:p>
+            <w:pPr>
+              <w:rPr>
+                <w:sz w:val="23"/>
+                <w:szCs w:val="23"/>
+              </w:rPr>
+            </w:pPr>
+            <w:r>
+              <w:rPr>
+                <w:sz w:val="23"/>
+                <w:szCs w:val="23"/>
+              </w:rPr>
+              <w:t>The tester must navigate to the “Our producers” page using</w:t>
+            </w:r>
+            <w:r>
+              <w:rPr>
+                <w:sz w:val="23"/>
+                <w:szCs w:val="23"/>
+              </w:rPr>
+              <w:t xml:space="preserve"> the “Our Producers” link on the navigation bar. When the tester is on the “Our Producers” page they must check if all </w:t>
+            </w:r>
+            <w:r>
+              <w:rPr>
+                <w:sz w:val="23"/>
+                <w:szCs w:val="23"/>
+              </w:rPr>
+              <w:t>producers’</w:t>
+            </w:r>
+            <w:r>
+              <w:rPr>
+                <w:sz w:val="23"/>
+                <w:szCs w:val="23"/>
+              </w:rPr>
+              <w:t xml:space="preserve"> details are being shown and if the details are correct compared to the details stored in the database.</w:t>
+            </w:r>
+          </w:p>
+          <w:p>
+            <w:pPr>
+              <w:pStyle w:val="Default"/>
+              <w:rPr>
+                <w:sz w:val="23"/>
+                <w:szCs w:val="23"/>
+              </w:rPr>
+            </w:pPr>
+            <w:r>
+              <w:t>No test data needed.</w:t>
+            </w:r>
+          </w:p>
+        </w:tc>
+      </w:tr>
+      <w:tr>
+        <w:tc>
+          <w:tcPr>
+            <w:tcW w:w="1271" w:type="dxa"/>
+          </w:tcPr>
+          <w:p>
+            <w:r>
+              <w:t>17/04/26</w:t>
+            </w:r>
+          </w:p>
+        </w:tc>
+        <w:tc>
+          <w:tcPr>
+            <w:tcW w:w="1985" w:type="dxa"/>
+          </w:tcPr>
+          <w:p>
+            <w:pPr>
+              <w:pStyle w:val="Default"/>
+              <w:rPr>
+                <w:sz w:val="23"/>
+                <w:szCs w:val="23"/>
+              </w:rPr>
+            </w:pPr>
+            <w:r>
+              <w:rPr>
+                <w:sz w:val="23"/>
+                <w:szCs w:val="23"/>
+              </w:rPr>
+              <w:t xml:space="preserve">Products’ link on the </w:t>
+            </w:r>
+            <w:r>
+              <w:rPr>
+                <w:sz w:val="23"/>
+                <w:szCs w:val="23"/>
+              </w:rPr>
+              <w:t>“Our Producers” page</w:t>
+            </w:r>
+          </w:p>
+        </w:tc>
+        <w:tc>
+          <w:tcPr>
+            <w:tcW w:w="1701" w:type="dxa"/>
+          </w:tcPr>
+          <w:p>
+            <w:pPr>
+              <w:pStyle w:val="Default"/>
+              <w:rPr>
+                <w:sz w:val="23"/>
+                <w:szCs w:val="23"/>
+              </w:rPr>
+            </w:pPr>
+            <w:r>
+              <w:rPr>
+                <w:sz w:val="23"/>
+                <w:szCs w:val="23"/>
+              </w:rPr>
+              <w:t xml:space="preserve">White box </w:t>
+            </w:r>
+          </w:p>
+          <w:p>
+            <w:pPr>
+              <w:pStyle w:val="Default"/>
+              <w:rPr>
+                <w:sz w:val="23"/>
+                <w:szCs w:val="23"/>
+              </w:rPr>
+            </w:pPr>
+            <w:r>
+              <w:rPr>
+                <w:sz w:val="23"/>
+                <w:szCs w:val="23"/>
+              </w:rPr>
+              <w:t xml:space="preserve">Black box </w:t>
+            </w:r>
+          </w:p>
+          <w:p>
+            <w:pPr>
+              <w:pStyle w:val="Default"/>
+              <w:rPr>
+                <w:sz w:val="23"/>
+                <w:szCs w:val="23"/>
+              </w:rPr>
+            </w:pPr>
+            <w:r>
+              <w:rPr>
+                <w:sz w:val="23"/>
+                <w:szCs w:val="23"/>
+              </w:rPr>
+              <w:t xml:space="preserve">Functionality </w:t>
+            </w:r>
+          </w:p>
+          <w:p>
+            <w:pPr>
+              <w:pStyle w:val="Default"/>
+              <w:rPr>
+                <w:sz w:val="23"/>
+                <w:szCs w:val="23"/>
+              </w:rPr>
+            </w:pPr>
+            <w:r>
+              <w:rPr>
+                <w:sz w:val="23"/>
+                <w:szCs w:val="23"/>
+              </w:rPr>
+              <w:t>Integration</w:t>
+            </w:r>
+          </w:p>
+        </w:tc>
+        <w:tc>
+          <w:tcPr>
+            <w:tcW w:w="4059" w:type="dxa"/>
+          </w:tcPr>
+          <w:p>
+            <w:pPr>
+              <w:pStyle w:val="Default"/>
+              <w:rPr>
+                <w:sz w:val="23"/>
+                <w:szCs w:val="23"/>
+              </w:rPr>
+            </w:pPr>
+            <w:r>
+              <w:rPr>
+                <w:sz w:val="23"/>
+                <w:szCs w:val="23"/>
+              </w:rPr>
+              <w:t xml:space="preserve">Home page should be made and be fully functional. </w:t>
+            </w:r>
+          </w:p>
+          <w:p>
+            <w:pPr>
+              <w:pStyle w:val="Default"/>
+              <w:rPr>
+                <w:sz w:val="23"/>
+                <w:szCs w:val="23"/>
+              </w:rPr>
+            </w:pPr>
+            <w:r>
+              <w:rPr>
+                <w:sz w:val="23"/>
+                <w:szCs w:val="23"/>
+              </w:rPr>
+              <w:t>Producers’ page should be made and be fully functional.</w:t>
+            </w:r>
+          </w:p>
+          <w:p>
+            <w:pPr>
+              <w:pStyle w:val="Default"/>
+              <w:rPr>
+                <w:sz w:val="23"/>
+                <w:szCs w:val="23"/>
+              </w:rPr>
+            </w:pPr>
+            <w:r>
+              <w:rPr>
+                <w:sz w:val="23"/>
+                <w:szCs w:val="23"/>
+              </w:rPr>
+              <w:t xml:space="preserve">All models should be made. </w:t>
+            </w:r>
+          </w:p>
+          <w:p>
+            <w:pPr>
+              <w:rPr>
+                <w:sz w:val="23"/>
+                <w:szCs w:val="23"/>
+              </w:rPr>
+            </w:pPr>
+            <w:r>
+              <w:rPr>
+                <w:sz w:val="23"/>
+                <w:szCs w:val="23"/>
+              </w:rPr>
+              <w:t>Migrations and update database must be applied.</w:t>
+            </w:r>
+          </w:p>
+          <w:p>
+            <w:pPr>
+              <w:rPr>
+                <w:sz w:val="23"/>
+                <w:szCs w:val="23"/>
+              </w:rPr>
+            </w:pPr>
+            <w:r>
+              <w:rPr>
+                <w:sz w:val="23"/>
+                <w:szCs w:val="23"/>
+              </w:rPr>
+              <w:t>The tester must navigate to the “Our producers” page using the “Our Producers” link on the navigation bar.</w:t>
+            </w:r>
+            <w:r>
+              <w:rPr>
+                <w:sz w:val="23"/>
+                <w:szCs w:val="23"/>
+              </w:rPr>
+              <w:t xml:space="preserve"> </w:t>
+            </w:r>
+            <w:r>
+              <w:rPr>
+                <w:sz w:val="23"/>
+                <w:szCs w:val="23"/>
+              </w:rPr>
+              <w:t>When the tester is on the “Our Producers” page they must check if</w:t>
+            </w:r>
+            <w:r>
+              <w:rPr>
+                <w:sz w:val="23"/>
+                <w:szCs w:val="23"/>
+              </w:rPr>
+              <w:t xml:space="preserve"> they can click links to the view the </w:t>
+            </w:r>
+            <w:r>
+              <w:rPr>
+                <w:sz w:val="23"/>
+                <w:szCs w:val="23"/>
+              </w:rPr>
+              <w:t>producers’</w:t>
+            </w:r>
+            <w:r>
+              <w:rPr>
+                <w:sz w:val="23"/>
+                <w:szCs w:val="23"/>
+              </w:rPr>
+              <w:t xml:space="preserve"> products on the “Products” Page.</w:t>
+            </w:r>
+          </w:p>
+          <w:p>
+            <w:pPr>
+              <w:pStyle w:val="Default"/>
+              <w:rPr>
+                <w:sz w:val="23"/>
+                <w:szCs w:val="23"/>
+              </w:rPr>
+            </w:pPr>
+            <w:r>
+              <w:t>No test data needed.</w:t>
+            </w:r>
+          </w:p>
+        </w:tc>
+      </w:tr>
+      <w:tr>
+        <w:tc>
+          <w:tcPr>
+            <w:tcW w:w="1271" w:type="dxa"/>
+          </w:tcPr>
+          <w:p>
+            <w:r>
+              <w:lastRenderedPageBreak/>
+              <w:t>17/04/26</w:t>
+            </w:r>
+          </w:p>
+        </w:tc>
+        <w:tc>
+          <w:tcPr>
+            <w:tcW w:w="1985" w:type="dxa"/>
+          </w:tcPr>
+          <w:p>
+            <w:pPr>
+              <w:pStyle w:val="Default"/>
+              <w:rPr>
+                <w:sz w:val="23"/>
+                <w:szCs w:val="23"/>
+              </w:rPr>
+            </w:pPr>
+            <w:r>
+              <w:rPr>
+                <w:sz w:val="23"/>
+                <w:szCs w:val="23"/>
+              </w:rPr>
+              <w:t>Order details on the “My Orders” page</w:t>
+            </w:r>
+          </w:p>
+        </w:tc>
+        <w:tc>
+          <w:tcPr>
+            <w:tcW w:w="1701" w:type="dxa"/>
+          </w:tcPr>
+          <w:p>
+            <w:pPr>
+              <w:pStyle w:val="Default"/>
+              <w:rPr>
+                <w:sz w:val="23"/>
+                <w:szCs w:val="23"/>
+              </w:rPr>
+            </w:pPr>
+            <w:r>
+              <w:rPr>
+                <w:sz w:val="23"/>
+                <w:szCs w:val="23"/>
+              </w:rPr>
+              <w:t xml:space="preserve">White box </w:t>
+            </w:r>
+          </w:p>
+          <w:p>
+            <w:pPr>
+              <w:pStyle w:val="Default"/>
+              <w:rPr>
+                <w:sz w:val="23"/>
+                <w:szCs w:val="23"/>
+              </w:rPr>
+            </w:pPr>
+            <w:r>
+              <w:rPr>
+                <w:sz w:val="23"/>
+                <w:szCs w:val="23"/>
+              </w:rPr>
+              <w:t xml:space="preserve">Black box </w:t>
+            </w:r>
+          </w:p>
+          <w:p>
+            <w:pPr>
+              <w:pStyle w:val="Default"/>
+              <w:rPr>
+                <w:sz w:val="23"/>
+                <w:szCs w:val="23"/>
+              </w:rPr>
+            </w:pPr>
+            <w:r>
+              <w:rPr>
+                <w:sz w:val="23"/>
+                <w:szCs w:val="23"/>
+              </w:rPr>
+              <w:t xml:space="preserve">Functionality </w:t>
+            </w:r>
+          </w:p>
+          <w:p>
+            <w:pPr>
+              <w:pStyle w:val="Default"/>
+              <w:rPr>
+                <w:sz w:val="23"/>
+                <w:szCs w:val="23"/>
+              </w:rPr>
+            </w:pPr>
+            <w:r>
+              <w:rPr>
+                <w:sz w:val="23"/>
+                <w:szCs w:val="23"/>
+              </w:rPr>
+              <w:t>Integration</w:t>
+            </w:r>
+          </w:p>
+        </w:tc>
+        <w:tc>
+          <w:tcPr>
+            <w:tcW w:w="4059" w:type="dxa"/>
+          </w:tcPr>
+          <w:p>
+            <w:pPr>
+              <w:pStyle w:val="Default"/>
+              <w:rPr>
+                <w:sz w:val="23"/>
+                <w:szCs w:val="23"/>
+              </w:rPr>
+            </w:pPr>
+            <w:r>
+              <w:rPr>
+                <w:sz w:val="23"/>
+                <w:szCs w:val="23"/>
+              </w:rPr>
+              <w:t xml:space="preserve">Home page should be made and be fully functional. </w:t>
+            </w:r>
+          </w:p>
+          <w:p>
+            <w:pPr>
+              <w:pStyle w:val="Default"/>
+              <w:rPr>
+                <w:sz w:val="23"/>
+                <w:szCs w:val="23"/>
+              </w:rPr>
+            </w:pPr>
+            <w:r>
+              <w:rPr>
+                <w:sz w:val="23"/>
+                <w:szCs w:val="23"/>
+              </w:rPr>
+              <w:t>“My Orders”</w:t>
+            </w:r>
+            <w:r>
+              <w:rPr>
+                <w:sz w:val="23"/>
+                <w:szCs w:val="23"/>
+              </w:rPr>
+              <w:t xml:space="preserve"> </w:t>
+            </w:r>
+            <w:r>
+              <w:rPr>
+                <w:sz w:val="23"/>
+                <w:szCs w:val="23"/>
+              </w:rPr>
+              <w:t>page should be made and be fully functional.</w:t>
+            </w:r>
+          </w:p>
+          <w:p>
+            <w:r>
+              <w:t>Basket controller should be made and fully functional.</w:t>
+            </w:r>
+          </w:p>
+          <w:p>
+            <w:r>
+              <w:t>The tester must order some products and check their order through navigating to the “My Orders” page using the “My Orders” button on the navigation bar. Then the tester must check if the order details are accurate and up-to-date.</w:t>
+            </w:r>
+          </w:p>
+          <w:p>
+            <w:pPr>
+              <w:pStyle w:val="Default"/>
+              <w:rPr>
+                <w:sz w:val="23"/>
+                <w:szCs w:val="23"/>
+              </w:rPr>
+            </w:pPr>
+            <w:r>
+              <w:t>No test data needed.</w:t>
+            </w:r>
+          </w:p>
+        </w:tc>
+      </w:tr>
+      <w:tr>
+        <w:tc>
+          <w:tcPr>
+            <w:tcW w:w="1271" w:type="dxa"/>
+          </w:tcPr>
+          <w:p>
+            <w:r>
+              <w:t>17/04/26</w:t>
+            </w:r>
+          </w:p>
+        </w:tc>
+        <w:tc>
+          <w:tcPr>
+            <w:tcW w:w="1985" w:type="dxa"/>
+          </w:tcPr>
+          <w:p>
+            <w:pPr>
+              <w:pStyle w:val="Default"/>
+              <w:rPr>
+                <w:sz w:val="23"/>
+                <w:szCs w:val="23"/>
+              </w:rPr>
+            </w:pPr>
+            <w:r>
+              <w:rPr>
+                <w:sz w:val="23"/>
+                <w:szCs w:val="23"/>
+              </w:rPr>
+              <w:t>Cancelling orders on the “My Orders” page</w:t>
+            </w:r>
+          </w:p>
+        </w:tc>
+        <w:tc>
+          <w:tcPr>
+            <w:tcW w:w="1701" w:type="dxa"/>
+          </w:tcPr>
+          <w:p>
+            <w:pPr>
+              <w:pStyle w:val="Default"/>
+              <w:rPr>
+                <w:sz w:val="23"/>
+                <w:szCs w:val="23"/>
+              </w:rPr>
+            </w:pPr>
+            <w:r>
+              <w:rPr>
+                <w:sz w:val="23"/>
+                <w:szCs w:val="23"/>
+              </w:rPr>
+              <w:t xml:space="preserve">White box </w:t>
+            </w:r>
+          </w:p>
+          <w:p>
+            <w:pPr>
+              <w:pStyle w:val="Default"/>
+              <w:rPr>
+                <w:sz w:val="23"/>
+                <w:szCs w:val="23"/>
+              </w:rPr>
+            </w:pPr>
+            <w:r>
+              <w:rPr>
+                <w:sz w:val="23"/>
+                <w:szCs w:val="23"/>
+              </w:rPr>
+              <w:t xml:space="preserve">Black box </w:t>
+            </w:r>
+          </w:p>
+          <w:p>
+            <w:pPr>
+              <w:pStyle w:val="Default"/>
+              <w:rPr>
+                <w:sz w:val="23"/>
+                <w:szCs w:val="23"/>
+              </w:rPr>
+            </w:pPr>
+            <w:r>
+              <w:rPr>
+                <w:sz w:val="23"/>
+                <w:szCs w:val="23"/>
+              </w:rPr>
+              <w:t xml:space="preserve">Functionality </w:t>
+            </w:r>
+          </w:p>
+          <w:p>
+            <w:pPr>
+              <w:pStyle w:val="Default"/>
+              <w:rPr>
+                <w:sz w:val="23"/>
+                <w:szCs w:val="23"/>
+              </w:rPr>
+            </w:pPr>
+            <w:r>
+              <w:rPr>
+                <w:sz w:val="23"/>
+                <w:szCs w:val="23"/>
+              </w:rPr>
+              <w:t>Integration</w:t>
+            </w:r>
+          </w:p>
+        </w:tc>
+        <w:tc>
+          <w:tcPr>
+            <w:tcW w:w="4059" w:type="dxa"/>
+          </w:tcPr>
+          <w:p>
+            <w:pPr>
+              <w:pStyle w:val="Default"/>
+              <w:rPr>
+                <w:sz w:val="23"/>
+                <w:szCs w:val="23"/>
+              </w:rPr>
+            </w:pPr>
+            <w:r>
+              <w:rPr>
+                <w:sz w:val="23"/>
+                <w:szCs w:val="23"/>
+              </w:rPr>
+              <w:t xml:space="preserve">Home page should be made and be fully functional. </w:t>
+            </w:r>
+          </w:p>
+          <w:p>
+            <w:pPr>
+              <w:pStyle w:val="Default"/>
+              <w:rPr>
+                <w:sz w:val="23"/>
+                <w:szCs w:val="23"/>
+              </w:rPr>
+            </w:pPr>
+            <w:r>
+              <w:rPr>
+                <w:sz w:val="23"/>
+                <w:szCs w:val="23"/>
+              </w:rPr>
+              <w:t>“My Orders” page should be made and be fully functional.</w:t>
+            </w:r>
+          </w:p>
+          <w:p>
+            <w:r>
+              <w:t>Basket controller should be made and fully functional.</w:t>
+            </w:r>
+          </w:p>
+          <w:p>
+            <w:r>
+              <w:t>The tester must order some products and check their order through navigating to the “My Orders” page using the “My Orders” button on the navigation bar.</w:t>
+            </w:r>
+            <w:r>
+              <w:t xml:space="preserve"> Then the tester must click the “CANCEL ORDER” button on the order card and check if it can be seen by clicking the heading</w:t>
+            </w:r>
+            <w:r>
+              <w:t xml:space="preserve"> </w:t>
+            </w:r>
+            <w:r>
+              <w:t>“Cancelled”.</w:t>
+            </w:r>
+          </w:p>
+          <w:p>
+            <w:pPr>
+              <w:pStyle w:val="Default"/>
+              <w:rPr>
+                <w:sz w:val="23"/>
+                <w:szCs w:val="23"/>
+              </w:rPr>
+            </w:pPr>
+            <w:r>
+              <w:t>No test data needed.</w:t>
+            </w:r>
+          </w:p>
+        </w:tc>
+      </w:tr>
+      <w:tr>
+        <w:tc>
+          <w:tcPr>
+            <w:tcW w:w="1271" w:type="dxa"/>
+          </w:tcPr>
+          <w:p>
+            <w:r>
+              <w:t>17/04/26</w:t>
+            </w:r>
+          </w:p>
+        </w:tc>
+        <w:tc>
+          <w:tcPr>
+            <w:tcW w:w="1985" w:type="dxa"/>
+          </w:tcPr>
+          <w:p>
+            <w:pPr>
+              <w:pStyle w:val="Default"/>
+              <w:rPr>
+                <w:sz w:val="23"/>
+                <w:szCs w:val="23"/>
+              </w:rPr>
+            </w:pPr>
+            <w:r>
+              <w:rPr>
+                <w:sz w:val="23"/>
+                <w:szCs w:val="23"/>
+              </w:rPr>
+              <w:t xml:space="preserve">Switching between order statuses on the “My </w:t>
+            </w:r>
+            <w:r>
+              <w:rPr>
+                <w:sz w:val="23"/>
+                <w:szCs w:val="23"/>
+              </w:rPr>
+              <w:t>Orders” page</w:t>
+            </w:r>
+          </w:p>
+        </w:tc>
+        <w:tc>
+          <w:tcPr>
+            <w:tcW w:w="1701" w:type="dxa"/>
+          </w:tcPr>
+          <w:p>
+            <w:pPr>
+              <w:pStyle w:val="Default"/>
+              <w:rPr>
+                <w:sz w:val="23"/>
+                <w:szCs w:val="23"/>
+              </w:rPr>
+            </w:pPr>
+            <w:r>
+              <w:rPr>
+                <w:sz w:val="23"/>
+                <w:szCs w:val="23"/>
+              </w:rPr>
+              <w:t xml:space="preserve">White box </w:t>
+            </w:r>
+          </w:p>
+          <w:p>
+            <w:pPr>
+              <w:pStyle w:val="Default"/>
+              <w:rPr>
+                <w:sz w:val="23"/>
+                <w:szCs w:val="23"/>
+              </w:rPr>
+            </w:pPr>
+            <w:r>
+              <w:rPr>
+                <w:sz w:val="23"/>
+                <w:szCs w:val="23"/>
+              </w:rPr>
+              <w:t xml:space="preserve">Black box </w:t>
+            </w:r>
+          </w:p>
+          <w:p>
+            <w:pPr>
+              <w:pStyle w:val="Default"/>
+              <w:rPr>
+                <w:sz w:val="23"/>
+                <w:szCs w:val="23"/>
+              </w:rPr>
+            </w:pPr>
+            <w:r>
+              <w:rPr>
+                <w:sz w:val="23"/>
+                <w:szCs w:val="23"/>
+              </w:rPr>
+              <w:t xml:space="preserve">Functionality </w:t>
+            </w:r>
+          </w:p>
+          <w:p>
+            <w:pPr>
+              <w:pStyle w:val="Default"/>
+              <w:rPr>
+                <w:sz w:val="23"/>
+                <w:szCs w:val="23"/>
+              </w:rPr>
+            </w:pPr>
+            <w:r>
+              <w:rPr>
+                <w:sz w:val="23"/>
+                <w:szCs w:val="23"/>
+              </w:rPr>
+              <w:t>Integration</w:t>
+            </w:r>
+          </w:p>
+        </w:tc>
+        <w:tc>
+          <w:tcPr>
+            <w:tcW w:w="4059" w:type="dxa"/>
+          </w:tcPr>
+          <w:p>
+            <w:pPr>
+              <w:pStyle w:val="Default"/>
+              <w:rPr>
+                <w:sz w:val="23"/>
+                <w:szCs w:val="23"/>
+              </w:rPr>
+            </w:pPr>
+            <w:r>
+              <w:rPr>
+                <w:sz w:val="23"/>
+                <w:szCs w:val="23"/>
+              </w:rPr>
+              <w:t xml:space="preserve">Home page should be made and be fully functional. </w:t>
+            </w:r>
+          </w:p>
+          <w:p>
+            <w:pPr>
+              <w:pStyle w:val="Default"/>
+              <w:rPr>
+                <w:sz w:val="23"/>
+                <w:szCs w:val="23"/>
+              </w:rPr>
+            </w:pPr>
+            <w:r>
+              <w:rPr>
+                <w:sz w:val="23"/>
+                <w:szCs w:val="23"/>
+              </w:rPr>
+              <w:t>“My Orders” page should be made and be fully functional.</w:t>
+            </w:r>
+          </w:p>
+          <w:p>
+            <w:r>
+              <w:t>Basket controller should be made and fully functional.</w:t>
+            </w:r>
+          </w:p>
+          <w:p>
+            <w:pPr>
+              <w:pStyle w:val="Default"/>
+            </w:pPr>
+            <w:r>
+              <w:t>The tester must order some products and check their order through navigating to the “My Orders” page using the “My Orders” button on the navigation bar.</w:t>
+            </w:r>
+            <w:r>
+              <w:t xml:space="preserve"> Then the tester must check if different orders can be seen by clicking the different order status headings.</w:t>
+            </w:r>
+          </w:p>
+          <w:p>
+            <w:pPr>
+              <w:pStyle w:val="Default"/>
+              <w:rPr>
+                <w:sz w:val="23"/>
+                <w:szCs w:val="23"/>
+              </w:rPr>
+            </w:pPr>
+            <w:r>
+              <w:t>No test data needed.</w:t>
+            </w:r>
+          </w:p>
+        </w:tc>
+      </w:tr>
+      <w:tr>
+        <w:tc>
+          <w:tcPr>
+            <w:tcW w:w="1271" w:type="dxa"/>
+          </w:tcPr>
+          <w:p>
+            <w:r>
+              <w:t>17/04/26</w:t>
+            </w:r>
+          </w:p>
+        </w:tc>
+        <w:tc>
+          <w:tcPr>
+            <w:tcW w:w="1985" w:type="dxa"/>
+          </w:tcPr>
+          <w:p>
+            <w:pPr>
+              <w:pStyle w:val="Default"/>
+              <w:rPr>
+                <w:sz w:val="23"/>
+                <w:szCs w:val="23"/>
+              </w:rPr>
+            </w:pPr>
+            <w:r>
+              <w:rPr>
+                <w:sz w:val="23"/>
+                <w:szCs w:val="23"/>
+              </w:rPr>
+              <w:t>Remove products on the “My Baskets” page</w:t>
+            </w:r>
+          </w:p>
+        </w:tc>
+        <w:tc>
+          <w:tcPr>
+            <w:tcW w:w="1701" w:type="dxa"/>
+          </w:tcPr>
+          <w:p>
+            <w:pPr>
+              <w:pStyle w:val="Default"/>
+              <w:rPr>
+                <w:sz w:val="23"/>
+                <w:szCs w:val="23"/>
+              </w:rPr>
+            </w:pPr>
+            <w:r>
+              <w:rPr>
+                <w:sz w:val="23"/>
+                <w:szCs w:val="23"/>
+              </w:rPr>
+              <w:t xml:space="preserve">White box </w:t>
+            </w:r>
+          </w:p>
+          <w:p>
+            <w:pPr>
+              <w:pStyle w:val="Default"/>
+              <w:rPr>
+                <w:sz w:val="23"/>
+                <w:szCs w:val="23"/>
+              </w:rPr>
+            </w:pPr>
+            <w:r>
+              <w:rPr>
+                <w:sz w:val="23"/>
+                <w:szCs w:val="23"/>
+              </w:rPr>
+              <w:t xml:space="preserve">Black box </w:t>
+            </w:r>
+          </w:p>
+          <w:p>
+            <w:pPr>
+              <w:pStyle w:val="Default"/>
+              <w:rPr>
+                <w:sz w:val="23"/>
+                <w:szCs w:val="23"/>
+              </w:rPr>
+            </w:pPr>
+            <w:r>
+              <w:rPr>
+                <w:sz w:val="23"/>
+                <w:szCs w:val="23"/>
+              </w:rPr>
+              <w:t xml:space="preserve">Functionality </w:t>
+            </w:r>
+          </w:p>
+          <w:p>
+            <w:pPr>
+              <w:pStyle w:val="Default"/>
+              <w:rPr>
+                <w:sz w:val="23"/>
+                <w:szCs w:val="23"/>
+              </w:rPr>
+            </w:pPr>
+            <w:r>
+              <w:rPr>
+                <w:sz w:val="23"/>
+                <w:szCs w:val="23"/>
+              </w:rPr>
+              <w:lastRenderedPageBreak/>
+              <w:t>Integration</w:t>
+            </w:r>
+          </w:p>
+        </w:tc>
+        <w:tc>
+          <w:tcPr>
+            <w:tcW w:w="4059" w:type="dxa"/>
+          </w:tcPr>
+          <w:p>
+            <w:pPr>
+              <w:pStyle w:val="Default"/>
+              <w:rPr>
+                <w:sz w:val="23"/>
+                <w:szCs w:val="23"/>
+              </w:rPr>
+            </w:pPr>
+            <w:r>
+              <w:rPr>
+                <w:sz w:val="23"/>
+                <w:szCs w:val="23"/>
+              </w:rPr>
+              <w:lastRenderedPageBreak/>
+              <w:t xml:space="preserve">Home page should be made and be fully functional. </w:t>
+            </w:r>
+          </w:p>
+          <w:p>
+            <w:pPr>
+              <w:pStyle w:val="Default"/>
+              <w:rPr>
+                <w:sz w:val="23"/>
+                <w:szCs w:val="23"/>
+              </w:rPr>
+            </w:pPr>
+            <w:r>
+              <w:rPr>
+                <w:sz w:val="23"/>
+                <w:szCs w:val="23"/>
+              </w:rPr>
+              <w:lastRenderedPageBreak/>
+              <w:t xml:space="preserve">“My </w:t>
+            </w:r>
+            <w:r>
+              <w:rPr>
+                <w:sz w:val="23"/>
+                <w:szCs w:val="23"/>
+              </w:rPr>
+              <w:t>Basket</w:t>
+            </w:r>
+            <w:r>
+              <w:rPr>
+                <w:sz w:val="23"/>
+                <w:szCs w:val="23"/>
+              </w:rPr>
+              <w:t>” page should be made and be fully functional.</w:t>
+            </w:r>
+          </w:p>
+          <w:p>
+            <w:r>
+              <w:t>Basket controller should be made and fully functional.</w:t>
+            </w:r>
+          </w:p>
+          <w:p>
+            <w:pPr>
+              <w:pStyle w:val="Default"/>
+              <w:rPr>
+                <w:sz w:val="23"/>
+                <w:szCs w:val="23"/>
+              </w:rPr>
+            </w:pPr>
+            <w:r>
+              <w:t xml:space="preserve">The tester must order some products and check their order through navigating to the “My </w:t>
+            </w:r>
+            <w:r>
+              <w:t>Basket</w:t>
+            </w:r>
+            <w:r>
+              <w:t>” page using the</w:t>
+            </w:r>
+            <w:r>
+              <w:t xml:space="preserve"> “CHECKOUT” button on the basket side bar. Then the tester must check if products are being removed from the basket by click on the “X” buttons.</w:t>
+            </w:r>
+          </w:p>
+          <w:p>
+            <w:pPr>
+              <w:pStyle w:val="Default"/>
+              <w:rPr>
+                <w:sz w:val="23"/>
+                <w:szCs w:val="23"/>
+              </w:rPr>
+            </w:pPr>
+            <w:r>
+              <w:t>No test data needed.</w:t>
             </w:r>
           </w:p>
         </w:tc>
@@ -17515,7 +19127,7 @@
 </file>
 
 <file path=word/numbering.xml><?xml version="1.0" encoding="utf-8"?>
-<w:numbering xmlns:wpc="http://schemas.microsoft.com/office/word/2010/wordprocessingCanvas" xmlns:cx="http://schemas.microsoft.com/office/drawing/2014/chartex" xmlns:cx1="http://schemas.microsoft.com/office/drawing/2015/9/8/chartex" xmlns:cx2="http://schemas.microsoft.com/office/drawing/2015/10/21/chartex" xmlns:cx3="http://schemas.microsoft.com/office/drawing/2016/5/9/chartex" xmlns:cx4="http://schemas.microsoft.com/office/drawing/2016/5/10/chartex" xmlns:cx5="http://schemas.microsoft.com/office/drawing/2016/5/11/chartex" xmlns:cx6="http://schemas.microsoft.com/office/drawing/2016/5/12/chartex" xmlns:cx7="http://schemas.microsoft.com/office/drawing/2016/5/13/chartex" xmlns:cx8="http://schemas.microsoft.com/office/drawing/2016/5/14/chartex" xmlns:mc="http://schemas.openxmlformats.org/markup-compatibility/2006" xmlns:aink="http://schemas.microsoft.com/office/drawing/2016/ink" xmlns:am3d="http://schemas.microsoft.com/office/drawing/2017/model3d" xmlns:o="urn:schemas-microsoft-com:office:office" xmlns:oel="http://schemas.microsoft.com/office/2019/extlst" xmlns:r="http://schemas.openxmlformats.org/officeDocument/2006/relationships" xmlns:m="http://schemas.openxmlformats.org/officeDocument/2006/math" xmlns:v="urn:schemas-microsoft-com:vml" xmlns:wp14="http://schemas.microsoft.com/office/word/2010/wordprocessingDrawing" xmlns:wp="http://schemas.openxmlformats.org/drawingml/2006/wordprocessingDrawing" xmlns:w10="urn:schemas-microsoft-com:office:word" xmlns:w="http://schemas.openxmlformats.org/wordprocessingml/2006/main" xmlns:w14="http://schemas.microsoft.com/office/word/2010/wordml" xmlns:w15="http://schemas.microsoft.com/office/word/2012/wordml" xmlns:w16cex="http://schemas.microsoft.com/office/word/2018/wordml/cex" xmlns:w16cid="http://schemas.microsoft.com/office/word/2016/wordml/cid" xmlns:w16="http://schemas.microsoft.com/office/word/2018/wordml" xmlns:w16du="http://schemas.microsoft.com/office/word/2023/wordml/word16du" xmlns:w16sdtdh="http://schemas.microsoft.com/office/word/2020/wordml/sdtdatahash" xmlns:w16sdtfl="http://schemas.microsoft.com/office/word/2024/wordml/sdtformatlock" xmlns:w16se="http://schemas.microsoft.com/office/word/2015/wordml/symex" xmlns:wpg="http://schemas.microsoft.com/office/word/2010/wordprocessingGroup" xmlns:wpi="http://schemas.microsoft.com/office/word/2010/wordprocessingInk" xmlns:wne="http://schemas.microsoft.com/office/word/2006/wordml" xmlns:wps="http://schemas.microsoft.com/office/word/2010/wordprocessingShape" mc:Ignorable="w14 w15 w16se w16cid w16 w16cex w16sdtdh w16sdtfl w16du wp14">
+<w:numbering xmlns:wpc="http://schemas.microsoft.com/office/word/2010/wordprocessingCanvas" xmlns:cx="http://schemas.microsoft.com/office/drawing/2014/chartex" xmlns:cx1="http://schemas.microsoft.com/office/drawing/2015/9/8/chartex" xmlns:cx2="http://schemas.microsoft.com/office/drawing/2015/10/21/chartex" xmlns:cx3="http://schemas.microsoft.com/office/drawing/2016/5/9/chartex" xmlns:cx4="http://schemas.microsoft.com/office/drawing/2016/5/10/chartex" xmlns:cx5="http://schemas.microsoft.com/office/drawing/2016/5/11/chartex" xmlns:cx6="http://schemas.microsoft.com/office/drawing/2016/5/12/chartex" xmlns:cx7="http://schemas.microsoft.com/office/drawing/2016/5/13/chartex" xmlns:cx8="http://schemas.microsoft.com/office/drawing/2016/5/14/chartex" xmlns:mc="http://schemas.openxmlformats.org/markup-compatibility/2006" xmlns:aink="http://schemas.microsoft.com/office/drawing/2016/ink" xmlns:am3d="http://schemas.microsoft.com/office/drawing/2017/model3d" xmlns:o="urn:schemas-microsoft-com:office:office" xmlns:r="http://schemas.openxmlformats.org/officeDocument/2006/relationships" xmlns:m="http://schemas.openxmlformats.org/officeDocument/2006/math" xmlns:v="urn:schemas-microsoft-com:vml" xmlns:wp14="http://schemas.microsoft.com/office/word/2010/wordprocessingDrawing" xmlns:wp="http://schemas.openxmlformats.org/drawingml/2006/wordprocessingDrawing" xmlns:w10="urn:schemas-microsoft-com:office:word" xmlns:w="http://schemas.openxmlformats.org/wordprocessingml/2006/main" xmlns:w14="http://schemas.microsoft.com/office/word/2010/wordml" xmlns:w15="http://schemas.microsoft.com/office/word/2012/wordml" xmlns:w16cex="http://schemas.microsoft.com/office/word/2018/wordml/cex" xmlns:w16cid="http://schemas.microsoft.com/office/word/2016/wordml/cid" xmlns:w16="http://schemas.microsoft.com/office/word/2018/wordml" xmlns:w16sdtdh="http://schemas.microsoft.com/office/word/2020/wordml/sdtdatahash" xmlns:w16se="http://schemas.microsoft.com/office/word/2015/wordml/symex" xmlns:wpg="http://schemas.microsoft.com/office/word/2010/wordprocessingGroup" xmlns:wpi="http://schemas.microsoft.com/office/word/2010/wordprocessingInk" xmlns:wne="http://schemas.microsoft.com/office/word/2006/wordml" xmlns:wps="http://schemas.microsoft.com/office/word/2010/wordprocessingShape" mc:Ignorable="w14 w15 w16se w16cid w16 w16cex w16sdtdh wp14">
   <w:abstractNum w:abstractNumId="0" w15:restartNumberingAfterBreak="0">
     <w:nsid w:val="238969E0"/>
     <w:multiLevelType w:val="hybridMultilevel"/>
@@ -17968,23 +19580,23 @@
       </w:rPr>
     </w:lvl>
   </w:abstractNum>
-  <w:num w:numId="1" w16cid:durableId="1731728732">
+  <w:num w:numId="1">
     <w:abstractNumId w:val="2"/>
   </w:num>
-  <w:num w:numId="2" w16cid:durableId="977993813">
+  <w:num w:numId="2">
     <w:abstractNumId w:val="3"/>
   </w:num>
-  <w:num w:numId="3" w16cid:durableId="1846045621">
+  <w:num w:numId="3">
     <w:abstractNumId w:val="0"/>
   </w:num>
-  <w:num w:numId="4" w16cid:durableId="1051421551">
+  <w:num w:numId="4">
     <w:abstractNumId w:val="1"/>
   </w:num>
 </w:numbering>
 </file>
 
 <file path=word/styles.xml><?xml version="1.0" encoding="utf-8"?>
-<w:styles xmlns:mc="http://schemas.openxmlformats.org/markup-compatibility/2006" xmlns:r="http://schemas.openxmlformats.org/officeDocument/2006/relationships" xmlns:w="http://schemas.openxmlformats.org/wordprocessingml/2006/main" xmlns:w14="http://schemas.microsoft.com/office/word/2010/wordml" xmlns:w15="http://schemas.microsoft.com/office/word/2012/wordml" xmlns:w16cex="http://schemas.microsoft.com/office/word/2018/wordml/cex" xmlns:w16cid="http://schemas.microsoft.com/office/word/2016/wordml/cid" xmlns:w16="http://schemas.microsoft.com/office/word/2018/wordml" xmlns:w16du="http://schemas.microsoft.com/office/word/2023/wordml/word16du" xmlns:w16sdtdh="http://schemas.microsoft.com/office/word/2020/wordml/sdtdatahash" xmlns:w16sdtfl="http://schemas.microsoft.com/office/word/2024/wordml/sdtformatlock" xmlns:w16se="http://schemas.microsoft.com/office/word/2015/wordml/symex" mc:Ignorable="w14 w15 w16se w16cid w16 w16cex w16sdtdh w16sdtfl w16du">
+<w:styles xmlns:mc="http://schemas.openxmlformats.org/markup-compatibility/2006" xmlns:r="http://schemas.openxmlformats.org/officeDocument/2006/relationships" xmlns:w="http://schemas.openxmlformats.org/wordprocessingml/2006/main" xmlns:w14="http://schemas.microsoft.com/office/word/2010/wordml" xmlns:w15="http://schemas.microsoft.com/office/word/2012/wordml" xmlns:w16cex="http://schemas.microsoft.com/office/word/2018/wordml/cex" xmlns:w16cid="http://schemas.microsoft.com/office/word/2016/wordml/cid" xmlns:w16="http://schemas.microsoft.com/office/word/2018/wordml" xmlns:w16sdtdh="http://schemas.microsoft.com/office/word/2020/wordml/sdtdatahash" xmlns:w16se="http://schemas.microsoft.com/office/word/2015/wordml/symex" mc:Ignorable="w14 w15 w16se w16cid w16 w16cex w16sdtdh">
   <w:docDefaults>
     <w:rPrDefault>
       <w:rPr>
@@ -20448,42 +22060,6 @@
         </a:p>
       </dgm:t>
     </dgm:pt>
-    <dgm:pt modelId="{71E4B4DA-ECDA-4AA9-B186-64E39A82076A}">
-      <dgm:prSet phldrT="[Text]"/>
-      <dgm:spPr/>
-      <dgm:t>
-        <a:bodyPr/>
-        <a:lstStyle/>
-        <a:p>
-          <a:r>
-            <a:rPr lang="en-GB"/>
-            <a:t>Delete product</a:t>
-          </a:r>
-        </a:p>
-      </dgm:t>
-    </dgm:pt>
-    <dgm:pt modelId="{D94D0B90-38C0-403B-8D1F-0FEEAA2BBF19}" type="parTrans" cxnId="{6001A27B-5D7D-42BA-A2F7-11F03FE10B41}">
-      <dgm:prSet/>
-      <dgm:spPr/>
-      <dgm:t>
-        <a:bodyPr/>
-        <a:lstStyle/>
-        <a:p>
-          <a:endParaRPr lang="en-GB"/>
-        </a:p>
-      </dgm:t>
-    </dgm:pt>
-    <dgm:pt modelId="{062D9FCB-A996-4A8E-8205-F6E751FFD5BF}" type="sibTrans" cxnId="{6001A27B-5D7D-42BA-A2F7-11F03FE10B41}">
-      <dgm:prSet/>
-      <dgm:spPr/>
-      <dgm:t>
-        <a:bodyPr/>
-        <a:lstStyle/>
-        <a:p>
-          <a:endParaRPr lang="en-GB"/>
-        </a:p>
-      </dgm:t>
-    </dgm:pt>
     <dgm:pt modelId="{E2855DE1-6DDF-43DD-BCCB-C16F475E90F7}">
       <dgm:prSet phldrT="[Text]"/>
       <dgm:spPr/>
@@ -20594,7 +22170,7 @@
       <dgm:spPr/>
     </dgm:pt>
     <dgm:pt modelId="{C3FDB715-70A1-49A8-9797-AF8211783E95}" type="pres">
-      <dgm:prSet presAssocID="{65D6A9C5-DD93-444C-9432-7B5A0E7A06DC}" presName="Name37" presStyleLbl="parChTrans1D3" presStyleIdx="0" presStyleCnt="5"/>
+      <dgm:prSet presAssocID="{65D6A9C5-DD93-444C-9432-7B5A0E7A06DC}" presName="Name37" presStyleLbl="parChTrans1D3" presStyleIdx="0" presStyleCnt="4"/>
       <dgm:spPr/>
     </dgm:pt>
     <dgm:pt modelId="{E1BED13D-BA3E-423C-94AE-595E838EAC64}" type="pres">
@@ -20610,7 +22186,7 @@
       <dgm:spPr/>
     </dgm:pt>
     <dgm:pt modelId="{9AF36780-2E35-434E-9C52-F1E6DDBAE230}" type="pres">
-      <dgm:prSet presAssocID="{39A138F5-0715-4176-8E50-F126EE8EF9A6}" presName="rootText" presStyleLbl="node3" presStyleIdx="0" presStyleCnt="5">
+      <dgm:prSet presAssocID="{39A138F5-0715-4176-8E50-F126EE8EF9A6}" presName="rootText" presStyleLbl="node3" presStyleIdx="0" presStyleCnt="4">
         <dgm:presLayoutVars>
           <dgm:chPref val="3"/>
         </dgm:presLayoutVars>
@@ -20618,7 +22194,7 @@
       <dgm:spPr/>
     </dgm:pt>
     <dgm:pt modelId="{900EF2A9-62BD-4970-B701-CB1FE9DAA211}" type="pres">
-      <dgm:prSet presAssocID="{39A138F5-0715-4176-8E50-F126EE8EF9A6}" presName="rootConnector" presStyleLbl="node3" presStyleIdx="0" presStyleCnt="5"/>
+      <dgm:prSet presAssocID="{39A138F5-0715-4176-8E50-F126EE8EF9A6}" presName="rootConnector" presStyleLbl="node3" presStyleIdx="0" presStyleCnt="4"/>
       <dgm:spPr/>
     </dgm:pt>
     <dgm:pt modelId="{206E5150-43DA-40A9-9A56-900197373664}" type="pres">
@@ -20810,7 +22386,7 @@
       <dgm:spPr/>
     </dgm:pt>
     <dgm:pt modelId="{4ED7CC23-3454-447B-9611-C085C68BD0DB}" type="pres">
-      <dgm:prSet presAssocID="{38F0394E-31D6-4D39-937B-7CB8B44E33C3}" presName="Name37" presStyleLbl="parChTrans1D3" presStyleIdx="1" presStyleCnt="5"/>
+      <dgm:prSet presAssocID="{38F0394E-31D6-4D39-937B-7CB8B44E33C3}" presName="Name37" presStyleLbl="parChTrans1D3" presStyleIdx="1" presStyleCnt="4"/>
       <dgm:spPr/>
     </dgm:pt>
     <dgm:pt modelId="{1A3FF1B5-7E2D-4E6A-B89F-F2C9119E053D}" type="pres">
@@ -20826,7 +22402,7 @@
       <dgm:spPr/>
     </dgm:pt>
     <dgm:pt modelId="{0A4840AC-695A-4072-B912-DA3746F198BC}" type="pres">
-      <dgm:prSet presAssocID="{04063226-F60B-4630-8990-85677D1F42BE}" presName="rootText" presStyleLbl="node3" presStyleIdx="1" presStyleCnt="5">
+      <dgm:prSet presAssocID="{04063226-F60B-4630-8990-85677D1F42BE}" presName="rootText" presStyleLbl="node3" presStyleIdx="1" presStyleCnt="4">
         <dgm:presLayoutVars>
           <dgm:chPref val="3"/>
         </dgm:presLayoutVars>
@@ -20834,7 +22410,7 @@
       <dgm:spPr/>
     </dgm:pt>
     <dgm:pt modelId="{179DE2A6-5548-4ABE-8621-389B46674DE8}" type="pres">
-      <dgm:prSet presAssocID="{04063226-F60B-4630-8990-85677D1F42BE}" presName="rootConnector" presStyleLbl="node3" presStyleIdx="1" presStyleCnt="5"/>
+      <dgm:prSet presAssocID="{04063226-F60B-4630-8990-85677D1F42BE}" presName="rootConnector" presStyleLbl="node3" presStyleIdx="1" presStyleCnt="4"/>
       <dgm:spPr/>
     </dgm:pt>
     <dgm:pt modelId="{18D39CA4-B2AD-4EBB-91DC-4EEBEB5450B3}" type="pres">
@@ -20846,7 +22422,7 @@
       <dgm:spPr/>
     </dgm:pt>
     <dgm:pt modelId="{7F8A3ECB-5AF5-4B8C-B170-FADCE0A00CE7}" type="pres">
-      <dgm:prSet presAssocID="{A8003324-FF19-4D12-BA6B-CFF924472A1C}" presName="Name37" presStyleLbl="parChTrans1D3" presStyleIdx="2" presStyleCnt="5"/>
+      <dgm:prSet presAssocID="{A8003324-FF19-4D12-BA6B-CFF924472A1C}" presName="Name37" presStyleLbl="parChTrans1D3" presStyleIdx="2" presStyleCnt="4"/>
       <dgm:spPr/>
     </dgm:pt>
     <dgm:pt modelId="{2173F104-541F-43CB-82B4-112C2690DF70}" type="pres">
@@ -20862,7 +22438,7 @@
       <dgm:spPr/>
     </dgm:pt>
     <dgm:pt modelId="{13AB6A92-0319-4BFA-97D9-2A96E2D88EB5}" type="pres">
-      <dgm:prSet presAssocID="{A6E52FD0-6504-4B4A-AF5F-0E2488CEA3A8}" presName="rootText" presStyleLbl="node3" presStyleIdx="2" presStyleCnt="5">
+      <dgm:prSet presAssocID="{A6E52FD0-6504-4B4A-AF5F-0E2488CEA3A8}" presName="rootText" presStyleLbl="node3" presStyleIdx="2" presStyleCnt="4">
         <dgm:presLayoutVars>
           <dgm:chPref val="3"/>
         </dgm:presLayoutVars>
@@ -20870,7 +22446,7 @@
       <dgm:spPr/>
     </dgm:pt>
     <dgm:pt modelId="{419063D7-EDC5-46E7-97A1-845C30D24B59}" type="pres">
-      <dgm:prSet presAssocID="{A6E52FD0-6504-4B4A-AF5F-0E2488CEA3A8}" presName="rootConnector" presStyleLbl="node3" presStyleIdx="2" presStyleCnt="5"/>
+      <dgm:prSet presAssocID="{A6E52FD0-6504-4B4A-AF5F-0E2488CEA3A8}" presName="rootConnector" presStyleLbl="node3" presStyleIdx="2" presStyleCnt="4"/>
       <dgm:spPr/>
     </dgm:pt>
     <dgm:pt modelId="{F88498AC-D486-42FB-8968-F81161F45C37}" type="pres">
@@ -20879,42 +22455,6 @@
     </dgm:pt>
     <dgm:pt modelId="{62411046-349A-4178-B99A-056EFAB5C10F}" type="pres">
       <dgm:prSet presAssocID="{A6E52FD0-6504-4B4A-AF5F-0E2488CEA3A8}" presName="hierChild5" presStyleCnt="0"/>
-      <dgm:spPr/>
-    </dgm:pt>
-    <dgm:pt modelId="{A760058F-2450-426F-A6DB-037A19925599}" type="pres">
-      <dgm:prSet presAssocID="{D94D0B90-38C0-403B-8D1F-0FEEAA2BBF19}" presName="Name37" presStyleLbl="parChTrans1D3" presStyleIdx="3" presStyleCnt="5"/>
-      <dgm:spPr/>
-    </dgm:pt>
-    <dgm:pt modelId="{80996E3E-3F95-491A-9748-EFE09EF91C72}" type="pres">
-      <dgm:prSet presAssocID="{71E4B4DA-ECDA-4AA9-B186-64E39A82076A}" presName="hierRoot2" presStyleCnt="0">
-        <dgm:presLayoutVars>
-          <dgm:hierBranch val="init"/>
-        </dgm:presLayoutVars>
-      </dgm:prSet>
-      <dgm:spPr/>
-    </dgm:pt>
-    <dgm:pt modelId="{7E06B2D0-EB18-438E-A11F-4404BFA2DDEE}" type="pres">
-      <dgm:prSet presAssocID="{71E4B4DA-ECDA-4AA9-B186-64E39A82076A}" presName="rootComposite" presStyleCnt="0"/>
-      <dgm:spPr/>
-    </dgm:pt>
-    <dgm:pt modelId="{C50D2B72-7969-45AE-84DC-85DE4BE402C8}" type="pres">
-      <dgm:prSet presAssocID="{71E4B4DA-ECDA-4AA9-B186-64E39A82076A}" presName="rootText" presStyleLbl="node3" presStyleIdx="3" presStyleCnt="5">
-        <dgm:presLayoutVars>
-          <dgm:chPref val="3"/>
-        </dgm:presLayoutVars>
-      </dgm:prSet>
-      <dgm:spPr/>
-    </dgm:pt>
-    <dgm:pt modelId="{E5A96AC2-001F-443E-A6EB-1B2EB6E388E4}" type="pres">
-      <dgm:prSet presAssocID="{71E4B4DA-ECDA-4AA9-B186-64E39A82076A}" presName="rootConnector" presStyleLbl="node3" presStyleIdx="3" presStyleCnt="5"/>
-      <dgm:spPr/>
-    </dgm:pt>
-    <dgm:pt modelId="{68427266-4C77-443A-B353-6BDD9A4836C7}" type="pres">
-      <dgm:prSet presAssocID="{71E4B4DA-ECDA-4AA9-B186-64E39A82076A}" presName="hierChild4" presStyleCnt="0"/>
-      <dgm:spPr/>
-    </dgm:pt>
-    <dgm:pt modelId="{C7A303D9-597C-4521-86AD-E99B78B23263}" type="pres">
-      <dgm:prSet presAssocID="{71E4B4DA-ECDA-4AA9-B186-64E39A82076A}" presName="hierChild5" presStyleCnt="0"/>
       <dgm:spPr/>
     </dgm:pt>
     <dgm:pt modelId="{DD6FE51F-D1B0-4747-B8BB-F9C1F85A0201}" type="pres">
@@ -20954,7 +22494,7 @@
       <dgm:spPr/>
     </dgm:pt>
     <dgm:pt modelId="{5D076790-EEBB-47A4-8C04-3E7F7FF0CF4D}" type="pres">
-      <dgm:prSet presAssocID="{9D472979-A6F4-4DDD-B4AB-32B4D8BF2585}" presName="Name37" presStyleLbl="parChTrans1D3" presStyleIdx="4" presStyleCnt="5"/>
+      <dgm:prSet presAssocID="{9D472979-A6F4-4DDD-B4AB-32B4D8BF2585}" presName="Name37" presStyleLbl="parChTrans1D3" presStyleIdx="3" presStyleCnt="4"/>
       <dgm:spPr/>
     </dgm:pt>
     <dgm:pt modelId="{0D783722-F7E5-4013-8855-77F083804A8F}" type="pres">
@@ -20970,7 +22510,7 @@
       <dgm:spPr/>
     </dgm:pt>
     <dgm:pt modelId="{836C6218-4EE0-4640-8630-ABE1046ACD36}" type="pres">
-      <dgm:prSet presAssocID="{E1DE512A-9AAB-4DE8-8031-39A3F5DC3877}" presName="rootText" presStyleLbl="node3" presStyleIdx="4" presStyleCnt="5">
+      <dgm:prSet presAssocID="{E1DE512A-9AAB-4DE8-8031-39A3F5DC3877}" presName="rootText" presStyleLbl="node3" presStyleIdx="3" presStyleCnt="4">
         <dgm:presLayoutVars>
           <dgm:chPref val="3"/>
         </dgm:presLayoutVars>
@@ -20978,7 +22518,7 @@
       <dgm:spPr/>
     </dgm:pt>
     <dgm:pt modelId="{177E4711-7C28-479A-B767-18395428FEEC}" type="pres">
-      <dgm:prSet presAssocID="{E1DE512A-9AAB-4DE8-8031-39A3F5DC3877}" presName="rootConnector" presStyleLbl="node3" presStyleIdx="4" presStyleCnt="5"/>
+      <dgm:prSet presAssocID="{E1DE512A-9AAB-4DE8-8031-39A3F5DC3877}" presName="rootConnector" presStyleLbl="node3" presStyleIdx="3" presStyleCnt="4"/>
       <dgm:spPr/>
     </dgm:pt>
     <dgm:pt modelId="{8116DA06-B407-4CCC-80A9-D6BD096D04A1}" type="pres">
@@ -21092,7 +22632,6 @@
     <dgm:cxn modelId="{6A805A46-323A-4E00-9C29-99D83C1D0E71}" type="presOf" srcId="{8CEF9D6A-CA9E-4CEA-B5E1-A6CEDE74E576}" destId="{403D62E3-7020-4AE2-BE05-2D32FCCB25C3}" srcOrd="0" destOrd="0" presId="urn:microsoft.com/office/officeart/2005/8/layout/orgChart1"/>
     <dgm:cxn modelId="{DBA9A766-BEFD-42B9-927D-CBEE4A6F1408}" type="presOf" srcId="{05639210-76EC-465C-BB02-09C43ECF9612}" destId="{F6833E12-977C-4334-851C-493A685081D0}" srcOrd="0" destOrd="0" presId="urn:microsoft.com/office/officeart/2005/8/layout/orgChart1"/>
     <dgm:cxn modelId="{5BCE6447-C622-4EBF-B4CC-23F47AD457B0}" type="presOf" srcId="{A51A72FA-0157-4AD3-AF40-47640E651E2A}" destId="{980BB85B-A217-4A5D-9CB7-5AF30C46DB16}" srcOrd="0" destOrd="0" presId="urn:microsoft.com/office/officeart/2005/8/layout/orgChart1"/>
-    <dgm:cxn modelId="{12C0504B-1CB0-4A73-A2B9-7B35F3BDA3F0}" type="presOf" srcId="{71E4B4DA-ECDA-4AA9-B186-64E39A82076A}" destId="{C50D2B72-7969-45AE-84DC-85DE4BE402C8}" srcOrd="0" destOrd="0" presId="urn:microsoft.com/office/officeart/2005/8/layout/orgChart1"/>
     <dgm:cxn modelId="{7B86444C-5223-4DE3-B17F-6265DD933A1F}" type="presOf" srcId="{6219A2B6-403A-4533-9770-B02CC26B3E77}" destId="{D07CF1A2-09BF-4D84-B325-6750EBA1DAF7}" srcOrd="1" destOrd="0" presId="urn:microsoft.com/office/officeart/2005/8/layout/orgChart1"/>
     <dgm:cxn modelId="{83CFCD4C-F8F8-4ED4-B38D-643B0D757C34}" type="presOf" srcId="{CC001159-0610-4763-87DE-F23C6BD1D96F}" destId="{915E890D-BE2B-4C3A-89E3-BC9B2B83EA55}" srcOrd="0" destOrd="0" presId="urn:microsoft.com/office/officeart/2005/8/layout/orgChart1"/>
     <dgm:cxn modelId="{4326104D-87CD-4CF5-ABB9-D9C1EA0E1343}" srcId="{9050314F-9DCC-43C2-9FB9-9B1E85B5DD60}" destId="{8CEF9D6A-CA9E-4CEA-B5E1-A6CEDE74E576}" srcOrd="0" destOrd="0" parTransId="{F65F90DA-514E-4B15-956B-0F7BBFD3BFF5}" sibTransId="{16721998-2489-4F68-AD7D-C621F5BF233B}"/>
@@ -21102,9 +22641,7 @@
     <dgm:cxn modelId="{7524AB54-4EBE-4CB5-837C-28B5010CBC22}" type="presOf" srcId="{3C4E2277-B9F0-454D-B237-8739265399A5}" destId="{3F10C4E5-9407-4A3D-A23F-8C4B9350B2DC}" srcOrd="0" destOrd="0" presId="urn:microsoft.com/office/officeart/2005/8/layout/orgChart1"/>
     <dgm:cxn modelId="{3D41C754-A99B-4EFA-8C1B-E1CADF3771DB}" type="presOf" srcId="{A6E52FD0-6504-4B4A-AF5F-0E2488CEA3A8}" destId="{13AB6A92-0319-4BFA-97D9-2A96E2D88EB5}" srcOrd="0" destOrd="0" presId="urn:microsoft.com/office/officeart/2005/8/layout/orgChart1"/>
     <dgm:cxn modelId="{2C682D57-4CD3-4F19-8891-DB13F8603621}" type="presOf" srcId="{25428F68-4B31-4C9E-A704-9D45FEB9494D}" destId="{52397C9B-F808-4CB0-AD9B-458C19FE2185}" srcOrd="1" destOrd="0" presId="urn:microsoft.com/office/officeart/2005/8/layout/orgChart1"/>
-    <dgm:cxn modelId="{6001A27B-5D7D-42BA-A2F7-11F03FE10B41}" srcId="{25428F68-4B31-4C9E-A704-9D45FEB9494D}" destId="{71E4B4DA-ECDA-4AA9-B186-64E39A82076A}" srcOrd="2" destOrd="0" parTransId="{D94D0B90-38C0-403B-8D1F-0FEEAA2BBF19}" sibTransId="{062D9FCB-A996-4A8E-8205-F6E751FFD5BF}"/>
     <dgm:cxn modelId="{4CC06A7F-5853-40E5-BDCC-B2778EE3C967}" srcId="{8CEF9D6A-CA9E-4CEA-B5E1-A6CEDE74E576}" destId="{ACCAA6E3-62AF-4ADA-8DEA-BBED07873C93}" srcOrd="4" destOrd="0" parTransId="{9205C0C1-55FF-44BF-8EC3-2801FA7318E8}" sibTransId="{105A5E1B-B6CB-4600-BAAB-DD348716BD7B}"/>
-    <dgm:cxn modelId="{64EE6A80-304A-4B2E-9853-66676201D728}" type="presOf" srcId="{D94D0B90-38C0-403B-8D1F-0FEEAA2BBF19}" destId="{A760058F-2450-426F-A6DB-037A19925599}" srcOrd="0" destOrd="0" presId="urn:microsoft.com/office/officeart/2005/8/layout/orgChart1"/>
     <dgm:cxn modelId="{2ABF9289-397E-4F1C-B086-5C9F6E74E12F}" srcId="{25428F68-4B31-4C9E-A704-9D45FEB9494D}" destId="{A6E52FD0-6504-4B4A-AF5F-0E2488CEA3A8}" srcOrd="1" destOrd="0" parTransId="{A8003324-FF19-4D12-BA6B-CFF924472A1C}" sibTransId="{57E931EC-4BD8-448A-A02B-6697ECFC98AC}"/>
     <dgm:cxn modelId="{E08FB68B-C20D-4321-BC0E-0277F8E129A0}" type="presOf" srcId="{CC001159-0610-4763-87DE-F23C6BD1D96F}" destId="{EE046975-2BBA-4DC7-B73A-48B48C6E73EF}" srcOrd="1" destOrd="0" presId="urn:microsoft.com/office/officeart/2005/8/layout/orgChart1"/>
     <dgm:cxn modelId="{61D20A8D-787B-49E6-8468-7126F4965393}" srcId="{6219A2B6-403A-4533-9770-B02CC26B3E77}" destId="{39A138F5-0715-4176-8E50-F126EE8EF9A6}" srcOrd="0" destOrd="0" parTransId="{65D6A9C5-DD93-444C-9432-7B5A0E7A06DC}" sibTransId="{54685AEC-3E86-4506-93C8-2ED6D9B2FED8}"/>
@@ -21115,7 +22652,6 @@
     <dgm:cxn modelId="{30C46BA0-FB9F-4350-AE0E-96238AC2DA7A}" type="presOf" srcId="{BC846C0B-0D99-4A17-9D99-F14415CE49A9}" destId="{5861AFAA-9020-4DF5-9CAE-662604CE37CD}" srcOrd="0" destOrd="0" presId="urn:microsoft.com/office/officeart/2005/8/layout/orgChart1"/>
     <dgm:cxn modelId="{44FC8EAF-340C-48D7-8CDF-7721D4BD3CFD}" type="presOf" srcId="{04063226-F60B-4630-8990-85677D1F42BE}" destId="{0A4840AC-695A-4072-B912-DA3746F198BC}" srcOrd="0" destOrd="0" presId="urn:microsoft.com/office/officeart/2005/8/layout/orgChart1"/>
     <dgm:cxn modelId="{BF4EDBB4-A485-448A-B0E3-C3D5A1BAF03C}" srcId="{8CEF9D6A-CA9E-4CEA-B5E1-A6CEDE74E576}" destId="{CC001159-0610-4763-87DE-F23C6BD1D96F}" srcOrd="6" destOrd="0" parTransId="{945FE947-D3AD-4139-8C83-A43C32338FB3}" sibTransId="{97D57C8C-00EA-4132-BADB-29B4E4F732EB}"/>
-    <dgm:cxn modelId="{EF79E0B5-027C-48B8-9018-FA447F0F4E99}" type="presOf" srcId="{71E4B4DA-ECDA-4AA9-B186-64E39A82076A}" destId="{E5A96AC2-001F-443E-A6EB-1B2EB6E388E4}" srcOrd="1" destOrd="0" presId="urn:microsoft.com/office/officeart/2005/8/layout/orgChart1"/>
     <dgm:cxn modelId="{905E78B6-A171-458E-9E14-C97CA7525296}" type="presOf" srcId="{8CEF9D6A-CA9E-4CEA-B5E1-A6CEDE74E576}" destId="{38751402-5CBF-4AD3-9692-242B6AF6B2E7}" srcOrd="1" destOrd="0" presId="urn:microsoft.com/office/officeart/2005/8/layout/orgChart1"/>
     <dgm:cxn modelId="{5B93C6BA-ED6E-4AEA-AF29-E6197EB74CE3}" srcId="{8CEF9D6A-CA9E-4CEA-B5E1-A6CEDE74E576}" destId="{25428F68-4B31-4C9E-A704-9D45FEB9494D}" srcOrd="5" destOrd="0" parTransId="{DD74484A-B196-494D-B7C1-B8338271AABB}" sibTransId="{884178C7-16FC-4F37-8F08-8B88F24FE8E8}"/>
     <dgm:cxn modelId="{6FB804BD-5C7A-477B-9102-AAF1FEF894CC}" type="presOf" srcId="{3CF691D5-71E5-4D8C-BC25-285E6715746D}" destId="{3B90203B-5DFF-47C1-B405-4D1D38200D50}" srcOrd="1" destOrd="0" presId="urn:microsoft.com/office/officeart/2005/8/layout/orgChart1"/>
@@ -21198,13 +22734,6 @@
     <dgm:cxn modelId="{A37D4EAF-3F7B-4573-8BE6-51248F955643}" type="presParOf" srcId="{EC58D0FD-98F6-40E5-A386-0A3AA2853915}" destId="{419063D7-EDC5-46E7-97A1-845C30D24B59}" srcOrd="1" destOrd="0" presId="urn:microsoft.com/office/officeart/2005/8/layout/orgChart1"/>
     <dgm:cxn modelId="{52C69E4B-D024-4660-B31B-D8E10DC24975}" type="presParOf" srcId="{2173F104-541F-43CB-82B4-112C2690DF70}" destId="{F88498AC-D486-42FB-8968-F81161F45C37}" srcOrd="1" destOrd="0" presId="urn:microsoft.com/office/officeart/2005/8/layout/orgChart1"/>
     <dgm:cxn modelId="{BC2A535B-2B3C-4BAC-839A-EA68EAC1FCAE}" type="presParOf" srcId="{2173F104-541F-43CB-82B4-112C2690DF70}" destId="{62411046-349A-4178-B99A-056EFAB5C10F}" srcOrd="2" destOrd="0" presId="urn:microsoft.com/office/officeart/2005/8/layout/orgChart1"/>
-    <dgm:cxn modelId="{9D15612B-6A8D-435A-BE96-9DA215E6A455}" type="presParOf" srcId="{B2A94D4D-6A19-4B0D-93F4-91469DC5FA31}" destId="{A760058F-2450-426F-A6DB-037A19925599}" srcOrd="4" destOrd="0" presId="urn:microsoft.com/office/officeart/2005/8/layout/orgChart1"/>
-    <dgm:cxn modelId="{9E14EB13-25F6-468F-A52D-6C5FF5564A00}" type="presParOf" srcId="{B2A94D4D-6A19-4B0D-93F4-91469DC5FA31}" destId="{80996E3E-3F95-491A-9748-EFE09EF91C72}" srcOrd="5" destOrd="0" presId="urn:microsoft.com/office/officeart/2005/8/layout/orgChart1"/>
-    <dgm:cxn modelId="{99811E84-1257-470F-BA37-5665C690C5F9}" type="presParOf" srcId="{80996E3E-3F95-491A-9748-EFE09EF91C72}" destId="{7E06B2D0-EB18-438E-A11F-4404BFA2DDEE}" srcOrd="0" destOrd="0" presId="urn:microsoft.com/office/officeart/2005/8/layout/orgChart1"/>
-    <dgm:cxn modelId="{4299AA2C-38ED-4A68-92F6-4E7B4C454083}" type="presParOf" srcId="{7E06B2D0-EB18-438E-A11F-4404BFA2DDEE}" destId="{C50D2B72-7969-45AE-84DC-85DE4BE402C8}" srcOrd="0" destOrd="0" presId="urn:microsoft.com/office/officeart/2005/8/layout/orgChart1"/>
-    <dgm:cxn modelId="{DF6EDA23-CF70-4927-80FB-1C8EC930D58F}" type="presParOf" srcId="{7E06B2D0-EB18-438E-A11F-4404BFA2DDEE}" destId="{E5A96AC2-001F-443E-A6EB-1B2EB6E388E4}" srcOrd="1" destOrd="0" presId="urn:microsoft.com/office/officeart/2005/8/layout/orgChart1"/>
-    <dgm:cxn modelId="{D58806DC-ACCB-44F9-801A-F12FEA246C29}" type="presParOf" srcId="{80996E3E-3F95-491A-9748-EFE09EF91C72}" destId="{68427266-4C77-443A-B353-6BDD9A4836C7}" srcOrd="1" destOrd="0" presId="urn:microsoft.com/office/officeart/2005/8/layout/orgChart1"/>
-    <dgm:cxn modelId="{40537257-9DFC-4BBC-A0D2-AB0F2B43F298}" type="presParOf" srcId="{80996E3E-3F95-491A-9748-EFE09EF91C72}" destId="{C7A303D9-597C-4521-86AD-E99B78B23263}" srcOrd="2" destOrd="0" presId="urn:microsoft.com/office/officeart/2005/8/layout/orgChart1"/>
     <dgm:cxn modelId="{7E872F90-F879-4004-9C82-F39B601CF9CC}" type="presParOf" srcId="{8EEAF327-31E2-4DE2-991F-06A009517065}" destId="{DD6FE51F-D1B0-4747-B8BB-F9C1F85A0201}" srcOrd="2" destOrd="0" presId="urn:microsoft.com/office/officeart/2005/8/layout/orgChart1"/>
     <dgm:cxn modelId="{5F5515CC-4070-489D-BF02-A2F351E79712}" type="presParOf" srcId="{F41F2A2E-3966-4F6B-935F-717AE275BD95}" destId="{5171DC12-B2F9-4299-A2EB-6C34DF59FA57}" srcOrd="12" destOrd="0" presId="urn:microsoft.com/office/officeart/2005/8/layout/orgChart1"/>
     <dgm:cxn modelId="{B0B30372-3A90-467E-B38B-282A464B01A1}" type="presParOf" srcId="{F41F2A2E-3966-4F6B-935F-717AE275BD95}" destId="{662169EA-51FA-40C2-9CF0-8CCA28C32C80}" srcOrd="13" destOrd="0" presId="urn:microsoft.com/office/officeart/2005/8/layout/orgChart1"/>
@@ -21264,7 +22793,7 @@
       </dsp:nvSpPr>
       <dsp:spPr>
         <a:xfrm>
-          <a:off x="2865755" y="814647"/>
+          <a:off x="2865755" y="1004964"/>
           <a:ext cx="2594746" cy="112581"/>
         </a:xfrm>
         <a:custGeom>
@@ -21325,7 +22854,7 @@
       </dsp:nvSpPr>
       <dsp:spPr>
         <a:xfrm>
-          <a:off x="2865755" y="814647"/>
+          <a:off x="2865755" y="1004964"/>
           <a:ext cx="1946059" cy="112581"/>
         </a:xfrm>
         <a:custGeom>
@@ -21386,7 +22915,7 @@
       </dsp:nvSpPr>
       <dsp:spPr>
         <a:xfrm>
-          <a:off x="3902966" y="1195281"/>
+          <a:off x="3902966" y="1385598"/>
           <a:ext cx="91440" cy="246608"/>
         </a:xfrm>
         <a:custGeom>
@@ -21444,7 +22973,7 @@
       </dsp:nvSpPr>
       <dsp:spPr>
         <a:xfrm>
-          <a:off x="2865755" y="814647"/>
+          <a:off x="2865755" y="1004964"/>
           <a:ext cx="1297373" cy="112581"/>
         </a:xfrm>
         <a:custGeom>
@@ -21498,64 +23027,6 @@
         <a:fontRef idx="minor"/>
       </dsp:style>
     </dsp:sp>
-    <dsp:sp modelId="{A760058F-2450-426F-A6DB-037A19925599}">
-      <dsp:nvSpPr>
-        <dsp:cNvPr id="0" name=""/>
-        <dsp:cNvSpPr/>
-      </dsp:nvSpPr>
-      <dsp:spPr>
-        <a:xfrm>
-          <a:off x="3254279" y="1195281"/>
-          <a:ext cx="91440" cy="1007876"/>
-        </a:xfrm>
-        <a:custGeom>
-          <a:avLst/>
-          <a:gdLst/>
-          <a:ahLst/>
-          <a:cxnLst/>
-          <a:rect l="0" t="0" r="0" b="0"/>
-          <a:pathLst>
-            <a:path>
-              <a:moveTo>
-                <a:pt x="45720" y="0"/>
-              </a:moveTo>
-              <a:lnTo>
-                <a:pt x="45720" y="1007876"/>
-              </a:lnTo>
-              <a:lnTo>
-                <a:pt x="126135" y="1007876"/>
-              </a:lnTo>
-            </a:path>
-          </a:pathLst>
-        </a:custGeom>
-        <a:noFill/>
-        <a:ln w="19050" cap="flat" cmpd="sng" algn="ctr">
-          <a:solidFill>
-            <a:schemeClr val="accent3">
-              <a:hueOff val="0"/>
-              <a:satOff val="0"/>
-              <a:lumOff val="0"/>
-              <a:alphaOff val="0"/>
-            </a:schemeClr>
-          </a:solidFill>
-          <a:prstDash val="solid"/>
-          <a:miter lim="800000"/>
-        </a:ln>
-        <a:effectLst/>
-      </dsp:spPr>
-      <dsp:style>
-        <a:lnRef idx="2">
-          <a:scrgbClr r="0" g="0" b="0"/>
-        </a:lnRef>
-        <a:fillRef idx="0">
-          <a:scrgbClr r="0" g="0" b="0"/>
-        </a:fillRef>
-        <a:effectRef idx="0">
-          <a:scrgbClr r="0" g="0" b="0"/>
-        </a:effectRef>
-        <a:fontRef idx="minor"/>
-      </dsp:style>
-    </dsp:sp>
     <dsp:sp modelId="{7F8A3ECB-5AF5-4B8C-B170-FADCE0A00CE7}">
       <dsp:nvSpPr>
         <dsp:cNvPr id="0" name=""/>
@@ -21563,7 +23034,7 @@
       </dsp:nvSpPr>
       <dsp:spPr>
         <a:xfrm>
-          <a:off x="3254279" y="1195281"/>
+          <a:off x="3254279" y="1385598"/>
           <a:ext cx="91440" cy="627242"/>
         </a:xfrm>
         <a:custGeom>
@@ -21621,7 +23092,7 @@
       </dsp:nvSpPr>
       <dsp:spPr>
         <a:xfrm>
-          <a:off x="3254279" y="1195281"/>
+          <a:off x="3254279" y="1385598"/>
           <a:ext cx="91440" cy="246608"/>
         </a:xfrm>
         <a:custGeom>
@@ -21679,7 +23150,7 @@
       </dsp:nvSpPr>
       <dsp:spPr>
         <a:xfrm>
-          <a:off x="2865755" y="814647"/>
+          <a:off x="2865755" y="1004964"/>
           <a:ext cx="648686" cy="112581"/>
         </a:xfrm>
         <a:custGeom>
@@ -21740,7 +23211,7 @@
       </dsp:nvSpPr>
       <dsp:spPr>
         <a:xfrm>
-          <a:off x="2820035" y="814647"/>
+          <a:off x="2820035" y="1004964"/>
           <a:ext cx="91440" cy="112581"/>
         </a:xfrm>
         <a:custGeom>
@@ -21795,7 +23266,7 @@
       </dsp:nvSpPr>
       <dsp:spPr>
         <a:xfrm>
-          <a:off x="2217068" y="814647"/>
+          <a:off x="2217068" y="1004964"/>
           <a:ext cx="648686" cy="112581"/>
         </a:xfrm>
         <a:custGeom>
@@ -21856,7 +23327,7 @@
       </dsp:nvSpPr>
       <dsp:spPr>
         <a:xfrm>
-          <a:off x="1568381" y="814647"/>
+          <a:off x="1568381" y="1004964"/>
           <a:ext cx="1297373" cy="112581"/>
         </a:xfrm>
         <a:custGeom>
@@ -21917,7 +23388,7 @@
       </dsp:nvSpPr>
       <dsp:spPr>
         <a:xfrm>
-          <a:off x="919695" y="814647"/>
+          <a:off x="919695" y="1004964"/>
           <a:ext cx="1946059" cy="112581"/>
         </a:xfrm>
         <a:custGeom>
@@ -21978,7 +23449,7 @@
       </dsp:nvSpPr>
       <dsp:spPr>
         <a:xfrm>
-          <a:off x="10846" y="1195281"/>
+          <a:off x="10846" y="1385598"/>
           <a:ext cx="91440" cy="246608"/>
         </a:xfrm>
         <a:custGeom>
@@ -22036,7 +23507,7 @@
       </dsp:nvSpPr>
       <dsp:spPr>
         <a:xfrm>
-          <a:off x="271008" y="814647"/>
+          <a:off x="271008" y="1004964"/>
           <a:ext cx="2594746" cy="112581"/>
         </a:xfrm>
         <a:custGeom>
@@ -22097,7 +23568,7 @@
       </dsp:nvSpPr>
       <dsp:spPr>
         <a:xfrm>
-          <a:off x="2597702" y="546594"/>
+          <a:off x="2597702" y="736911"/>
           <a:ext cx="536104" cy="268052"/>
         </a:xfrm>
         <a:prstGeom prst="rect">
@@ -22167,12 +23638,12 @@
         </a:fontRef>
       </dsp:style>
       <dsp:txBody>
-        <a:bodyPr spcFirstLastPara="0" vert="horz" wrap="square" lIns="5080" tIns="5080" rIns="5080" bIns="5080" numCol="1" spcCol="1270" anchor="ctr" anchorCtr="0">
+        <a:bodyPr spcFirstLastPara="0" vert="horz" wrap="square" lIns="5715" tIns="5715" rIns="5715" bIns="5715" numCol="1" spcCol="1270" anchor="ctr" anchorCtr="0">
           <a:noAutofit/>
         </a:bodyPr>
         <a:lstStyle/>
         <a:p>
-          <a:pPr marL="0" lvl="0" indent="0" algn="ctr" defTabSz="355600">
+          <a:pPr marL="0" lvl="0" indent="0" algn="ctr" defTabSz="400050">
             <a:lnSpc>
               <a:spcPct val="90000"/>
             </a:lnSpc>
@@ -22185,13 +23656,13 @@
             <a:buNone/>
           </a:pPr>
           <a:r>
-            <a:rPr lang="en-GB" sz="800" kern="1200"/>
+            <a:rPr lang="en-GB" sz="900" kern="1200"/>
             <a:t>Home</a:t>
           </a:r>
         </a:p>
       </dsp:txBody>
       <dsp:txXfrm>
-        <a:off x="2597702" y="546594"/>
+        <a:off x="2597702" y="736911"/>
         <a:ext cx="536104" cy="268052"/>
       </dsp:txXfrm>
     </dsp:sp>
@@ -22202,7 +23673,7 @@
       </dsp:nvSpPr>
       <dsp:spPr>
         <a:xfrm>
-          <a:off x="2956" y="927229"/>
+          <a:off x="2956" y="1117546"/>
           <a:ext cx="536104" cy="268052"/>
         </a:xfrm>
         <a:prstGeom prst="rect">
@@ -22272,12 +23743,12 @@
         </a:fontRef>
       </dsp:style>
       <dsp:txBody>
-        <a:bodyPr spcFirstLastPara="0" vert="horz" wrap="square" lIns="5080" tIns="5080" rIns="5080" bIns="5080" numCol="1" spcCol="1270" anchor="ctr" anchorCtr="0">
+        <a:bodyPr spcFirstLastPara="0" vert="horz" wrap="square" lIns="5715" tIns="5715" rIns="5715" bIns="5715" numCol="1" spcCol="1270" anchor="ctr" anchorCtr="0">
           <a:noAutofit/>
         </a:bodyPr>
         <a:lstStyle/>
         <a:p>
-          <a:pPr marL="0" lvl="0" indent="0" algn="ctr" defTabSz="355600">
+          <a:pPr marL="0" lvl="0" indent="0" algn="ctr" defTabSz="400050">
             <a:lnSpc>
               <a:spcPct val="90000"/>
             </a:lnSpc>
@@ -22290,13 +23761,13 @@
             <a:buNone/>
           </a:pPr>
           <a:r>
-            <a:rPr lang="en-GB" sz="800" kern="1200"/>
+            <a:rPr lang="en-GB" sz="900" kern="1200"/>
             <a:t>Products</a:t>
           </a:r>
         </a:p>
       </dsp:txBody>
       <dsp:txXfrm>
-        <a:off x="2956" y="927229"/>
+        <a:off x="2956" y="1117546"/>
         <a:ext cx="536104" cy="268052"/>
       </dsp:txXfrm>
     </dsp:sp>
@@ -22307,7 +23778,7 @@
       </dsp:nvSpPr>
       <dsp:spPr>
         <a:xfrm>
-          <a:off x="136982" y="1307863"/>
+          <a:off x="136982" y="1498180"/>
           <a:ext cx="536104" cy="268052"/>
         </a:xfrm>
         <a:prstGeom prst="rect">
@@ -22377,12 +23848,12 @@
         </a:fontRef>
       </dsp:style>
       <dsp:txBody>
-        <a:bodyPr spcFirstLastPara="0" vert="horz" wrap="square" lIns="5080" tIns="5080" rIns="5080" bIns="5080" numCol="1" spcCol="1270" anchor="ctr" anchorCtr="0">
+        <a:bodyPr spcFirstLastPara="0" vert="horz" wrap="square" lIns="5715" tIns="5715" rIns="5715" bIns="5715" numCol="1" spcCol="1270" anchor="ctr" anchorCtr="0">
           <a:noAutofit/>
         </a:bodyPr>
         <a:lstStyle/>
         <a:p>
-          <a:pPr marL="0" lvl="0" indent="0" algn="ctr" defTabSz="355600">
+          <a:pPr marL="0" lvl="0" indent="0" algn="ctr" defTabSz="400050">
             <a:lnSpc>
               <a:spcPct val="90000"/>
             </a:lnSpc>
@@ -22395,13 +23866,13 @@
             <a:buNone/>
           </a:pPr>
           <a:r>
-            <a:rPr lang="en-GB" sz="800" kern="1200"/>
+            <a:rPr lang="en-GB" sz="900" kern="1200"/>
             <a:t>Product</a:t>
           </a:r>
         </a:p>
       </dsp:txBody>
       <dsp:txXfrm>
-        <a:off x="136982" y="1307863"/>
+        <a:off x="136982" y="1498180"/>
         <a:ext cx="536104" cy="268052"/>
       </dsp:txXfrm>
     </dsp:sp>
@@ -22412,7 +23883,7 @@
       </dsp:nvSpPr>
       <dsp:spPr>
         <a:xfrm>
-          <a:off x="651642" y="927229"/>
+          <a:off x="651642" y="1117546"/>
           <a:ext cx="536104" cy="268052"/>
         </a:xfrm>
         <a:prstGeom prst="rect">
@@ -22482,12 +23953,12 @@
         </a:fontRef>
       </dsp:style>
       <dsp:txBody>
-        <a:bodyPr spcFirstLastPara="0" vert="horz" wrap="square" lIns="5080" tIns="5080" rIns="5080" bIns="5080" numCol="1" spcCol="1270" anchor="ctr" anchorCtr="0">
+        <a:bodyPr spcFirstLastPara="0" vert="horz" wrap="square" lIns="5715" tIns="5715" rIns="5715" bIns="5715" numCol="1" spcCol="1270" anchor="ctr" anchorCtr="0">
           <a:noAutofit/>
         </a:bodyPr>
         <a:lstStyle/>
         <a:p>
-          <a:pPr marL="0" lvl="0" indent="0" algn="ctr" defTabSz="355600">
+          <a:pPr marL="0" lvl="0" indent="0" algn="ctr" defTabSz="400050">
             <a:lnSpc>
               <a:spcPct val="90000"/>
             </a:lnSpc>
@@ -22500,13 +23971,13 @@
             <a:buNone/>
           </a:pPr>
           <a:r>
-            <a:rPr lang="en-GB" sz="800" kern="1200"/>
+            <a:rPr lang="en-GB" sz="900" kern="1200"/>
             <a:t>Our producers</a:t>
           </a:r>
         </a:p>
       </dsp:txBody>
       <dsp:txXfrm>
-        <a:off x="651642" y="927229"/>
+        <a:off x="651642" y="1117546"/>
         <a:ext cx="536104" cy="268052"/>
       </dsp:txXfrm>
     </dsp:sp>
@@ -22517,7 +23988,7 @@
       </dsp:nvSpPr>
       <dsp:spPr>
         <a:xfrm>
-          <a:off x="1300329" y="927229"/>
+          <a:off x="1300329" y="1117546"/>
           <a:ext cx="536104" cy="268052"/>
         </a:xfrm>
         <a:prstGeom prst="rect">
@@ -22587,12 +24058,12 @@
         </a:fontRef>
       </dsp:style>
       <dsp:txBody>
-        <a:bodyPr spcFirstLastPara="0" vert="horz" wrap="square" lIns="5080" tIns="5080" rIns="5080" bIns="5080" numCol="1" spcCol="1270" anchor="ctr" anchorCtr="0">
+        <a:bodyPr spcFirstLastPara="0" vert="horz" wrap="square" lIns="5715" tIns="5715" rIns="5715" bIns="5715" numCol="1" spcCol="1270" anchor="ctr" anchorCtr="0">
           <a:noAutofit/>
         </a:bodyPr>
         <a:lstStyle/>
         <a:p>
-          <a:pPr marL="0" lvl="0" indent="0" algn="ctr" defTabSz="355600">
+          <a:pPr marL="0" lvl="0" indent="0" algn="ctr" defTabSz="400050">
             <a:lnSpc>
               <a:spcPct val="90000"/>
             </a:lnSpc>
@@ -22605,13 +24076,13 @@
             <a:buNone/>
           </a:pPr>
           <a:r>
-            <a:rPr lang="en-GB" sz="800" kern="1200"/>
+            <a:rPr lang="en-GB" sz="900" kern="1200"/>
             <a:t>Order</a:t>
           </a:r>
         </a:p>
       </dsp:txBody>
       <dsp:txXfrm>
-        <a:off x="1300329" y="927229"/>
+        <a:off x="1300329" y="1117546"/>
         <a:ext cx="536104" cy="268052"/>
       </dsp:txXfrm>
     </dsp:sp>
@@ -22622,7 +24093,7 @@
       </dsp:nvSpPr>
       <dsp:spPr>
         <a:xfrm>
-          <a:off x="1949015" y="927229"/>
+          <a:off x="1949015" y="1117546"/>
           <a:ext cx="536104" cy="268052"/>
         </a:xfrm>
         <a:prstGeom prst="rect">
@@ -22692,12 +24163,12 @@
         </a:fontRef>
       </dsp:style>
       <dsp:txBody>
-        <a:bodyPr spcFirstLastPara="0" vert="horz" wrap="square" lIns="5080" tIns="5080" rIns="5080" bIns="5080" numCol="1" spcCol="1270" anchor="ctr" anchorCtr="0">
+        <a:bodyPr spcFirstLastPara="0" vert="horz" wrap="square" lIns="5715" tIns="5715" rIns="5715" bIns="5715" numCol="1" spcCol="1270" anchor="ctr" anchorCtr="0">
           <a:noAutofit/>
         </a:bodyPr>
         <a:lstStyle/>
         <a:p>
-          <a:pPr marL="0" lvl="0" indent="0" algn="ctr" defTabSz="355600">
+          <a:pPr marL="0" lvl="0" indent="0" algn="ctr" defTabSz="400050">
             <a:lnSpc>
               <a:spcPct val="90000"/>
             </a:lnSpc>
@@ -22710,13 +24181,13 @@
             <a:buNone/>
           </a:pPr>
           <a:r>
-            <a:rPr lang="en-GB" sz="800" kern="1200"/>
+            <a:rPr lang="en-GB" sz="900" kern="1200"/>
             <a:t>My orders</a:t>
           </a:r>
         </a:p>
       </dsp:txBody>
       <dsp:txXfrm>
-        <a:off x="1949015" y="927229"/>
+        <a:off x="1949015" y="1117546"/>
         <a:ext cx="536104" cy="268052"/>
       </dsp:txXfrm>
     </dsp:sp>
@@ -22727,7 +24198,7 @@
       </dsp:nvSpPr>
       <dsp:spPr>
         <a:xfrm>
-          <a:off x="2597702" y="927229"/>
+          <a:off x="2597702" y="1117546"/>
           <a:ext cx="536104" cy="268052"/>
         </a:xfrm>
         <a:prstGeom prst="rect">
@@ -22797,12 +24268,12 @@
         </a:fontRef>
       </dsp:style>
       <dsp:txBody>
-        <a:bodyPr spcFirstLastPara="0" vert="horz" wrap="square" lIns="5080" tIns="5080" rIns="5080" bIns="5080" numCol="1" spcCol="1270" anchor="ctr" anchorCtr="0">
+        <a:bodyPr spcFirstLastPara="0" vert="horz" wrap="square" lIns="5715" tIns="5715" rIns="5715" bIns="5715" numCol="1" spcCol="1270" anchor="ctr" anchorCtr="0">
           <a:noAutofit/>
         </a:bodyPr>
         <a:lstStyle/>
         <a:p>
-          <a:pPr marL="0" lvl="0" indent="0" algn="ctr" defTabSz="355600">
+          <a:pPr marL="0" lvl="0" indent="0" algn="ctr" defTabSz="400050">
             <a:lnSpc>
               <a:spcPct val="90000"/>
             </a:lnSpc>
@@ -22815,13 +24286,13 @@
             <a:buNone/>
           </a:pPr>
           <a:r>
-            <a:rPr lang="en-GB" sz="800" kern="1200"/>
+            <a:rPr lang="en-GB" sz="900" kern="1200"/>
             <a:t>My basket</a:t>
           </a:r>
         </a:p>
       </dsp:txBody>
       <dsp:txXfrm>
-        <a:off x="2597702" y="927229"/>
+        <a:off x="2597702" y="1117546"/>
         <a:ext cx="536104" cy="268052"/>
       </dsp:txXfrm>
     </dsp:sp>
@@ -22832,7 +24303,7 @@
       </dsp:nvSpPr>
       <dsp:spPr>
         <a:xfrm>
-          <a:off x="3246389" y="927229"/>
+          <a:off x="3246389" y="1117546"/>
           <a:ext cx="536104" cy="268052"/>
         </a:xfrm>
         <a:prstGeom prst="rect">
@@ -22902,12 +24373,12 @@
         </a:fontRef>
       </dsp:style>
       <dsp:txBody>
-        <a:bodyPr spcFirstLastPara="0" vert="horz" wrap="square" lIns="5080" tIns="5080" rIns="5080" bIns="5080" numCol="1" spcCol="1270" anchor="ctr" anchorCtr="0">
+        <a:bodyPr spcFirstLastPara="0" vert="horz" wrap="square" lIns="5715" tIns="5715" rIns="5715" bIns="5715" numCol="1" spcCol="1270" anchor="ctr" anchorCtr="0">
           <a:noAutofit/>
         </a:bodyPr>
         <a:lstStyle/>
         <a:p>
-          <a:pPr marL="0" lvl="0" indent="0" algn="ctr" defTabSz="355600">
+          <a:pPr marL="0" lvl="0" indent="0" algn="ctr" defTabSz="400050">
             <a:lnSpc>
               <a:spcPct val="90000"/>
             </a:lnSpc>
@@ -22920,13 +24391,13 @@
             <a:buNone/>
           </a:pPr>
           <a:r>
-            <a:rPr lang="en-GB" sz="800" kern="1200"/>
+            <a:rPr lang="en-GB" sz="900" kern="1200"/>
             <a:t>Dashboard</a:t>
           </a:r>
         </a:p>
       </dsp:txBody>
       <dsp:txXfrm>
-        <a:off x="3246389" y="927229"/>
+        <a:off x="3246389" y="1117546"/>
         <a:ext cx="536104" cy="268052"/>
       </dsp:txXfrm>
     </dsp:sp>
@@ -22937,7 +24408,7 @@
       </dsp:nvSpPr>
       <dsp:spPr>
         <a:xfrm>
-          <a:off x="3380415" y="1307863"/>
+          <a:off x="3380415" y="1498180"/>
           <a:ext cx="536104" cy="268052"/>
         </a:xfrm>
         <a:prstGeom prst="rect">
@@ -23007,12 +24478,12 @@
         </a:fontRef>
       </dsp:style>
       <dsp:txBody>
-        <a:bodyPr spcFirstLastPara="0" vert="horz" wrap="square" lIns="5080" tIns="5080" rIns="5080" bIns="5080" numCol="1" spcCol="1270" anchor="ctr" anchorCtr="0">
+        <a:bodyPr spcFirstLastPara="0" vert="horz" wrap="square" lIns="5715" tIns="5715" rIns="5715" bIns="5715" numCol="1" spcCol="1270" anchor="ctr" anchorCtr="0">
           <a:noAutofit/>
         </a:bodyPr>
         <a:lstStyle/>
         <a:p>
-          <a:pPr marL="0" lvl="0" indent="0" algn="ctr" defTabSz="355600">
+          <a:pPr marL="0" lvl="0" indent="0" algn="ctr" defTabSz="400050">
             <a:lnSpc>
               <a:spcPct val="90000"/>
             </a:lnSpc>
@@ -23025,13 +24496,13 @@
             <a:buNone/>
           </a:pPr>
           <a:r>
-            <a:rPr lang="en-GB" sz="800" kern="1200"/>
+            <a:rPr lang="en-GB" sz="900" kern="1200"/>
             <a:t>Create product</a:t>
           </a:r>
         </a:p>
       </dsp:txBody>
       <dsp:txXfrm>
-        <a:off x="3380415" y="1307863"/>
+        <a:off x="3380415" y="1498180"/>
         <a:ext cx="536104" cy="268052"/>
       </dsp:txXfrm>
     </dsp:sp>
@@ -23042,7 +24513,7 @@
       </dsp:nvSpPr>
       <dsp:spPr>
         <a:xfrm>
-          <a:off x="3380415" y="1688497"/>
+          <a:off x="3380415" y="1878814"/>
           <a:ext cx="536104" cy="268052"/>
         </a:xfrm>
         <a:prstGeom prst="rect">
@@ -23112,12 +24583,12 @@
         </a:fontRef>
       </dsp:style>
       <dsp:txBody>
-        <a:bodyPr spcFirstLastPara="0" vert="horz" wrap="square" lIns="5080" tIns="5080" rIns="5080" bIns="5080" numCol="1" spcCol="1270" anchor="ctr" anchorCtr="0">
+        <a:bodyPr spcFirstLastPara="0" vert="horz" wrap="square" lIns="5715" tIns="5715" rIns="5715" bIns="5715" numCol="1" spcCol="1270" anchor="ctr" anchorCtr="0">
           <a:noAutofit/>
         </a:bodyPr>
         <a:lstStyle/>
         <a:p>
-          <a:pPr marL="0" lvl="0" indent="0" algn="ctr" defTabSz="355600">
+          <a:pPr marL="0" lvl="0" indent="0" algn="ctr" defTabSz="400050">
             <a:lnSpc>
               <a:spcPct val="90000"/>
             </a:lnSpc>
@@ -23130,24 +24601,129 @@
             <a:buNone/>
           </a:pPr>
           <a:r>
-            <a:rPr lang="en-GB" sz="800" kern="1200"/>
+            <a:rPr lang="en-GB" sz="900" kern="1200"/>
             <a:t>Edit product</a:t>
           </a:r>
         </a:p>
       </dsp:txBody>
       <dsp:txXfrm>
-        <a:off x="3380415" y="1688497"/>
+        <a:off x="3380415" y="1878814"/>
         <a:ext cx="536104" cy="268052"/>
       </dsp:txXfrm>
     </dsp:sp>
-    <dsp:sp modelId="{C50D2B72-7969-45AE-84DC-85DE4BE402C8}">
+    <dsp:sp modelId="{915E890D-BE2B-4C3A-89E3-BC9B2B83EA55}">
       <dsp:nvSpPr>
         <dsp:cNvPr id="0" name=""/>
         <dsp:cNvSpPr/>
       </dsp:nvSpPr>
       <dsp:spPr>
         <a:xfrm>
-          <a:off x="3380415" y="2069131"/>
+          <a:off x="3895075" y="1117546"/>
+          <a:ext cx="536104" cy="268052"/>
+        </a:xfrm>
+        <a:prstGeom prst="rect">
+          <a:avLst/>
+        </a:prstGeom>
+        <a:gradFill rotWithShape="0">
+          <a:gsLst>
+            <a:gs pos="0">
+              <a:schemeClr val="accent2">
+                <a:hueOff val="0"/>
+                <a:satOff val="0"/>
+                <a:lumOff val="0"/>
+                <a:alphaOff val="0"/>
+                <a:satMod val="103000"/>
+                <a:lumMod val="102000"/>
+                <a:tint val="94000"/>
+              </a:schemeClr>
+            </a:gs>
+            <a:gs pos="50000">
+              <a:schemeClr val="accent2">
+                <a:hueOff val="0"/>
+                <a:satOff val="0"/>
+                <a:lumOff val="0"/>
+                <a:alphaOff val="0"/>
+                <a:satMod val="110000"/>
+                <a:lumMod val="100000"/>
+                <a:shade val="100000"/>
+              </a:schemeClr>
+            </a:gs>
+            <a:gs pos="100000">
+              <a:schemeClr val="accent2">
+                <a:hueOff val="0"/>
+                <a:satOff val="0"/>
+                <a:lumOff val="0"/>
+                <a:alphaOff val="0"/>
+                <a:lumMod val="99000"/>
+                <a:satMod val="120000"/>
+                <a:shade val="78000"/>
+              </a:schemeClr>
+            </a:gs>
+          </a:gsLst>
+          <a:lin ang="5400000" scaled="0"/>
+        </a:gradFill>
+        <a:ln>
+          <a:noFill/>
+        </a:ln>
+        <a:effectLst>
+          <a:outerShdw blurRad="57150" dist="19050" dir="5400000" algn="ctr" rotWithShape="0">
+            <a:srgbClr val="000000">
+              <a:alpha val="63000"/>
+            </a:srgbClr>
+          </a:outerShdw>
+        </a:effectLst>
+      </dsp:spPr>
+      <dsp:style>
+        <a:lnRef idx="0">
+          <a:scrgbClr r="0" g="0" b="0"/>
+        </a:lnRef>
+        <a:fillRef idx="3">
+          <a:scrgbClr r="0" g="0" b="0"/>
+        </a:fillRef>
+        <a:effectRef idx="3">
+          <a:scrgbClr r="0" g="0" b="0"/>
+        </a:effectRef>
+        <a:fontRef idx="minor">
+          <a:schemeClr val="lt1"/>
+        </a:fontRef>
+      </dsp:style>
+      <dsp:txBody>
+        <a:bodyPr spcFirstLastPara="0" vert="horz" wrap="square" lIns="5715" tIns="5715" rIns="5715" bIns="5715" numCol="1" spcCol="1270" anchor="ctr" anchorCtr="0">
+          <a:noAutofit/>
+        </a:bodyPr>
+        <a:lstStyle/>
+        <a:p>
+          <a:pPr marL="0" lvl="0" indent="0" algn="ctr" defTabSz="400050">
+            <a:lnSpc>
+              <a:spcPct val="90000"/>
+            </a:lnSpc>
+            <a:spcBef>
+              <a:spcPct val="0"/>
+            </a:spcBef>
+            <a:spcAft>
+              <a:spcPct val="35000"/>
+            </a:spcAft>
+            <a:buNone/>
+          </a:pPr>
+          <a:r>
+            <a:rPr lang="en-GB" sz="900" kern="1200"/>
+            <a:t>Policies</a:t>
+          </a:r>
+        </a:p>
+      </dsp:txBody>
+      <dsp:txXfrm>
+        <a:off x="3895075" y="1117546"/>
+        <a:ext cx="536104" cy="268052"/>
+      </dsp:txXfrm>
+    </dsp:sp>
+    <dsp:sp modelId="{836C6218-4EE0-4640-8630-ABE1046ACD36}">
+      <dsp:nvSpPr>
+        <dsp:cNvPr id="0" name=""/>
+        <dsp:cNvSpPr/>
+      </dsp:nvSpPr>
+      <dsp:spPr>
+        <a:xfrm>
+          <a:off x="4029102" y="1498180"/>
           <a:ext cx="536104" cy="268052"/>
         </a:xfrm>
         <a:prstGeom prst="rect">
@@ -23217,12 +24793,12 @@
         </a:fontRef>
       </dsp:style>
       <dsp:txBody>
-        <a:bodyPr spcFirstLastPara="0" vert="horz" wrap="square" lIns="5080" tIns="5080" rIns="5080" bIns="5080" numCol="1" spcCol="1270" anchor="ctr" anchorCtr="0">
+        <a:bodyPr spcFirstLastPara="0" vert="horz" wrap="square" lIns="5715" tIns="5715" rIns="5715" bIns="5715" numCol="1" spcCol="1270" anchor="ctr" anchorCtr="0">
           <a:noAutofit/>
         </a:bodyPr>
         <a:lstStyle/>
         <a:p>
-          <a:pPr marL="0" lvl="0" indent="0" algn="ctr" defTabSz="355600">
+          <a:pPr marL="0" lvl="0" indent="0" algn="ctr" defTabSz="400050">
             <a:lnSpc>
               <a:spcPct val="90000"/>
             </a:lnSpc>
@@ -23235,24 +24811,24 @@
             <a:buNone/>
           </a:pPr>
           <a:r>
-            <a:rPr lang="en-GB" sz="800" kern="1200"/>
-            <a:t>Delete product</a:t>
+            <a:rPr lang="en-GB" sz="900" kern="1200"/>
+            <a:t>Privacy</a:t>
           </a:r>
         </a:p>
       </dsp:txBody>
       <dsp:txXfrm>
-        <a:off x="3380415" y="2069131"/>
+        <a:off x="4029102" y="1498180"/>
         <a:ext cx="536104" cy="268052"/>
       </dsp:txXfrm>
     </dsp:sp>
-    <dsp:sp modelId="{915E890D-BE2B-4C3A-89E3-BC9B2B83EA55}">
+    <dsp:sp modelId="{F6833E12-977C-4334-851C-493A685081D0}">
       <dsp:nvSpPr>
         <dsp:cNvPr id="0" name=""/>
         <dsp:cNvSpPr/>
       </dsp:nvSpPr>
       <dsp:spPr>
         <a:xfrm>
-          <a:off x="3895075" y="927229"/>
+          <a:off x="4543762" y="1117546"/>
           <a:ext cx="536104" cy="268052"/>
         </a:xfrm>
         <a:prstGeom prst="rect">
@@ -23322,12 +24898,12 @@
         </a:fontRef>
       </dsp:style>
       <dsp:txBody>
-        <a:bodyPr spcFirstLastPara="0" vert="horz" wrap="square" lIns="5080" tIns="5080" rIns="5080" bIns="5080" numCol="1" spcCol="1270" anchor="ctr" anchorCtr="0">
+        <a:bodyPr spcFirstLastPara="0" vert="horz" wrap="square" lIns="5715" tIns="5715" rIns="5715" bIns="5715" numCol="1" spcCol="1270" anchor="ctr" anchorCtr="0">
           <a:noAutofit/>
         </a:bodyPr>
         <a:lstStyle/>
         <a:p>
-          <a:pPr marL="0" lvl="0" indent="0" algn="ctr" defTabSz="355600">
+          <a:pPr marL="0" lvl="0" indent="0" algn="ctr" defTabSz="400050">
             <a:lnSpc>
               <a:spcPct val="90000"/>
             </a:lnSpc>
@@ -23340,129 +24916,24 @@
             <a:buNone/>
           </a:pPr>
           <a:r>
-            <a:rPr lang="en-GB" sz="800" kern="1200"/>
-            <a:t>Policies</a:t>
+            <a:rPr lang="en-GB" sz="900" kern="1200"/>
+            <a:t>Register</a:t>
           </a:r>
         </a:p>
       </dsp:txBody>
       <dsp:txXfrm>
-        <a:off x="3895075" y="927229"/>
+        <a:off x="4543762" y="1117546"/>
         <a:ext cx="536104" cy="268052"/>
       </dsp:txXfrm>
     </dsp:sp>
-    <dsp:sp modelId="{836C6218-4EE0-4640-8630-ABE1046ACD36}">
+    <dsp:sp modelId="{980BB85B-A217-4A5D-9CB7-5AF30C46DB16}">
       <dsp:nvSpPr>
         <dsp:cNvPr id="0" name=""/>
         <dsp:cNvSpPr/>
       </dsp:nvSpPr>
       <dsp:spPr>
         <a:xfrm>
-          <a:off x="4029102" y="1307863"/>
-          <a:ext cx="536104" cy="268052"/>
-        </a:xfrm>
-        <a:prstGeom prst="rect">
-          <a:avLst/>
-        </a:prstGeom>
-        <a:gradFill rotWithShape="0">
-          <a:gsLst>
-            <a:gs pos="0">
-              <a:schemeClr val="accent3">
-                <a:hueOff val="0"/>
-                <a:satOff val="0"/>
-                <a:lumOff val="0"/>
-                <a:alphaOff val="0"/>
-                <a:satMod val="103000"/>
-                <a:lumMod val="102000"/>
-                <a:tint val="94000"/>
-              </a:schemeClr>
-            </a:gs>
-            <a:gs pos="50000">
-              <a:schemeClr val="accent3">
-                <a:hueOff val="0"/>
-                <a:satOff val="0"/>
-                <a:lumOff val="0"/>
-                <a:alphaOff val="0"/>
-                <a:satMod val="110000"/>
-                <a:lumMod val="100000"/>
-                <a:shade val="100000"/>
-              </a:schemeClr>
-            </a:gs>
-            <a:gs pos="100000">
-              <a:schemeClr val="accent3">
-                <a:hueOff val="0"/>
-                <a:satOff val="0"/>
-                <a:lumOff val="0"/>
-                <a:alphaOff val="0"/>
-                <a:lumMod val="99000"/>
-                <a:satMod val="120000"/>
-                <a:shade val="78000"/>
-              </a:schemeClr>
-            </a:gs>
-          </a:gsLst>
-          <a:lin ang="5400000" scaled="0"/>
-        </a:gradFill>
-        <a:ln>
-          <a:noFill/>
-        </a:ln>
-        <a:effectLst>
-          <a:outerShdw blurRad="57150" dist="19050" dir="5400000" algn="ctr" rotWithShape="0">
-            <a:srgbClr val="000000">
-              <a:alpha val="63000"/>
-            </a:srgbClr>
-          </a:outerShdw>
-        </a:effectLst>
-      </dsp:spPr>
-      <dsp:style>
-        <a:lnRef idx="0">
-          <a:scrgbClr r="0" g="0" b="0"/>
-        </a:lnRef>
-        <a:fillRef idx="3">
-          <a:scrgbClr r="0" g="0" b="0"/>
-        </a:fillRef>
-        <a:effectRef idx="3">
-          <a:scrgbClr r="0" g="0" b="0"/>
-        </a:effectRef>
-        <a:fontRef idx="minor">
-          <a:schemeClr val="lt1"/>
-        </a:fontRef>
-      </dsp:style>
-      <dsp:txBody>
-        <a:bodyPr spcFirstLastPara="0" vert="horz" wrap="square" lIns="5080" tIns="5080" rIns="5080" bIns="5080" numCol="1" spcCol="1270" anchor="ctr" anchorCtr="0">
-          <a:noAutofit/>
-        </a:bodyPr>
-        <a:lstStyle/>
-        <a:p>
-          <a:pPr marL="0" lvl="0" indent="0" algn="ctr" defTabSz="355600">
-            <a:lnSpc>
-              <a:spcPct val="90000"/>
-            </a:lnSpc>
-            <a:spcBef>
-              <a:spcPct val="0"/>
-            </a:spcBef>
-            <a:spcAft>
-              <a:spcPct val="35000"/>
-            </a:spcAft>
-            <a:buNone/>
-          </a:pPr>
-          <a:r>
-            <a:rPr lang="en-GB" sz="800" kern="1200"/>
-            <a:t>Privacy</a:t>
-          </a:r>
-        </a:p>
-      </dsp:txBody>
-      <dsp:txXfrm>
-        <a:off x="4029102" y="1307863"/>
-        <a:ext cx="536104" cy="268052"/>
-      </dsp:txXfrm>
-    </dsp:sp>
-    <dsp:sp modelId="{F6833E12-977C-4334-851C-493A685081D0}">
-      <dsp:nvSpPr>
-        <dsp:cNvPr id="0" name=""/>
-        <dsp:cNvSpPr/>
-      </dsp:nvSpPr>
-      <dsp:spPr>
-        <a:xfrm>
-          <a:off x="4543762" y="927229"/>
+          <a:off x="5192449" y="1117546"/>
           <a:ext cx="536104" cy="268052"/>
         </a:xfrm>
         <a:prstGeom prst="rect">
@@ -23532,12 +25003,12 @@
         </a:fontRef>
       </dsp:style>
       <dsp:txBody>
-        <a:bodyPr spcFirstLastPara="0" vert="horz" wrap="square" lIns="5080" tIns="5080" rIns="5080" bIns="5080" numCol="1" spcCol="1270" anchor="ctr" anchorCtr="0">
+        <a:bodyPr spcFirstLastPara="0" vert="horz" wrap="square" lIns="5715" tIns="5715" rIns="5715" bIns="5715" numCol="1" spcCol="1270" anchor="ctr" anchorCtr="0">
           <a:noAutofit/>
         </a:bodyPr>
         <a:lstStyle/>
         <a:p>
-          <a:pPr marL="0" lvl="0" indent="0" algn="ctr" defTabSz="355600">
+          <a:pPr marL="0" lvl="0" indent="0" algn="ctr" defTabSz="400050">
             <a:lnSpc>
               <a:spcPct val="90000"/>
             </a:lnSpc>
@@ -23550,118 +25021,13 @@
             <a:buNone/>
           </a:pPr>
           <a:r>
-            <a:rPr lang="en-GB" sz="800" kern="1200"/>
-            <a:t>Register</a:t>
-          </a:r>
-        </a:p>
-      </dsp:txBody>
-      <dsp:txXfrm>
-        <a:off x="4543762" y="927229"/>
-        <a:ext cx="536104" cy="268052"/>
-      </dsp:txXfrm>
-    </dsp:sp>
-    <dsp:sp modelId="{980BB85B-A217-4A5D-9CB7-5AF30C46DB16}">
-      <dsp:nvSpPr>
-        <dsp:cNvPr id="0" name=""/>
-        <dsp:cNvSpPr/>
-      </dsp:nvSpPr>
-      <dsp:spPr>
-        <a:xfrm>
-          <a:off x="5192449" y="927229"/>
-          <a:ext cx="536104" cy="268052"/>
-        </a:xfrm>
-        <a:prstGeom prst="rect">
-          <a:avLst/>
-        </a:prstGeom>
-        <a:gradFill rotWithShape="0">
-          <a:gsLst>
-            <a:gs pos="0">
-              <a:schemeClr val="accent2">
-                <a:hueOff val="0"/>
-                <a:satOff val="0"/>
-                <a:lumOff val="0"/>
-                <a:alphaOff val="0"/>
-                <a:satMod val="103000"/>
-                <a:lumMod val="102000"/>
-                <a:tint val="94000"/>
-              </a:schemeClr>
-            </a:gs>
-            <a:gs pos="50000">
-              <a:schemeClr val="accent2">
-                <a:hueOff val="0"/>
-                <a:satOff val="0"/>
-                <a:lumOff val="0"/>
-                <a:alphaOff val="0"/>
-                <a:satMod val="110000"/>
-                <a:lumMod val="100000"/>
-                <a:shade val="100000"/>
-              </a:schemeClr>
-            </a:gs>
-            <a:gs pos="100000">
-              <a:schemeClr val="accent2">
-                <a:hueOff val="0"/>
-                <a:satOff val="0"/>
-                <a:lumOff val="0"/>
-                <a:alphaOff val="0"/>
-                <a:lumMod val="99000"/>
-                <a:satMod val="120000"/>
-                <a:shade val="78000"/>
-              </a:schemeClr>
-            </a:gs>
-          </a:gsLst>
-          <a:lin ang="5400000" scaled="0"/>
-        </a:gradFill>
-        <a:ln>
-          <a:noFill/>
-        </a:ln>
-        <a:effectLst>
-          <a:outerShdw blurRad="57150" dist="19050" dir="5400000" algn="ctr" rotWithShape="0">
-            <a:srgbClr val="000000">
-              <a:alpha val="63000"/>
-            </a:srgbClr>
-          </a:outerShdw>
-        </a:effectLst>
-      </dsp:spPr>
-      <dsp:style>
-        <a:lnRef idx="0">
-          <a:scrgbClr r="0" g="0" b="0"/>
-        </a:lnRef>
-        <a:fillRef idx="3">
-          <a:scrgbClr r="0" g="0" b="0"/>
-        </a:fillRef>
-        <a:effectRef idx="3">
-          <a:scrgbClr r="0" g="0" b="0"/>
-        </a:effectRef>
-        <a:fontRef idx="minor">
-          <a:schemeClr val="lt1"/>
-        </a:fontRef>
-      </dsp:style>
-      <dsp:txBody>
-        <a:bodyPr spcFirstLastPara="0" vert="horz" wrap="square" lIns="5080" tIns="5080" rIns="5080" bIns="5080" numCol="1" spcCol="1270" anchor="ctr" anchorCtr="0">
-          <a:noAutofit/>
-        </a:bodyPr>
-        <a:lstStyle/>
-        <a:p>
-          <a:pPr marL="0" lvl="0" indent="0" algn="ctr" defTabSz="355600">
-            <a:lnSpc>
-              <a:spcPct val="90000"/>
-            </a:lnSpc>
-            <a:spcBef>
-              <a:spcPct val="0"/>
-            </a:spcBef>
-            <a:spcAft>
-              <a:spcPct val="35000"/>
-            </a:spcAft>
-            <a:buNone/>
-          </a:pPr>
-          <a:r>
-            <a:rPr lang="en-GB" sz="800" kern="1200"/>
+            <a:rPr lang="en-GB" sz="900" kern="1200"/>
             <a:t>Login</a:t>
           </a:r>
         </a:p>
       </dsp:txBody>
       <dsp:txXfrm>
-        <a:off x="5192449" y="927229"/>
+        <a:off x="5192449" y="1117546"/>
         <a:ext cx="536104" cy="268052"/>
       </dsp:txXfrm>
     </dsp:sp>
@@ -25850,7 +27216,7 @@
 </file>
 
 <file path=word/glossary/document.xml><?xml version="1.0" encoding="utf-8"?>
-<w:glossaryDocument xmlns:wpc="http://schemas.microsoft.com/office/word/2010/wordprocessingCanvas" xmlns:cx="http://schemas.microsoft.com/office/drawing/2014/chartex" xmlns:cx1="http://schemas.microsoft.com/office/drawing/2015/9/8/chartex" xmlns:cx2="http://schemas.microsoft.com/office/drawing/2015/10/21/chartex" xmlns:cx3="http://schemas.microsoft.com/office/drawing/2016/5/9/chartex" xmlns:cx4="http://schemas.microsoft.com/office/drawing/2016/5/10/chartex" xmlns:cx5="http://schemas.microsoft.com/office/drawing/2016/5/11/chartex" xmlns:cx6="http://schemas.microsoft.com/office/drawing/2016/5/12/chartex" xmlns:cx7="http://schemas.microsoft.com/office/drawing/2016/5/13/chartex" xmlns:cx8="http://schemas.microsoft.com/office/drawing/2016/5/14/chartex" xmlns:mc="http://schemas.openxmlformats.org/markup-compatibility/2006" xmlns:aink="http://schemas.microsoft.com/office/drawing/2016/ink" xmlns:am3d="http://schemas.microsoft.com/office/drawing/2017/model3d" xmlns:o="urn:schemas-microsoft-com:office:office" xmlns:oel="http://schemas.microsoft.com/office/2019/extlst" xmlns:r="http://schemas.openxmlformats.org/officeDocument/2006/relationships" xmlns:m="http://schemas.openxmlformats.org/officeDocument/2006/math" xmlns:v="urn:schemas-microsoft-com:vml" xmlns:wp14="http://schemas.microsoft.com/office/word/2010/wordprocessingDrawing" xmlns:wp="http://schemas.openxmlformats.org/drawingml/2006/wordprocessingDrawing" xmlns:w10="urn:schemas-microsoft-com:office:word" xmlns:w="http://schemas.openxmlformats.org/wordprocessingml/2006/main" xmlns:w14="http://schemas.microsoft.com/office/word/2010/wordml" xmlns:w15="http://schemas.microsoft.com/office/word/2012/wordml" xmlns:w16cex="http://schemas.microsoft.com/office/word/2018/wordml/cex" xmlns:w16cid="http://schemas.microsoft.com/office/word/2016/wordml/cid" xmlns:w16="http://schemas.microsoft.com/office/word/2018/wordml" xmlns:w16du="http://schemas.microsoft.com/office/word/2023/wordml/word16du" xmlns:w16sdtdh="http://schemas.microsoft.com/office/word/2020/wordml/sdtdatahash" xmlns:w16sdtfl="http://schemas.microsoft.com/office/word/2024/wordml/sdtformatlock" xmlns:w16se="http://schemas.microsoft.com/office/word/2015/wordml/symex" xmlns:wpg="http://schemas.microsoft.com/office/word/2010/wordprocessingGroup" xmlns:wpi="http://schemas.microsoft.com/office/word/2010/wordprocessingInk" xmlns:wne="http://schemas.microsoft.com/office/word/2006/wordml" xmlns:wps="http://schemas.microsoft.com/office/word/2010/wordprocessingShape" mc:Ignorable="w14 w15 w16se w16cid w16 w16cex w16sdtdh w16sdtfl w16du wp14">
+<w:glossaryDocument xmlns:wpc="http://schemas.microsoft.com/office/word/2010/wordprocessingCanvas" xmlns:cx="http://schemas.microsoft.com/office/drawing/2014/chartex" xmlns:cx1="http://schemas.microsoft.com/office/drawing/2015/9/8/chartex" xmlns:cx2="http://schemas.microsoft.com/office/drawing/2015/10/21/chartex" xmlns:cx3="http://schemas.microsoft.com/office/drawing/2016/5/9/chartex" xmlns:cx4="http://schemas.microsoft.com/office/drawing/2016/5/10/chartex" xmlns:cx5="http://schemas.microsoft.com/office/drawing/2016/5/11/chartex" xmlns:cx6="http://schemas.microsoft.com/office/drawing/2016/5/12/chartex" xmlns:cx7="http://schemas.microsoft.com/office/drawing/2016/5/13/chartex" xmlns:cx8="http://schemas.microsoft.com/office/drawing/2016/5/14/chartex" xmlns:mc="http://schemas.openxmlformats.org/markup-compatibility/2006" xmlns:aink="http://schemas.microsoft.com/office/drawing/2016/ink" xmlns:am3d="http://schemas.microsoft.com/office/drawing/2017/model3d" xmlns:o="urn:schemas-microsoft-com:office:office" xmlns:r="http://schemas.openxmlformats.org/officeDocument/2006/relationships" xmlns:m="http://schemas.openxmlformats.org/officeDocument/2006/math" xmlns:v="urn:schemas-microsoft-com:vml" xmlns:wp14="http://schemas.microsoft.com/office/word/2010/wordprocessingDrawing" xmlns:wp="http://schemas.openxmlformats.org/drawingml/2006/wordprocessingDrawing" xmlns:w10="urn:schemas-microsoft-com:office:word" xmlns:w="http://schemas.openxmlformats.org/wordprocessingml/2006/main" xmlns:w14="http://schemas.microsoft.com/office/word/2010/wordml" xmlns:w15="http://schemas.microsoft.com/office/word/2012/wordml" xmlns:w16cex="http://schemas.microsoft.com/office/word/2018/wordml/cex" xmlns:w16cid="http://schemas.microsoft.com/office/word/2016/wordml/cid" xmlns:w16="http://schemas.microsoft.com/office/word/2018/wordml" xmlns:w16sdtdh="http://schemas.microsoft.com/office/word/2020/wordml/sdtdatahash" xmlns:w16se="http://schemas.microsoft.com/office/word/2015/wordml/symex" xmlns:wpg="http://schemas.microsoft.com/office/word/2010/wordprocessingGroup" xmlns:wpi="http://schemas.microsoft.com/office/word/2010/wordprocessingInk" xmlns:wne="http://schemas.microsoft.com/office/word/2006/wordml" xmlns:wps="http://schemas.microsoft.com/office/word/2010/wordprocessingShape" mc:Ignorable="w14 w15 w16se w16cid w16 w16cex w16sdtdh wp14">
   <w:docParts>
     <w:docPart>
       <w:docPartPr>
@@ -25876,7 +27242,7 @@
             <w:rPr>
               <w:rFonts w:asciiTheme="majorHAnsi" w:eastAsiaTheme="majorEastAsia" w:hAnsiTheme="majorHAnsi" w:cstheme="majorBidi"/>
               <w:caps/>
-              <w:color w:val="156082" w:themeColor="accent1"/>
+              <w:color w:val="4472C4" w:themeColor="accent1"/>
               <w:sz w:val="80"/>
               <w:szCs w:val="80"/>
             </w:rPr>
@@ -25907,7 +27273,7 @@
           </w:pPr>
           <w:r>
             <w:rPr>
-              <w:color w:val="156082" w:themeColor="accent1"/>
+              <w:color w:val="4472C4" w:themeColor="accent1"/>
               <w:sz w:val="28"/>
               <w:szCs w:val="28"/>
             </w:rPr>
@@ -25921,7 +27287,7 @@
 </file>
 
 <file path=word/glossary/fontTable.xml><?xml version="1.0" encoding="utf-8"?>
-<w:fonts xmlns:mc="http://schemas.openxmlformats.org/markup-compatibility/2006" xmlns:r="http://schemas.openxmlformats.org/officeDocument/2006/relationships" xmlns:w="http://schemas.openxmlformats.org/wordprocessingml/2006/main" xmlns:w14="http://schemas.microsoft.com/office/word/2010/wordml" xmlns:w15="http://schemas.microsoft.com/office/word/2012/wordml" xmlns:w16cex="http://schemas.microsoft.com/office/word/2018/wordml/cex" xmlns:w16cid="http://schemas.microsoft.com/office/word/2016/wordml/cid" xmlns:w16="http://schemas.microsoft.com/office/word/2018/wordml" xmlns:w16du="http://schemas.microsoft.com/office/word/2023/wordml/word16du" xmlns:w16sdtdh="http://schemas.microsoft.com/office/word/2020/wordml/sdtdatahash" xmlns:w16sdtfl="http://schemas.microsoft.com/office/word/2024/wordml/sdtformatlock" xmlns:w16se="http://schemas.microsoft.com/office/word/2015/wordml/symex" mc:Ignorable="w14 w15 w16se w16cid w16 w16cex w16sdtdh w16sdtfl w16du">
+<w:fonts xmlns:mc="http://schemas.openxmlformats.org/markup-compatibility/2006" xmlns:r="http://schemas.openxmlformats.org/officeDocument/2006/relationships" xmlns:w="http://schemas.openxmlformats.org/wordprocessingml/2006/main" xmlns:w14="http://schemas.microsoft.com/office/word/2010/wordml" xmlns:w15="http://schemas.microsoft.com/office/word/2012/wordml" xmlns:w16cex="http://schemas.microsoft.com/office/word/2018/wordml/cex" xmlns:w16cid="http://schemas.microsoft.com/office/word/2016/wordml/cid" xmlns:w16="http://schemas.microsoft.com/office/word/2018/wordml" xmlns:w16sdtdh="http://schemas.microsoft.com/office/word/2020/wordml/sdtdatahash" xmlns:w16se="http://schemas.microsoft.com/office/word/2015/wordml/symex" mc:Ignorable="w14 w15 w16se w16cid w16 w16cex w16sdtdh">
   <w:font w:name="Symbol">
     <w:panose1 w:val="05050102010706020507"/>
     <w:charset w:val="02"/>
@@ -25951,12 +27317,14 @@
     <w:sig w:usb0="00000000" w:usb1="10000000" w:usb2="00000000" w:usb3="00000000" w:csb0="80000000" w:csb1="00000000"/>
   </w:font>
   <w:font w:name="Aptos">
+    <w:altName w:val="Calibri"/>
     <w:charset w:val="00"/>
     <w:family w:val="swiss"/>
     <w:pitch w:val="variable"/>
     <w:sig w:usb0="20000287" w:usb1="00000003" w:usb2="00000000" w:usb3="00000000" w:csb0="0000019F" w:csb1="00000000"/>
   </w:font>
   <w:font w:name="Aptos Display">
+    <w:altName w:val="Calibri"/>
     <w:charset w:val="00"/>
     <w:family w:val="swiss"/>
     <w:pitch w:val="variable"/>
@@ -25969,11 +27337,18 @@
     <w:pitch w:val="variable"/>
     <w:sig w:usb0="E4002EFF" w:usb1="C200247B" w:usb2="00000009" w:usb3="00000000" w:csb0="000001FF" w:csb1="00000000"/>
   </w:font>
+  <w:font w:name="Calibri Light">
+    <w:panose1 w:val="020F0302020204030204"/>
+    <w:charset w:val="00"/>
+    <w:family w:val="swiss"/>
+    <w:pitch w:val="variable"/>
+    <w:sig w:usb0="E4002EFF" w:usb1="C200247B" w:usb2="00000009" w:usb3="00000000" w:csb0="000001FF" w:csb1="00000000"/>
+  </w:font>
 </w:fonts>
 </file>
 
 <file path=word/glossary/settings.xml><?xml version="1.0" encoding="utf-8"?>
-<w:settings xmlns:mc="http://schemas.openxmlformats.org/markup-compatibility/2006" xmlns:o="urn:schemas-microsoft-com:office:office" xmlns:r="http://schemas.openxmlformats.org/officeDocument/2006/relationships" xmlns:m="http://schemas.openxmlformats.org/officeDocument/2006/math" xmlns:v="urn:schemas-microsoft-com:vml" xmlns:w10="urn:schemas-microsoft-com:office:word" xmlns:w="http://schemas.openxmlformats.org/wordprocessingml/2006/main" xmlns:w14="http://schemas.microsoft.com/office/word/2010/wordml" xmlns:w15="http://schemas.microsoft.com/office/word/2012/wordml" xmlns:w16cex="http://schemas.microsoft.com/office/word/2018/wordml/cex" xmlns:w16cid="http://schemas.microsoft.com/office/word/2016/wordml/cid" xmlns:w16="http://schemas.microsoft.com/office/word/2018/wordml" xmlns:w16du="http://schemas.microsoft.com/office/word/2023/wordml/word16du" xmlns:w16sdtdh="http://schemas.microsoft.com/office/word/2020/wordml/sdtdatahash" xmlns:w16sdtfl="http://schemas.microsoft.com/office/word/2024/wordml/sdtformatlock" xmlns:w16se="http://schemas.microsoft.com/office/word/2015/wordml/symex" xmlns:sl="http://schemas.openxmlformats.org/schemaLibrary/2006/main" mc:Ignorable="w14 w15 w16se w16cid w16 w16cex w16sdtdh w16sdtfl w16du">
+<w:settings xmlns:mc="http://schemas.openxmlformats.org/markup-compatibility/2006" xmlns:o="urn:schemas-microsoft-com:office:office" xmlns:r="http://schemas.openxmlformats.org/officeDocument/2006/relationships" xmlns:m="http://schemas.openxmlformats.org/officeDocument/2006/math" xmlns:v="urn:schemas-microsoft-com:vml" xmlns:w10="urn:schemas-microsoft-com:office:word" xmlns:w="http://schemas.openxmlformats.org/wordprocessingml/2006/main" xmlns:w14="http://schemas.microsoft.com/office/word/2010/wordml" xmlns:w15="http://schemas.microsoft.com/office/word/2012/wordml" xmlns:w16cex="http://schemas.microsoft.com/office/word/2018/wordml/cex" xmlns:w16cid="http://schemas.microsoft.com/office/word/2016/wordml/cid" xmlns:w16="http://schemas.microsoft.com/office/word/2018/wordml" xmlns:w16sdtdh="http://schemas.microsoft.com/office/word/2020/wordml/sdtdatahash" xmlns:w16se="http://schemas.microsoft.com/office/word/2015/wordml/symex" xmlns:sl="http://schemas.openxmlformats.org/schemaLibrary/2006/main" mc:Ignorable="w14 w15 w16se w16cid w16 w16cex w16sdtdh">
   <w:view w:val="normal"/>
   <w:defaultTabStop w:val="720"/>
   <w:characterSpacingControl w:val="doNotCompress"/>
@@ -26021,6 +27396,7 @@
     <w:rsid w:val="00863085"/>
     <w:rsid w:val="008D10C5"/>
     <w:rsid w:val="008E45FB"/>
+    <w:rsid w:val="00933641"/>
     <w:rsid w:val="00972B3E"/>
     <w:rsid w:val="00B12AB4"/>
     <w:rsid w:val="00B15E40"/>
@@ -26066,7 +27442,7 @@
 </file>
 
 <file path=word/glossary/styles.xml><?xml version="1.0" encoding="utf-8"?>
-<w:styles xmlns:mc="http://schemas.openxmlformats.org/markup-compatibility/2006" xmlns:r="http://schemas.openxmlformats.org/officeDocument/2006/relationships" xmlns:w="http://schemas.openxmlformats.org/wordprocessingml/2006/main" xmlns:w14="http://schemas.microsoft.com/office/word/2010/wordml" xmlns:w15="http://schemas.microsoft.com/office/word/2012/wordml" xmlns:w16cex="http://schemas.microsoft.com/office/word/2018/wordml/cex" xmlns:w16cid="http://schemas.microsoft.com/office/word/2016/wordml/cid" xmlns:w16="http://schemas.microsoft.com/office/word/2018/wordml" xmlns:w16du="http://schemas.microsoft.com/office/word/2023/wordml/word16du" xmlns:w16sdtdh="http://schemas.microsoft.com/office/word/2020/wordml/sdtdatahash" xmlns:w16sdtfl="http://schemas.microsoft.com/office/word/2024/wordml/sdtformatlock" xmlns:w16se="http://schemas.microsoft.com/office/word/2015/wordml/symex" mc:Ignorable="w14 w15 w16se w16cid w16 w16cex w16sdtdh w16sdtfl w16du">
+<w:styles xmlns:mc="http://schemas.openxmlformats.org/markup-compatibility/2006" xmlns:r="http://schemas.openxmlformats.org/officeDocument/2006/relationships" xmlns:w="http://schemas.openxmlformats.org/wordprocessingml/2006/main" xmlns:w14="http://schemas.microsoft.com/office/word/2010/wordml" xmlns:w15="http://schemas.microsoft.com/office/word/2012/wordml" xmlns:w16cex="http://schemas.microsoft.com/office/word/2018/wordml/cex" xmlns:w16cid="http://schemas.microsoft.com/office/word/2016/wordml/cid" xmlns:w16="http://schemas.microsoft.com/office/word/2018/wordml" xmlns:w16sdtdh="http://schemas.microsoft.com/office/word/2020/wordml/sdtdatahash" xmlns:w16se="http://schemas.microsoft.com/office/word/2015/wordml/symex" mc:Ignorable="w14 w15 w16se w16cid w16 w16cex w16sdtdh">
   <w:docDefaults>
     <w:rPrDefault>
       <w:rPr>
@@ -26505,7 +27881,7 @@
 </file>
 
 <file path=word/glossary/webSettings.xml><?xml version="1.0" encoding="utf-8"?>
-<w:webSettings xmlns:mc="http://schemas.openxmlformats.org/markup-compatibility/2006" xmlns:r="http://schemas.openxmlformats.org/officeDocument/2006/relationships" xmlns:w="http://schemas.openxmlformats.org/wordprocessingml/2006/main" xmlns:w14="http://schemas.microsoft.com/office/word/2010/wordml" xmlns:w15="http://schemas.microsoft.com/office/word/2012/wordml" xmlns:w16cex="http://schemas.microsoft.com/office/word/2018/wordml/cex" xmlns:w16cid="http://schemas.microsoft.com/office/word/2016/wordml/cid" xmlns:w16="http://schemas.microsoft.com/office/word/2018/wordml" xmlns:w16du="http://schemas.microsoft.com/office/word/2023/wordml/word16du" xmlns:w16sdtdh="http://schemas.microsoft.com/office/word/2020/wordml/sdtdatahash" xmlns:w16sdtfl="http://schemas.microsoft.com/office/word/2024/wordml/sdtformatlock" xmlns:w16se="http://schemas.microsoft.com/office/word/2015/wordml/symex" mc:Ignorable="w14 w15 w16se w16cid w16 w16cex w16sdtdh w16sdtfl w16du">
+<w:webSettings xmlns:mc="http://schemas.openxmlformats.org/markup-compatibility/2006" xmlns:r="http://schemas.openxmlformats.org/officeDocument/2006/relationships" xmlns:w="http://schemas.openxmlformats.org/wordprocessingml/2006/main" xmlns:w14="http://schemas.microsoft.com/office/word/2010/wordml" xmlns:w15="http://schemas.microsoft.com/office/word/2012/wordml" xmlns:w16cex="http://schemas.microsoft.com/office/word/2018/wordml/cex" xmlns:w16cid="http://schemas.microsoft.com/office/word/2016/wordml/cid" xmlns:w16="http://schemas.microsoft.com/office/word/2018/wordml" xmlns:w16sdtdh="http://schemas.microsoft.com/office/word/2020/wordml/sdtdatahash" xmlns:w16se="http://schemas.microsoft.com/office/word/2015/wordml/symex" mc:Ignorable="w14 w15 w16se w16cid w16 w16cex w16sdtdh">
   <w:optimizeForBrowser/>
   <w:allowPNG/>
 </w:webSettings>
@@ -27013,11 +28389,12 @@
 </file>
 
 <file path=customXml/item2.xml><?xml version="1.0" encoding="utf-8"?>
-<p:properties xmlns:p="http://schemas.microsoft.com/office/2006/metadata/properties" xmlns:xsi="http://www.w3.org/2001/XMLSchema-instance" xmlns:pc="http://schemas.microsoft.com/office/infopath/2007/PartnerControls">
-  <documentManagement>
-    <_activity xmlns="0858e797-1849-4dd5-9d5a-25e6beea22bc" xsi:nil="true"/>
-  </documentManagement>
-</p:properties>
+<?mso-contentType ?>
+<FormTemplates xmlns="http://schemas.microsoft.com/sharepoint/v3/contenttype/forms">
+  <Display>DocumentLibraryForm</Display>
+  <Edit>DocumentLibraryForm</Edit>
+  <New>DocumentLibraryForm</New>
+</FormTemplates>
 </file>
 
 <file path=customXml/item3.xml><?xml version="1.0" encoding="utf-8"?>
@@ -27025,12 +28402,11 @@
 </file>
 
 <file path=customXml/item4.xml><?xml version="1.0" encoding="utf-8"?>
-<?mso-contentType ?>
-<FormTemplates xmlns="http://schemas.microsoft.com/sharepoint/v3/contenttype/forms">
-  <Display>DocumentLibraryForm</Display>
-  <Edit>DocumentLibraryForm</Edit>
-  <New>DocumentLibraryForm</New>
-</FormTemplates>
+<p:properties xmlns:p="http://schemas.microsoft.com/office/2006/metadata/properties" xmlns:xsi="http://www.w3.org/2001/XMLSchema-instance" xmlns:pc="http://schemas.microsoft.com/office/infopath/2007/PartnerControls">
+  <documentManagement>
+    <_activity xmlns="0858e797-1849-4dd5-9d5a-25e6beea22bc" xsi:nil="true"/>
+  </documentManagement>
+</p:properties>
 </file>
 
 <file path=customXml/itemProps1.xml><?xml version="1.0" encoding="utf-8"?>
@@ -27052,11 +28428,9 @@
 </file>
 
 <file path=customXml/itemProps2.xml><?xml version="1.0" encoding="utf-8"?>
-<ds:datastoreItem xmlns:ds="http://schemas.openxmlformats.org/officeDocument/2006/customXml" ds:itemID="{DD3E77BA-0A5F-412F-AD0C-65D1A89B375C}">
+<ds:datastoreItem xmlns:ds="http://schemas.openxmlformats.org/officeDocument/2006/customXml" ds:itemID="{A9623E5C-50AC-4F4B-AA64-E3F8AA2679C6}">
   <ds:schemaRefs>
-    <ds:schemaRef ds:uri="http://schemas.microsoft.com/office/2006/metadata/properties"/>
-    <ds:schemaRef ds:uri="http://schemas.microsoft.com/office/infopath/2007/PartnerControls"/>
-    <ds:schemaRef ds:uri="0858e797-1849-4dd5-9d5a-25e6beea22bc"/>
+    <ds:schemaRef ds:uri="http://schemas.microsoft.com/sharepoint/v3/contenttype/forms"/>
   </ds:schemaRefs>
 </ds:datastoreItem>
 </file>
@@ -27070,9 +28444,11 @@
 </file>
 
 <file path=customXml/itemProps4.xml><?xml version="1.0" encoding="utf-8"?>
-<ds:datastoreItem xmlns:ds="http://schemas.openxmlformats.org/officeDocument/2006/customXml" ds:itemID="{A9623E5C-50AC-4F4B-AA64-E3F8AA2679C6}">
+<ds:datastoreItem xmlns:ds="http://schemas.openxmlformats.org/officeDocument/2006/customXml" ds:itemID="{DD3E77BA-0A5F-412F-AD0C-65D1A89B375C}">
   <ds:schemaRefs>
-    <ds:schemaRef ds:uri="http://schemas.microsoft.com/sharepoint/v3/contenttype/forms"/>
+    <ds:schemaRef ds:uri="http://schemas.microsoft.com/office/2006/metadata/properties"/>
+    <ds:schemaRef ds:uri="http://schemas.microsoft.com/office/infopath/2007/PartnerControls"/>
+    <ds:schemaRef ds:uri="0858e797-1849-4dd5-9d5a-25e6beea22bc"/>
   </ds:schemaRefs>
 </ds:datastoreItem>
 </file>
</xml_diff>